<commit_message>
Updated CapitalOne codesignal questions doc
</commit_message>
<xml_diff>
--- a/src/main/resources/capitalone/codesignal/swe/CodeSignal_Questions_SWE.docx
+++ b/src/main/resources/capitalone/codesignal/swe/CodeSignal_Questions_SWE.docx
@@ -323,11 +323,11 @@
         <w:t>Specially</w:t>
       </w:r>
       <w:r>
-        <w:t xml:space="preserve">, the scooters are represented by an array </w:t>
+        <w:t xml:space="preserve">, the scooters are represented by an </w:t>
       </w:r>
       <w:proofErr w:type="gramStart"/>
       <w:r>
-        <w:t>scooters</w:t>
+        <w:t>array scooters</w:t>
       </w:r>
       <w:proofErr w:type="gramEnd"/>
       <w:r>
@@ -9796,6 +9796,63 @@
     </w:p>
     <w:p>
       <w:pPr>
+        <w:ind w:left="720"/>
+        <w:rPr>
+          <w:rFonts w:eastAsiaTheme="minorEastAsia"/>
+        </w:rPr>
+      </w:pPr>
+    </w:p>
+    <w:p>
+      <w:pPr>
+        <w:ind w:left="720"/>
+        <w:rPr>
+          <w:rFonts w:eastAsiaTheme="minorEastAsia"/>
+        </w:rPr>
+      </w:pPr>
+      <w:r>
+        <w:rPr>
+          <w:rFonts w:eastAsiaTheme="minorEastAsia"/>
+          <w:highlight w:val="yellow"/>
+        </w:rPr>
+        <w:t>Note</w:t>
+      </w:r>
+      <w:r>
+        <w:rPr>
+          <w:rFonts w:eastAsiaTheme="minorEastAsia"/>
+        </w:rPr>
+        <w:t xml:space="preserve"> – Same solution for Question 20 can be used, except for “</w:t>
+      </w:r>
+      <w:proofErr w:type="spellStart"/>
+      <w:r>
+        <w:rPr>
+          <w:rFonts w:eastAsiaTheme="minorEastAsia"/>
+        </w:rPr>
+        <w:t>goTo</w:t>
+      </w:r>
+      <w:proofErr w:type="spellEnd"/>
+      <w:r>
+        <w:rPr>
+          <w:rFonts w:eastAsiaTheme="minorEastAsia"/>
+        </w:rPr>
+        <w:t xml:space="preserve">” use “switch” and instead of “create” use “push”. In question 20 you are given commands </w:t>
+      </w:r>
+      <w:proofErr w:type="gramStart"/>
+      <w:r>
+        <w:rPr>
+          <w:rFonts w:eastAsiaTheme="minorEastAsia"/>
+        </w:rPr>
+        <w:t>array,</w:t>
+      </w:r>
+      <w:proofErr w:type="gramEnd"/>
+      <w:r>
+        <w:rPr>
+          <w:rFonts w:eastAsiaTheme="minorEastAsia"/>
+        </w:rPr>
+        <w:t xml:space="preserve"> in this problem it is logs array.</w:t>
+      </w:r>
+    </w:p>
+    <w:p>
+      <w:pPr>
         <w:rPr>
           <w:rFonts w:eastAsiaTheme="minorEastAsia"/>
         </w:rPr>
@@ -9883,14 +9940,8 @@
         <w:rPr>
           <w:rFonts w:eastAsiaTheme="minorEastAsia"/>
         </w:rPr>
-        <w:t xml:space="preserve">Note: A prefix of number is a number formed by one or more of its digits, starting from its highest-order digit. For example, 123 is a prefix of the number 12345 and 2 is a prefix of the number 234. A common prefix of two numbers if a number, which is a prefix of </w:t>
-      </w:r>
-      <w:r>
-        <w:rPr>
-          <w:rFonts w:eastAsiaTheme="minorEastAsia"/>
-        </w:rPr>
         <w:lastRenderedPageBreak/>
-        <w:t xml:space="preserve">both. For instance, the longest common prefix (LCP) of 5655359 and 56554 is 5655 </w:t>
+        <w:t xml:space="preserve">Note: A prefix of number is a number formed by one or more of its digits, starting from its highest-order digit. For example, 123 is a prefix of the number 12345 and 2 is a prefix of the number 234. A common prefix of two numbers if a number, which is a prefix of both. For instance, the longest common prefix (LCP) of 5655359 and 56554 is 5655 </w:t>
       </w:r>
       <w:proofErr w:type="gramStart"/>
       <w:r>
@@ -10848,6 +10899,7 @@
         <w:rPr>
           <w:rFonts w:eastAsiaTheme="minorEastAsia"/>
         </w:rPr>
+        <w:lastRenderedPageBreak/>
         <w:t>Answer: Question 29</w:t>
       </w:r>
     </w:p>
@@ -10873,7 +10925,6 @@
         <w:rPr>
           <w:rFonts w:eastAsiaTheme="minorEastAsia"/>
         </w:rPr>
-        <w:lastRenderedPageBreak/>
         <w:t xml:space="preserve">Image that there are several lamps placed on a number line, each of which illuminates some segment of the line. Specifically, the lamps are represented in a </w:t>
       </w:r>
       <w:proofErr w:type="gramStart"/>
@@ -11615,7 +11666,6 @@
         <w:rPr>
           <w:rFonts w:eastAsiaTheme="minorEastAsia"/>
         </w:rPr>
-        <w:lastRenderedPageBreak/>
         <w:t xml:space="preserve">Please assume that the bus leaves </w:t>
       </w:r>
       <w:proofErr w:type="gramStart"/>
@@ -12253,7 +12303,6 @@
         <w:rPr>
           <w:rFonts w:eastAsiaTheme="minorEastAsia"/>
         </w:rPr>
-        <w:lastRenderedPageBreak/>
         <w:t>Answer: 35</w:t>
       </w:r>
     </w:p>
@@ -14239,21 +14288,7 @@
         <w:rPr>
           <w:rFonts w:eastAsiaTheme="minorEastAsia"/>
         </w:rPr>
-        <w:t xml:space="preserve"> </w:t>
-      </w:r>
-      <w:proofErr w:type="gramStart"/>
-      <w:r>
-        <w:rPr>
-          <w:rFonts w:eastAsiaTheme="minorEastAsia"/>
-        </w:rPr>
-        <w:t>goes</w:t>
-      </w:r>
-      <w:proofErr w:type="gramEnd"/>
-      <w:r>
-        <w:rPr>
-          <w:rFonts w:eastAsiaTheme="minorEastAsia"/>
-        </w:rPr>
-        <w:t xml:space="preserve"> to the array with a lower length. If it is STILL a tie, </w:t>
+        <w:t xml:space="preserve"> goes to the array with a lower length. If it is STILL a tie, </w:t>
       </w:r>
       <w:r>
         <w:rPr>
@@ -14285,21 +14320,7 @@
         <w:rPr>
           <w:rFonts w:eastAsiaTheme="minorEastAsia"/>
         </w:rPr>
-        <w:t xml:space="preserve"> </w:t>
-      </w:r>
-      <w:proofErr w:type="gramStart"/>
-      <w:r>
-        <w:rPr>
-          <w:rFonts w:eastAsiaTheme="minorEastAsia"/>
-        </w:rPr>
-        <w:t>goes</w:t>
-      </w:r>
-      <w:proofErr w:type="gramEnd"/>
-      <w:r>
-        <w:rPr>
-          <w:rFonts w:eastAsiaTheme="minorEastAsia"/>
-        </w:rPr>
-        <w:t xml:space="preserve"> to the first array.</w:t>
+        <w:t xml:space="preserve"> goes to the first array.</w:t>
       </w:r>
     </w:p>
     <w:p>
@@ -16688,6 +16709,14 @@
           <w:rFonts w:eastAsiaTheme="minorEastAsia"/>
         </w:rPr>
       </w:pPr>
+    </w:p>
+    <w:p>
+      <w:pPr>
+        <w:pStyle w:val="ListParagraph"/>
+        <w:rPr>
+          <w:rFonts w:eastAsiaTheme="minorEastAsia"/>
+        </w:rPr>
+      </w:pPr>
       <w:r>
         <w:rPr>
           <w:rFonts w:eastAsiaTheme="minorEastAsia"/>
@@ -17050,13 +17079,7 @@
         <w:rPr>
           <w:rFonts w:eastAsiaTheme="minorEastAsia"/>
         </w:rPr>
-        <w:t xml:space="preserve"> </w:t>
-      </w:r>
-      <w:r>
-        <w:rPr>
-          <w:rFonts w:eastAsiaTheme="minorEastAsia"/>
-        </w:rPr>
-        <w:t xml:space="preserve">You are given an array of integers </w:t>
+        <w:t xml:space="preserve"> You are given an array of integers </w:t>
       </w:r>
       <w:proofErr w:type="spellStart"/>
       <w:r>
@@ -17176,19 +17199,7 @@
         <w:rPr>
           <w:rFonts w:eastAsiaTheme="minorEastAsia"/>
         </w:rPr>
-        <w:t xml:space="preserve"> – the maximum number of user requests that the server can handle during each cycle.</w:t>
-      </w:r>
-      <w:r>
-        <w:rPr>
-          <w:rFonts w:eastAsiaTheme="minorEastAsia"/>
-        </w:rPr>
-        <w:t xml:space="preserve"> </w:t>
-      </w:r>
-      <w:r>
-        <w:rPr>
-          <w:rFonts w:eastAsiaTheme="minorEastAsia"/>
-        </w:rPr>
-        <w:t>You are also given an array of strings events, where events[</w:t>
+        <w:t xml:space="preserve"> – the maximum number of user requests that the server can handle during each cycle. You are also given an array of strings events, where events[</w:t>
       </w:r>
       <w:proofErr w:type="spellStart"/>
       <w:r>
@@ -17364,13 +17375,7 @@
         <w:rPr>
           <w:rFonts w:eastAsiaTheme="minorEastAsia"/>
         </w:rPr>
-        <w:t xml:space="preserve"> </w:t>
-      </w:r>
-      <w:r>
-        <w:rPr>
-          <w:rFonts w:eastAsiaTheme="minorEastAsia"/>
-        </w:rPr>
-        <w:t xml:space="preserve">After </w:t>
+        <w:t xml:space="preserve"> After </w:t>
       </w:r>
       <w:r>
         <w:rPr>
@@ -17468,13 +17473,7 @@
         <w:rPr>
           <w:rFonts w:eastAsiaTheme="minorEastAsia"/>
         </w:rPr>
-        <w:t xml:space="preserve"> = [1,2,1,2,1] and events = [</w:t>
-      </w:r>
-      <w:r>
-        <w:rPr>
-          <w:rFonts w:eastAsiaTheme="minorEastAsia"/>
-        </w:rPr>
-        <w:t>"REQUEST</w:t>
+        <w:t xml:space="preserve"> = [1,2,1,2,1] and events = ["REQUEST</w:t>
       </w:r>
       <w:proofErr w:type="gramStart"/>
       <w:r>
@@ -17552,8 +17551,17 @@
         <w:rPr>
           <w:rFonts w:eastAsiaTheme="minorEastAsia"/>
         </w:rPr>
+        <w:lastRenderedPageBreak/>
         <w:t>Answer: Question55</w:t>
       </w:r>
+    </w:p>
+    <w:p>
+      <w:pPr>
+        <w:pStyle w:val="ListParagraph"/>
+        <w:rPr>
+          <w:rFonts w:eastAsiaTheme="minorEastAsia"/>
+        </w:rPr>
+      </w:pPr>
     </w:p>
     <w:p>
       <w:pPr>
@@ -17572,7 +17580,6 @@
           <w:b/>
           <w:bCs/>
         </w:rPr>
-        <w:lastRenderedPageBreak/>
         <w:t>Note</w:t>
       </w:r>
       <w:r>
@@ -17698,19 +17705,7 @@
         <w:rPr>
           <w:rFonts w:eastAsiaTheme="minorEastAsia"/>
         </w:rPr>
-        <w:t xml:space="preserve"> of size a × b</w:t>
-      </w:r>
-      <w:r>
-        <w:rPr>
-          <w:rFonts w:eastAsiaTheme="minorEastAsia"/>
-        </w:rPr>
-        <w:t xml:space="preserve">. </w:t>
-      </w:r>
-      <w:r>
-        <w:rPr>
-          <w:rFonts w:eastAsiaTheme="minorEastAsia"/>
-        </w:rPr>
-        <w:t xml:space="preserve">Rectangles can be rotated by </w:t>
+        <w:t xml:space="preserve"> of size a × b. Rectangles can be rotated by </w:t>
       </w:r>
       <w:r>
         <w:rPr>
@@ -17724,19 +17719,7 @@
         <w:rPr>
           <w:rFonts w:eastAsiaTheme="minorEastAsia"/>
         </w:rPr>
-        <w:t>, meaning a rectangle of size a × b can be rotated to become b × a.</w:t>
-      </w:r>
-      <w:r>
-        <w:rPr>
-          <w:rFonts w:eastAsiaTheme="minorEastAsia"/>
-        </w:rPr>
-        <w:t xml:space="preserve"> </w:t>
-      </w:r>
-      <w:r>
-        <w:rPr>
-          <w:rFonts w:eastAsiaTheme="minorEastAsia"/>
-        </w:rPr>
-        <w:t xml:space="preserve">Each rectangle must fit </w:t>
+        <w:t xml:space="preserve">, meaning a rectangle of size a × b can be rotated to become b × a. Each rectangle must fit </w:t>
       </w:r>
       <w:r>
         <w:rPr>
@@ -19996,6 +19979,7 @@
   <w:style w:type="character" w:default="1" w:styleId="DefaultParagraphFont">
     <w:name w:val="Default Paragraph Font"/>
     <w:uiPriority w:val="1"/>
+    <w:semiHidden/>
     <w:unhideWhenUsed/>
   </w:style>
   <w:style w:type="table" w:default="1" w:styleId="TableNormal">

</xml_diff>

<commit_message>
Added two new codesignal problems
</commit_message>
<xml_diff>
--- a/src/main/resources/capitalone/codesignal/swe/CodeSignal_Questions_SWE.docx
+++ b/src/main/resources/capitalone/codesignal/swe/CodeSignal_Questions_SWE.docx
@@ -17834,11 +17834,355 @@
     </w:p>
     <w:p>
       <w:pPr>
-        <w:pStyle w:val="ListParagraph"/>
-        <w:rPr>
-          <w:rFonts w:eastAsiaTheme="minorEastAsia"/>
-        </w:rPr>
-      </w:pPr>
+        <w:rPr>
+          <w:rFonts w:eastAsiaTheme="minorEastAsia"/>
+        </w:rPr>
+      </w:pPr>
+    </w:p>
+    <w:p>
+      <w:pPr>
+        <w:pStyle w:val="ListParagraph"/>
+        <w:numPr>
+          <w:ilvl w:val="0"/>
+          <w:numId w:val="1"/>
+        </w:numPr>
+        <w:rPr>
+          <w:rFonts w:eastAsiaTheme="minorEastAsia"/>
+        </w:rPr>
+      </w:pPr>
+      <w:r>
+        <w:rPr>
+          <w:rFonts w:eastAsiaTheme="minorEastAsia"/>
+        </w:rPr>
+        <w:t>You are monitoring the performance of devices in a network. Each device periodically reports its status by sending a numerical value. These values are collected in sequence in an array.</w:t>
+      </w:r>
+    </w:p>
+    <w:p>
+      <w:pPr>
+        <w:rPr>
+          <w:rFonts w:eastAsiaTheme="minorEastAsia"/>
+        </w:rPr>
+      </w:pPr>
+    </w:p>
+    <w:p>
+      <w:pPr>
+        <w:ind w:left="720"/>
+        <w:rPr>
+          <w:rFonts w:eastAsiaTheme="minorEastAsia"/>
+        </w:rPr>
+      </w:pPr>
+      <w:r>
+        <w:rPr>
+          <w:rFonts w:eastAsiaTheme="minorEastAsia"/>
+        </w:rPr>
+        <w:t xml:space="preserve">Given an array of integers </w:t>
+      </w:r>
+      <w:proofErr w:type="spellStart"/>
+      <w:r>
+        <w:rPr>
+          <w:rFonts w:eastAsiaTheme="minorEastAsia"/>
+          <w:i/>
+          <w:iCs/>
+        </w:rPr>
+        <w:t>statusReports</w:t>
+      </w:r>
+      <w:proofErr w:type="spellEnd"/>
+      <w:r>
+        <w:rPr>
+          <w:rFonts w:eastAsiaTheme="minorEastAsia"/>
+        </w:rPr>
+        <w:t xml:space="preserve">, your task is to find the sum of all elements in the array </w:t>
+      </w:r>
+      <w:proofErr w:type="spellStart"/>
+      <w:r>
+        <w:rPr>
+          <w:rFonts w:eastAsiaTheme="minorEastAsia"/>
+          <w:i/>
+          <w:iCs/>
+        </w:rPr>
+        <w:t>statusReports</w:t>
+      </w:r>
+      <w:proofErr w:type="spellEnd"/>
+      <w:r>
+        <w:rPr>
+          <w:rFonts w:eastAsiaTheme="minorEastAsia"/>
+        </w:rPr>
+        <w:t xml:space="preserve"> that are greater than their immediate neighbors. If an element is the first or last in the array, it should be compared only to its single neighbor.</w:t>
+      </w:r>
+    </w:p>
+    <w:p>
+      <w:pPr>
+        <w:ind w:left="720"/>
+        <w:rPr>
+          <w:rFonts w:eastAsiaTheme="minorEastAsia"/>
+        </w:rPr>
+      </w:pPr>
+    </w:p>
+    <w:p>
+      <w:pPr>
+        <w:ind w:left="720"/>
+        <w:rPr>
+          <w:rFonts w:eastAsiaTheme="minorEastAsia"/>
+        </w:rPr>
+      </w:pPr>
+      <w:r>
+        <w:rPr>
+          <w:rFonts w:eastAsiaTheme="minorEastAsia"/>
+        </w:rPr>
+        <w:t>Return the resulting sum as an integer.</w:t>
+      </w:r>
+    </w:p>
+    <w:p>
+      <w:pPr>
+        <w:ind w:left="720"/>
+        <w:rPr>
+          <w:rFonts w:eastAsiaTheme="minorEastAsia"/>
+        </w:rPr>
+      </w:pPr>
+    </w:p>
+    <w:p>
+      <w:pPr>
+        <w:ind w:left="720"/>
+        <w:rPr>
+          <w:rFonts w:eastAsiaTheme="minorEastAsia"/>
+        </w:rPr>
+      </w:pPr>
+      <w:r>
+        <w:rPr>
+          <w:rFonts w:eastAsiaTheme="minorEastAsia"/>
+        </w:rPr>
+        <w:t xml:space="preserve">Ex. For </w:t>
+      </w:r>
+      <w:proofErr w:type="spellStart"/>
+      <w:r>
+        <w:rPr>
+          <w:rFonts w:eastAsiaTheme="minorEastAsia"/>
+          <w:i/>
+          <w:iCs/>
+        </w:rPr>
+        <w:t>statusReports</w:t>
+      </w:r>
+      <w:proofErr w:type="spellEnd"/>
+      <w:r>
+        <w:rPr>
+          <w:rFonts w:eastAsiaTheme="minorEastAsia"/>
+          <w:i/>
+          <w:iCs/>
+        </w:rPr>
+        <w:t xml:space="preserve"> = [1,3,2,5,1]</w:t>
+      </w:r>
+      <w:r>
+        <w:rPr>
+          <w:rFonts w:eastAsiaTheme="minorEastAsia"/>
+        </w:rPr>
+        <w:t xml:space="preserve"> the output should be </w:t>
+      </w:r>
+      <w:r>
+        <w:rPr>
+          <w:rFonts w:eastAsiaTheme="minorEastAsia"/>
+          <w:i/>
+          <w:iCs/>
+        </w:rPr>
+        <w:t>solution(</w:t>
+      </w:r>
+      <w:proofErr w:type="spellStart"/>
+      <w:r>
+        <w:rPr>
+          <w:rFonts w:eastAsiaTheme="minorEastAsia"/>
+          <w:i/>
+          <w:iCs/>
+        </w:rPr>
+        <w:t>statusReports</w:t>
+      </w:r>
+      <w:proofErr w:type="spellEnd"/>
+      <w:r>
+        <w:rPr>
+          <w:rFonts w:eastAsiaTheme="minorEastAsia"/>
+          <w:i/>
+          <w:iCs/>
+        </w:rPr>
+        <w:t>) = 8</w:t>
+      </w:r>
+      <w:r>
+        <w:rPr>
+          <w:rFonts w:eastAsiaTheme="minorEastAsia"/>
+        </w:rPr>
+        <w:t>.</w:t>
+      </w:r>
+    </w:p>
+    <w:p>
+      <w:pPr>
+        <w:ind w:left="720"/>
+        <w:rPr>
+          <w:rFonts w:eastAsiaTheme="minorEastAsia"/>
+        </w:rPr>
+      </w:pPr>
+    </w:p>
+    <w:p>
+      <w:pPr>
+        <w:ind w:left="720"/>
+        <w:rPr>
+          <w:rFonts w:eastAsiaTheme="minorEastAsia"/>
+        </w:rPr>
+      </w:pPr>
+      <w:r>
+        <w:rPr>
+          <w:rFonts w:eastAsiaTheme="minorEastAsia"/>
+        </w:rPr>
+        <w:t>Answer: Question57</w:t>
+      </w:r>
+    </w:p>
+    <w:p>
+      <w:pPr>
+        <w:rPr>
+          <w:rFonts w:eastAsiaTheme="minorEastAsia"/>
+        </w:rPr>
+      </w:pPr>
+    </w:p>
+    <w:p>
+      <w:pPr>
+        <w:pStyle w:val="ListParagraph"/>
+        <w:numPr>
+          <w:ilvl w:val="0"/>
+          <w:numId w:val="1"/>
+        </w:numPr>
+        <w:rPr>
+          <w:rFonts w:eastAsiaTheme="minorEastAsia"/>
+        </w:rPr>
+      </w:pPr>
+      <w:r>
+        <w:rPr>
+          <w:rFonts w:eastAsiaTheme="minorEastAsia"/>
+        </w:rPr>
+        <w:t xml:space="preserve">You are given an array of non-negative integers </w:t>
+      </w:r>
+      <w:r>
+        <w:rPr>
+          <w:rFonts w:eastAsiaTheme="minorEastAsia"/>
+          <w:i/>
+          <w:iCs/>
+        </w:rPr>
+        <w:t>a</w:t>
+      </w:r>
+      <w:r>
+        <w:rPr>
+          <w:rFonts w:eastAsiaTheme="minorEastAsia"/>
+        </w:rPr>
+        <w:t xml:space="preserve">. Your task is to calculate how many elements of </w:t>
+      </w:r>
+      <w:r>
+        <w:rPr>
+          <w:rFonts w:eastAsiaTheme="minorEastAsia"/>
+          <w:i/>
+          <w:iCs/>
+        </w:rPr>
+        <w:t>a</w:t>
+      </w:r>
+      <w:r>
+        <w:rPr>
+          <w:rFonts w:eastAsiaTheme="minorEastAsia"/>
+        </w:rPr>
+        <w:t xml:space="preserve"> have an odd number of occurrences of the digit </w:t>
+      </w:r>
+      <w:r>
+        <w:rPr>
+          <w:rFonts w:eastAsiaTheme="minorEastAsia"/>
+          <w:i/>
+          <w:iCs/>
+        </w:rPr>
+        <w:t>0</w:t>
+      </w:r>
+      <w:r>
+        <w:rPr>
+          <w:rFonts w:eastAsiaTheme="minorEastAsia"/>
+        </w:rPr>
+        <w:t>.</w:t>
+      </w:r>
+    </w:p>
+    <w:p>
+      <w:pPr>
+        <w:rPr>
+          <w:rFonts w:eastAsiaTheme="minorEastAsia"/>
+        </w:rPr>
+      </w:pPr>
+    </w:p>
+    <w:p>
+      <w:pPr>
+        <w:ind w:left="720"/>
+        <w:rPr>
+          <w:rFonts w:eastAsiaTheme="minorEastAsia"/>
+        </w:rPr>
+      </w:pPr>
+      <w:r>
+        <w:rPr>
+          <w:rFonts w:eastAsiaTheme="minorEastAsia"/>
+        </w:rPr>
+        <w:t xml:space="preserve">For example, for </w:t>
+      </w:r>
+      <w:r>
+        <w:rPr>
+          <w:rFonts w:eastAsiaTheme="minorEastAsia"/>
+          <w:i/>
+          <w:iCs/>
+        </w:rPr>
+        <w:t>[4, 50, 100, 65, 2000, 700, 1, 10]</w:t>
+      </w:r>
+      <w:r>
+        <w:rPr>
+          <w:rFonts w:eastAsiaTheme="minorEastAsia"/>
+        </w:rPr>
+        <w:t xml:space="preserve">, the answer should be </w:t>
+      </w:r>
+      <w:r>
+        <w:rPr>
+          <w:rFonts w:eastAsiaTheme="minorEastAsia"/>
+          <w:i/>
+          <w:iCs/>
+        </w:rPr>
+        <w:t>3</w:t>
+      </w:r>
+      <w:r>
+        <w:rPr>
+          <w:rFonts w:eastAsiaTheme="minorEastAsia"/>
+        </w:rPr>
+        <w:t xml:space="preserve">. These number are </w:t>
+      </w:r>
+      <w:r>
+        <w:rPr>
+          <w:rFonts w:eastAsiaTheme="minorEastAsia"/>
+          <w:i/>
+          <w:iCs/>
+        </w:rPr>
+        <w:t>50, 2000, and 10</w:t>
+      </w:r>
+      <w:r>
+        <w:rPr>
+          <w:rFonts w:eastAsiaTheme="minorEastAsia"/>
+        </w:rPr>
+        <w:t>.</w:t>
+      </w:r>
+    </w:p>
+    <w:p>
+      <w:pPr>
+        <w:ind w:left="720"/>
+        <w:rPr>
+          <w:rFonts w:eastAsiaTheme="minorEastAsia"/>
+        </w:rPr>
+      </w:pPr>
+    </w:p>
+    <w:p>
+      <w:pPr>
+        <w:ind w:left="720"/>
+        <w:rPr>
+          <w:rFonts w:eastAsiaTheme="minorEastAsia"/>
+        </w:rPr>
+      </w:pPr>
+      <w:r>
+        <w:rPr>
+          <w:rFonts w:eastAsiaTheme="minorEastAsia"/>
+        </w:rPr>
+        <w:t>Answer: Question58</w:t>
+      </w:r>
     </w:p>
     <w:p>
       <w:pPr>

</xml_diff>

<commit_message>
Added new codesignal questions
</commit_message>
<xml_diff>
--- a/src/main/resources/capitalone/codesignal/swe/CodeSignal_Questions_SWE.docx
+++ b/src/main/resources/capitalone/codesignal/swe/CodeSignal_Questions_SWE.docx
@@ -18195,18 +18195,617 @@
     <w:p>
       <w:pPr>
         <w:pStyle w:val="ListParagraph"/>
-        <w:rPr>
-          <w:rFonts w:eastAsiaTheme="minorEastAsia"/>
-        </w:rPr>
-      </w:pPr>
-    </w:p>
-    <w:p>
-      <w:pPr>
-        <w:pStyle w:val="ListParagraph"/>
-        <w:rPr>
-          <w:rFonts w:eastAsiaTheme="minorEastAsia"/>
-        </w:rPr>
-      </w:pPr>
+        <w:numPr>
+          <w:ilvl w:val="0"/>
+          <w:numId w:val="1"/>
+        </w:numPr>
+        <w:rPr>
+          <w:rFonts w:eastAsiaTheme="minorEastAsia"/>
+        </w:rPr>
+      </w:pPr>
+      <w:r>
+        <w:rPr>
+          <w:rFonts w:eastAsiaTheme="minorEastAsia"/>
+        </w:rPr>
+        <w:t xml:space="preserve">In the mystical realm of </w:t>
+      </w:r>
+      <w:proofErr w:type="spellStart"/>
+      <w:r>
+        <w:rPr>
+          <w:rFonts w:eastAsiaTheme="minorEastAsia"/>
+        </w:rPr>
+        <w:t>Numeria</w:t>
+      </w:r>
+      <w:proofErr w:type="spellEnd"/>
+      <w:r>
+        <w:rPr>
+          <w:rFonts w:eastAsiaTheme="minorEastAsia"/>
+        </w:rPr>
+        <w:t xml:space="preserve">, numbers hold secrets waiting to be uncovered. Among the enchanted </w:t>
+      </w:r>
+      <w:proofErr w:type="spellStart"/>
+      <w:r>
+        <w:rPr>
+          <w:rFonts w:eastAsiaTheme="minorEastAsia"/>
+        </w:rPr>
+        <w:t>intergers</w:t>
+      </w:r>
+      <w:proofErr w:type="spellEnd"/>
+      <w:r>
+        <w:rPr>
+          <w:rFonts w:eastAsiaTheme="minorEastAsia"/>
+        </w:rPr>
+        <w:t xml:space="preserve">, there are special pairs that nearly mirror each other except for a single trait. You have been provided with an array of these magical numbers, </w:t>
+      </w:r>
+      <w:r>
+        <w:rPr>
+          <w:rFonts w:eastAsiaTheme="minorEastAsia"/>
+          <w:i/>
+          <w:iCs/>
+        </w:rPr>
+        <w:t>numbers</w:t>
+      </w:r>
+      <w:r>
+        <w:rPr>
+          <w:rFonts w:eastAsiaTheme="minorEastAsia"/>
+        </w:rPr>
+        <w:t xml:space="preserve">. Your task is to discover how many unique pairs </w:t>
+      </w:r>
+      <w:r>
+        <w:rPr>
+          <w:rFonts w:eastAsiaTheme="minorEastAsia"/>
+          <w:i/>
+          <w:iCs/>
+        </w:rPr>
+        <w:t>(I, j)</w:t>
+      </w:r>
+      <w:r>
+        <w:rPr>
+          <w:rFonts w:eastAsiaTheme="minorEastAsia"/>
+        </w:rPr>
+        <w:t xml:space="preserve"> exist such that </w:t>
+      </w:r>
+      <w:r>
+        <w:rPr>
+          <w:rFonts w:eastAsiaTheme="minorEastAsia"/>
+          <w:i/>
+          <w:iCs/>
+        </w:rPr>
+        <w:t xml:space="preserve">0 &lt;= I &lt; j &lt; </w:t>
+      </w:r>
+      <w:proofErr w:type="spellStart"/>
+      <w:proofErr w:type="gramStart"/>
+      <w:r>
+        <w:rPr>
+          <w:rFonts w:eastAsiaTheme="minorEastAsia"/>
+          <w:i/>
+          <w:iCs/>
+        </w:rPr>
+        <w:t>numbers.length</w:t>
+      </w:r>
+      <w:proofErr w:type="spellEnd"/>
+      <w:proofErr w:type="gramEnd"/>
+      <w:r>
+        <w:rPr>
+          <w:rFonts w:eastAsiaTheme="minorEastAsia"/>
+        </w:rPr>
+        <w:t>, where the numbers are identical in length, but differ by exactly one digit.</w:t>
+      </w:r>
+    </w:p>
+    <w:p>
+      <w:pPr>
+        <w:rPr>
+          <w:rFonts w:eastAsiaTheme="minorEastAsia"/>
+        </w:rPr>
+      </w:pPr>
+    </w:p>
+    <w:p>
+      <w:pPr>
+        <w:ind w:left="720"/>
+        <w:rPr>
+          <w:rFonts w:eastAsiaTheme="minorEastAsia"/>
+        </w:rPr>
+      </w:pPr>
+      <w:r>
+        <w:rPr>
+          <w:rFonts w:eastAsiaTheme="minorEastAsia"/>
+        </w:rPr>
+        <w:lastRenderedPageBreak/>
+        <w:t xml:space="preserve">For example: numbers = [1, 151, 241, 1, 9, 22, 351], the output should be </w:t>
+      </w:r>
+      <w:r>
+        <w:rPr>
+          <w:rFonts w:eastAsiaTheme="minorEastAsia"/>
+          <w:i/>
+          <w:iCs/>
+        </w:rPr>
+        <w:t>solution(numbers) = 3</w:t>
+      </w:r>
+      <w:r>
+        <w:rPr>
+          <w:rFonts w:eastAsiaTheme="minorEastAsia"/>
+        </w:rPr>
+        <w:t>.</w:t>
+      </w:r>
+    </w:p>
+    <w:p>
+      <w:pPr>
+        <w:pStyle w:val="ListParagraph"/>
+        <w:numPr>
+          <w:ilvl w:val="0"/>
+          <w:numId w:val="15"/>
+        </w:numPr>
+        <w:rPr>
+          <w:rFonts w:eastAsiaTheme="minorEastAsia"/>
+        </w:rPr>
+      </w:pPr>
+      <w:proofErr w:type="gramStart"/>
+      <w:r>
+        <w:rPr>
+          <w:rFonts w:eastAsiaTheme="minorEastAsia"/>
+        </w:rPr>
+        <w:t>Numbers[</w:t>
+      </w:r>
+      <w:proofErr w:type="gramEnd"/>
+      <w:r>
+        <w:rPr>
+          <w:rFonts w:eastAsiaTheme="minorEastAsia"/>
+        </w:rPr>
+        <w:t>0] = 1 has a single digit different with numbers[4] = 9</w:t>
+      </w:r>
+    </w:p>
+    <w:p>
+      <w:pPr>
+        <w:pStyle w:val="ListParagraph"/>
+        <w:numPr>
+          <w:ilvl w:val="0"/>
+          <w:numId w:val="15"/>
+        </w:numPr>
+        <w:rPr>
+          <w:rFonts w:eastAsiaTheme="minorEastAsia"/>
+        </w:rPr>
+      </w:pPr>
+      <w:proofErr w:type="gramStart"/>
+      <w:r>
+        <w:rPr>
+          <w:rFonts w:eastAsiaTheme="minorEastAsia"/>
+        </w:rPr>
+        <w:t>Numbers[</w:t>
+      </w:r>
+      <w:proofErr w:type="gramEnd"/>
+      <w:r>
+        <w:rPr>
+          <w:rFonts w:eastAsiaTheme="minorEastAsia"/>
+        </w:rPr>
+        <w:t>1] = 151 differs from numbers[6] = 351 solely in the first digit.</w:t>
+      </w:r>
+    </w:p>
+    <w:p>
+      <w:pPr>
+        <w:pStyle w:val="ListParagraph"/>
+        <w:numPr>
+          <w:ilvl w:val="0"/>
+          <w:numId w:val="15"/>
+        </w:numPr>
+        <w:rPr>
+          <w:rFonts w:eastAsiaTheme="minorEastAsia"/>
+        </w:rPr>
+      </w:pPr>
+      <w:proofErr w:type="gramStart"/>
+      <w:r>
+        <w:rPr>
+          <w:rFonts w:eastAsiaTheme="minorEastAsia"/>
+        </w:rPr>
+        <w:t>Numbers[</w:t>
+      </w:r>
+      <w:proofErr w:type="gramEnd"/>
+      <w:r>
+        <w:rPr>
+          <w:rFonts w:eastAsiaTheme="minorEastAsia"/>
+        </w:rPr>
+        <w:t>3] = 1 also differs from numbers[4] = 9 in their single shared digit.</w:t>
+      </w:r>
+    </w:p>
+    <w:p>
+      <w:pPr>
+        <w:rPr>
+          <w:rFonts w:eastAsiaTheme="minorEastAsia"/>
+        </w:rPr>
+      </w:pPr>
+    </w:p>
+    <w:p>
+      <w:pPr>
+        <w:ind w:left="720"/>
+        <w:rPr>
+          <w:rFonts w:eastAsiaTheme="minorEastAsia"/>
+        </w:rPr>
+      </w:pPr>
+      <w:r>
+        <w:rPr>
+          <w:rFonts w:eastAsiaTheme="minorEastAsia"/>
+        </w:rPr>
+        <w:t xml:space="preserve">Observe that the identical </w:t>
+      </w:r>
+      <w:proofErr w:type="gramStart"/>
+      <w:r>
+        <w:rPr>
+          <w:rFonts w:eastAsiaTheme="minorEastAsia"/>
+        </w:rPr>
+        <w:t>numbers[</w:t>
+      </w:r>
+      <w:proofErr w:type="gramEnd"/>
+      <w:r>
+        <w:rPr>
+          <w:rFonts w:eastAsiaTheme="minorEastAsia"/>
+        </w:rPr>
+        <w:t>0] = 1 and numbers[3] = 1 do not count as a pair since they are exactly the same.</w:t>
+      </w:r>
+    </w:p>
+    <w:p>
+      <w:pPr>
+        <w:ind w:left="720"/>
+        <w:rPr>
+          <w:rFonts w:eastAsiaTheme="minorEastAsia"/>
+        </w:rPr>
+      </w:pPr>
+    </w:p>
+    <w:p>
+      <w:pPr>
+        <w:ind w:left="720"/>
+        <w:rPr>
+          <w:rFonts w:eastAsiaTheme="minorEastAsia"/>
+        </w:rPr>
+      </w:pPr>
+      <w:r>
+        <w:rPr>
+          <w:rFonts w:eastAsiaTheme="minorEastAsia"/>
+        </w:rPr>
+        <w:t>Answer: Question59</w:t>
+      </w:r>
+    </w:p>
+    <w:p>
+      <w:pPr>
+        <w:rPr>
+          <w:rFonts w:eastAsiaTheme="minorEastAsia"/>
+        </w:rPr>
+      </w:pPr>
+    </w:p>
+    <w:p>
+      <w:pPr>
+        <w:pStyle w:val="ListParagraph"/>
+        <w:numPr>
+          <w:ilvl w:val="0"/>
+          <w:numId w:val="1"/>
+        </w:numPr>
+        <w:rPr>
+          <w:rFonts w:eastAsiaTheme="minorEastAsia"/>
+        </w:rPr>
+      </w:pPr>
+      <w:r>
+        <w:rPr>
+          <w:rFonts w:eastAsiaTheme="minorEastAsia"/>
+        </w:rPr>
+        <w:t xml:space="preserve">Imagine you are developing a sophisticated text processing tool editors use to format lists of words for publication quickly. You are given an array of strings </w:t>
+      </w:r>
+      <w:proofErr w:type="spellStart"/>
+      <w:r>
+        <w:rPr>
+          <w:rFonts w:eastAsiaTheme="minorEastAsia"/>
+          <w:i/>
+          <w:iCs/>
+        </w:rPr>
+        <w:t>wordsList</w:t>
+      </w:r>
+      <w:proofErr w:type="spellEnd"/>
+      <w:r>
+        <w:rPr>
+          <w:rFonts w:eastAsiaTheme="minorEastAsia"/>
+        </w:rPr>
+        <w:t>. Your tool needs to automatically adjust the format of each word based on its length: If the length of a string is even, the word should be reversed; if the length of a string is odd, the word should be converted to uppercase.</w:t>
+      </w:r>
+    </w:p>
+    <w:p>
+      <w:pPr>
+        <w:rPr>
+          <w:rFonts w:eastAsiaTheme="minorEastAsia"/>
+        </w:rPr>
+      </w:pPr>
+    </w:p>
+    <w:p>
+      <w:pPr>
+        <w:ind w:left="720"/>
+        <w:rPr>
+          <w:rFonts w:eastAsiaTheme="minorEastAsia"/>
+        </w:rPr>
+      </w:pPr>
+      <w:r>
+        <w:rPr>
+          <w:rFonts w:eastAsiaTheme="minorEastAsia"/>
+        </w:rPr>
+        <w:t xml:space="preserve">Your task is to write a function that processes the input array </w:t>
+      </w:r>
+      <w:proofErr w:type="spellStart"/>
+      <w:r>
+        <w:rPr>
+          <w:rFonts w:eastAsiaTheme="minorEastAsia"/>
+          <w:i/>
+          <w:iCs/>
+        </w:rPr>
+        <w:t>wordsList</w:t>
+      </w:r>
+      <w:proofErr w:type="spellEnd"/>
+      <w:r>
+        <w:rPr>
+          <w:rFonts w:eastAsiaTheme="minorEastAsia"/>
+        </w:rPr>
+        <w:t xml:space="preserve"> according to these rules and returns a new array where each string has been formatted correctly.</w:t>
+      </w:r>
+    </w:p>
+    <w:p>
+      <w:pPr>
+        <w:ind w:left="720"/>
+        <w:rPr>
+          <w:rFonts w:eastAsiaTheme="minorEastAsia"/>
+        </w:rPr>
+      </w:pPr>
+    </w:p>
+    <w:p>
+      <w:pPr>
+        <w:ind w:left="720"/>
+        <w:rPr>
+          <w:rFonts w:eastAsiaTheme="minorEastAsia"/>
+        </w:rPr>
+      </w:pPr>
+      <w:r>
+        <w:rPr>
+          <w:rFonts w:eastAsiaTheme="minorEastAsia"/>
+          <w:b/>
+          <w:bCs/>
+        </w:rPr>
+        <w:t>Example</w:t>
+      </w:r>
+      <w:r>
+        <w:rPr>
+          <w:rFonts w:eastAsiaTheme="minorEastAsia"/>
+        </w:rPr>
+        <w:t xml:space="preserve">: </w:t>
+      </w:r>
+      <w:proofErr w:type="spellStart"/>
+      <w:r>
+        <w:rPr>
+          <w:rFonts w:eastAsiaTheme="minorEastAsia"/>
+          <w:i/>
+          <w:iCs/>
+        </w:rPr>
+        <w:t>wordsList</w:t>
+      </w:r>
+      <w:proofErr w:type="spellEnd"/>
+      <w:r>
+        <w:rPr>
+          <w:rFonts w:eastAsiaTheme="minorEastAsia"/>
+        </w:rPr>
+        <w:t xml:space="preserve"> = [“</w:t>
+      </w:r>
+      <w:proofErr w:type="spellStart"/>
+      <w:r>
+        <w:rPr>
+          <w:rFonts w:eastAsiaTheme="minorEastAsia"/>
+        </w:rPr>
+        <w:t>HeLLo</w:t>
+      </w:r>
+      <w:proofErr w:type="spellEnd"/>
+      <w:r>
+        <w:rPr>
+          <w:rFonts w:eastAsiaTheme="minorEastAsia"/>
+        </w:rPr>
+        <w:t xml:space="preserve">”, “Data”, “science”] the output should be </w:t>
+      </w:r>
+      <w:r>
+        <w:rPr>
+          <w:rFonts w:eastAsiaTheme="minorEastAsia"/>
+          <w:i/>
+          <w:iCs/>
+        </w:rPr>
+        <w:t>solution(</w:t>
+      </w:r>
+      <w:proofErr w:type="spellStart"/>
+      <w:r>
+        <w:rPr>
+          <w:rFonts w:eastAsiaTheme="minorEastAsia"/>
+          <w:i/>
+          <w:iCs/>
+        </w:rPr>
+        <w:t>wordsList</w:t>
+      </w:r>
+      <w:proofErr w:type="spellEnd"/>
+      <w:r>
+        <w:rPr>
+          <w:rFonts w:eastAsiaTheme="minorEastAsia"/>
+          <w:i/>
+          <w:iCs/>
+        </w:rPr>
+        <w:t xml:space="preserve">) = </w:t>
+      </w:r>
+      <w:r>
+        <w:rPr>
+          <w:rFonts w:eastAsiaTheme="minorEastAsia"/>
+        </w:rPr>
+        <w:t>[“HELLO”, “</w:t>
+      </w:r>
+      <w:proofErr w:type="spellStart"/>
+      <w:r>
+        <w:rPr>
+          <w:rFonts w:eastAsiaTheme="minorEastAsia"/>
+        </w:rPr>
+        <w:t>ataD</w:t>
+      </w:r>
+      <w:proofErr w:type="spellEnd"/>
+      <w:r>
+        <w:rPr>
+          <w:rFonts w:eastAsiaTheme="minorEastAsia"/>
+        </w:rPr>
+        <w:t>”, “SCIENCE”]</w:t>
+      </w:r>
+    </w:p>
+    <w:p>
+      <w:pPr>
+        <w:ind w:left="720"/>
+        <w:rPr>
+          <w:rFonts w:eastAsiaTheme="minorEastAsia"/>
+        </w:rPr>
+      </w:pPr>
+    </w:p>
+    <w:p>
+      <w:pPr>
+        <w:ind w:left="720"/>
+        <w:rPr>
+          <w:rFonts w:eastAsiaTheme="minorEastAsia"/>
+        </w:rPr>
+      </w:pPr>
+      <w:r>
+        <w:rPr>
+          <w:rFonts w:eastAsiaTheme="minorEastAsia"/>
+        </w:rPr>
+        <w:t>Answer: Question60</w:t>
+      </w:r>
+      <w:r>
+        <w:rPr>
+          <w:rFonts w:eastAsiaTheme="minorEastAsia"/>
+        </w:rPr>
+        <w:br/>
+      </w:r>
+    </w:p>
+    <w:p>
+      <w:pPr>
+        <w:pStyle w:val="ListParagraph"/>
+        <w:numPr>
+          <w:ilvl w:val="0"/>
+          <w:numId w:val="1"/>
+        </w:numPr>
+        <w:rPr>
+          <w:rFonts w:eastAsiaTheme="minorEastAsia"/>
+        </w:rPr>
+      </w:pPr>
+      <w:r>
+        <w:rPr>
+          <w:rFonts w:eastAsiaTheme="minorEastAsia"/>
+        </w:rPr>
+        <w:t>Imagine you are developing a financial reporting system that highlights notable transaction IDs for special analysis. Specifically, you need to identify palindromic transaction IDs, i.e., those that read the same forward and backward.</w:t>
+      </w:r>
+    </w:p>
+    <w:p>
+      <w:pPr>
+        <w:rPr>
+          <w:rFonts w:eastAsiaTheme="minorEastAsia"/>
+        </w:rPr>
+      </w:pPr>
+    </w:p>
+    <w:p>
+      <w:pPr>
+        <w:ind w:left="720"/>
+        <w:rPr>
+          <w:rFonts w:eastAsiaTheme="minorEastAsia"/>
+        </w:rPr>
+      </w:pPr>
+      <w:r>
+        <w:rPr>
+          <w:rFonts w:eastAsiaTheme="minorEastAsia"/>
+        </w:rPr>
+        <w:t xml:space="preserve">Given an array of integers </w:t>
+      </w:r>
+      <w:r>
+        <w:rPr>
+          <w:rFonts w:eastAsiaTheme="minorEastAsia"/>
+          <w:i/>
+          <w:iCs/>
+        </w:rPr>
+        <w:t>transactions</w:t>
+      </w:r>
+      <w:r>
+        <w:rPr>
+          <w:rFonts w:eastAsiaTheme="minorEastAsia"/>
+        </w:rPr>
+        <w:t>, your task is to find all palindromic integers, sort them in descending order, and return the sorted array.</w:t>
+      </w:r>
+    </w:p>
+    <w:p>
+      <w:pPr>
+        <w:ind w:left="720"/>
+        <w:rPr>
+          <w:rFonts w:eastAsiaTheme="minorEastAsia"/>
+        </w:rPr>
+      </w:pPr>
+    </w:p>
+    <w:p>
+      <w:pPr>
+        <w:ind w:left="720"/>
+        <w:rPr>
+          <w:rFonts w:eastAsiaTheme="minorEastAsia"/>
+        </w:rPr>
+      </w:pPr>
+      <w:r>
+        <w:rPr>
+          <w:rFonts w:eastAsiaTheme="minorEastAsia"/>
+          <w:b/>
+          <w:bCs/>
+        </w:rPr>
+        <w:t>Example</w:t>
+      </w:r>
+      <w:r>
+        <w:rPr>
+          <w:rFonts w:eastAsiaTheme="minorEastAsia"/>
+        </w:rPr>
+        <w:t xml:space="preserve">: For </w:t>
+      </w:r>
+      <w:r>
+        <w:rPr>
+          <w:rFonts w:eastAsiaTheme="minorEastAsia"/>
+          <w:i/>
+          <w:iCs/>
+        </w:rPr>
+        <w:t>transactions</w:t>
+      </w:r>
+      <w:r>
+        <w:rPr>
+          <w:rFonts w:eastAsiaTheme="minorEastAsia"/>
+        </w:rPr>
+        <w:t xml:space="preserve"> = [33, 123, 121, 44, 78, 98], the output should be </w:t>
+      </w:r>
+      <w:r>
+        <w:rPr>
+          <w:rFonts w:eastAsiaTheme="minorEastAsia"/>
+          <w:i/>
+          <w:iCs/>
+        </w:rPr>
+        <w:t>solution(transactions)</w:t>
+      </w:r>
+      <w:r>
+        <w:rPr>
+          <w:rFonts w:eastAsiaTheme="minorEastAsia"/>
+        </w:rPr>
+        <w:t xml:space="preserve"> = [121, 44, 33]</w:t>
+      </w:r>
+    </w:p>
+    <w:p>
+      <w:pPr>
+        <w:rPr>
+          <w:rFonts w:eastAsiaTheme="minorEastAsia"/>
+        </w:rPr>
+      </w:pPr>
+    </w:p>
+    <w:p>
+      <w:pPr>
+        <w:ind w:left="720"/>
+        <w:rPr>
+          <w:rFonts w:eastAsiaTheme="minorEastAsia"/>
+        </w:rPr>
+      </w:pPr>
+      <w:r>
+        <w:rPr>
+          <w:rFonts w:eastAsiaTheme="minorEastAsia"/>
+        </w:rPr>
+        <w:t>Answer: Question61</w:t>
+      </w:r>
     </w:p>
     <w:sectPr>
       <w:pgSz w:w="12240" w:h="15840"/>

</xml_diff>

<commit_message>
Corrected Question31 and added 62 - 64 in the word doc
</commit_message>
<xml_diff>
--- a/src/main/resources/capitalone/codesignal/swe/CodeSignal_Questions_SWE.docx
+++ b/src/main/resources/capitalone/codesignal/swe/CodeSignal_Questions_SWE.docx
@@ -1,6 +1,6 @@
 
 <file path=word/document.xml><?xml version="1.0" encoding="utf-8"?>
-<w:document xmlns:wpc="http://schemas.microsoft.com/office/word/2010/wordprocessingCanvas" xmlns:cx="http://schemas.microsoft.com/office/drawing/2014/chartex" xmlns:cx1="http://schemas.microsoft.com/office/drawing/2015/9/8/chartex" xmlns:cx2="http://schemas.microsoft.com/office/drawing/2015/10/21/chartex" xmlns:cx3="http://schemas.microsoft.com/office/drawing/2016/5/9/chartex" xmlns:cx4="http://schemas.microsoft.com/office/drawing/2016/5/10/chartex" xmlns:cx5="http://schemas.microsoft.com/office/drawing/2016/5/11/chartex" xmlns:cx6="http://schemas.microsoft.com/office/drawing/2016/5/12/chartex" xmlns:cx7="http://schemas.microsoft.com/office/drawing/2016/5/13/chartex" xmlns:cx8="http://schemas.microsoft.com/office/drawing/2016/5/14/chartex" xmlns:mc="http://schemas.openxmlformats.org/markup-compatibility/2006" xmlns:aink="http://schemas.microsoft.com/office/drawing/2016/ink" xmlns:am3d="http://schemas.microsoft.com/office/drawing/2017/model3d" xmlns:o="urn:schemas-microsoft-com:office:office" xmlns:oel="http://schemas.microsoft.com/office/2019/extlst" xmlns:r="http://schemas.openxmlformats.org/officeDocument/2006/relationships" xmlns:m="http://schemas.openxmlformats.org/officeDocument/2006/math" xmlns:v="urn:schemas-microsoft-com:vml" xmlns:wp14="http://schemas.microsoft.com/office/word/2010/wordprocessingDrawing" xmlns:wp="http://schemas.openxmlformats.org/drawingml/2006/wordprocessingDrawing" xmlns:w10="urn:schemas-microsoft-com:office:word" xmlns:w="http://schemas.openxmlformats.org/wordprocessingml/2006/main" xmlns:w14="http://schemas.microsoft.com/office/word/2010/wordml" xmlns:w15="http://schemas.microsoft.com/office/word/2012/wordml" xmlns:w16cex="http://schemas.microsoft.com/office/word/2018/wordml/cex" xmlns:w16cid="http://schemas.microsoft.com/office/word/2016/wordml/cid" xmlns:w16="http://schemas.microsoft.com/office/word/2018/wordml" xmlns:w16du="http://schemas.microsoft.com/office/word/2023/wordml/word16du" xmlns:w16sdtdh="http://schemas.microsoft.com/office/word/2020/wordml/sdtdatahash" xmlns:w16se="http://schemas.microsoft.com/office/word/2015/wordml/symex" xmlns:wpg="http://schemas.microsoft.com/office/word/2010/wordprocessingGroup" xmlns:wpi="http://schemas.microsoft.com/office/word/2010/wordprocessingInk" xmlns:wne="http://schemas.microsoft.com/office/word/2006/wordml" xmlns:wps="http://schemas.microsoft.com/office/word/2010/wordprocessingShape" mc:Ignorable="w14 w15 w16se w16cid w16 w16cex w16sdtdh w16du wp14">
+<w:document xmlns:wpc="http://schemas.microsoft.com/office/word/2010/wordprocessingCanvas" xmlns:cx="http://schemas.microsoft.com/office/drawing/2014/chartex" xmlns:cx1="http://schemas.microsoft.com/office/drawing/2015/9/8/chartex" xmlns:cx2="http://schemas.microsoft.com/office/drawing/2015/10/21/chartex" xmlns:cx3="http://schemas.microsoft.com/office/drawing/2016/5/9/chartex" xmlns:cx4="http://schemas.microsoft.com/office/drawing/2016/5/10/chartex" xmlns:cx5="http://schemas.microsoft.com/office/drawing/2016/5/11/chartex" xmlns:cx6="http://schemas.microsoft.com/office/drawing/2016/5/12/chartex" xmlns:cx7="http://schemas.microsoft.com/office/drawing/2016/5/13/chartex" xmlns:cx8="http://schemas.microsoft.com/office/drawing/2016/5/14/chartex" xmlns:mc="http://schemas.openxmlformats.org/markup-compatibility/2006" xmlns:aink="http://schemas.microsoft.com/office/drawing/2016/ink" xmlns:am3d="http://schemas.microsoft.com/office/drawing/2017/model3d" xmlns:o="urn:schemas-microsoft-com:office:office" xmlns:oel="http://schemas.microsoft.com/office/2019/extlst" xmlns:r="http://schemas.openxmlformats.org/officeDocument/2006/relationships" xmlns:m="http://schemas.openxmlformats.org/officeDocument/2006/math" xmlns:v="urn:schemas-microsoft-com:vml" xmlns:wp14="http://schemas.microsoft.com/office/word/2010/wordprocessingDrawing" xmlns:wp="http://schemas.openxmlformats.org/drawingml/2006/wordprocessingDrawing" xmlns:w10="urn:schemas-microsoft-com:office:word" xmlns:w="http://schemas.openxmlformats.org/wordprocessingml/2006/main" xmlns:w14="http://schemas.microsoft.com/office/word/2010/wordml" xmlns:w15="http://schemas.microsoft.com/office/word/2012/wordml" xmlns:w16cex="http://schemas.microsoft.com/office/word/2018/wordml/cex" xmlns:w16cid="http://schemas.microsoft.com/office/word/2016/wordml/cid" xmlns:w16="http://schemas.microsoft.com/office/word/2018/wordml" xmlns:w16du="http://schemas.microsoft.com/office/word/2023/wordml/word16du" xmlns:w16sdtdh="http://schemas.microsoft.com/office/word/2020/wordml/sdtdatahash" xmlns:w16sdtfl="http://schemas.microsoft.com/office/word/2024/wordml/sdtformatlock" xmlns:w16se="http://schemas.microsoft.com/office/word/2015/wordml/symex" xmlns:wpg="http://schemas.microsoft.com/office/word/2010/wordprocessingGroup" xmlns:wpi="http://schemas.microsoft.com/office/word/2010/wordprocessingInk" xmlns:wne="http://schemas.microsoft.com/office/word/2006/wordml" xmlns:wps="http://schemas.microsoft.com/office/word/2010/wordprocessingShape" mc:Ignorable="w14 w15 w16se w16cid w16 w16cex w16sdtdh w16sdtfl w16du wp14">
   <w:body>
     <w:p>
       <w:pPr>
@@ -18807,6 +18807,490 @@
         <w:t>Answer: Question61</w:t>
       </w:r>
     </w:p>
+    <w:p>
+      <w:pPr>
+        <w:rPr>
+          <w:rFonts w:eastAsiaTheme="minorEastAsia"/>
+        </w:rPr>
+      </w:pPr>
+    </w:p>
+    <w:p>
+      <w:pPr>
+        <w:pStyle w:val="ListParagraph"/>
+        <w:numPr>
+          <w:ilvl w:val="0"/>
+          <w:numId w:val="1"/>
+        </w:numPr>
+        <w:rPr>
+          <w:rFonts w:eastAsiaTheme="minorEastAsia"/>
+        </w:rPr>
+      </w:pPr>
+      <w:r>
+        <w:rPr>
+          <w:rFonts w:eastAsiaTheme="minorEastAsia"/>
+        </w:rPr>
+        <w:t>You are part of a software development team working on a text analysis tool that examines strings for specific patterns. One of the features requested by your client is to identify and count all triplets of consecutive characters within strings where the first and last characters of each triplet are the same. Detecting such triplets can help in recognizing repetitive structures and potential anomalies in the text, which is valuable for many natural language processing tasks.</w:t>
+      </w:r>
+    </w:p>
+    <w:p>
+      <w:pPr>
+        <w:rPr>
+          <w:rFonts w:eastAsiaTheme="minorEastAsia"/>
+        </w:rPr>
+      </w:pPr>
+    </w:p>
+    <w:p>
+      <w:pPr>
+        <w:ind w:left="720"/>
+        <w:rPr>
+          <w:rFonts w:eastAsiaTheme="minorEastAsia"/>
+        </w:rPr>
+      </w:pPr>
+      <w:r>
+        <w:rPr>
+          <w:rFonts w:eastAsiaTheme="minorEastAsia"/>
+        </w:rPr>
+        <w:lastRenderedPageBreak/>
+        <w:t xml:space="preserve">Given a string </w:t>
+      </w:r>
+      <w:r>
+        <w:rPr>
+          <w:rFonts w:eastAsiaTheme="minorEastAsia"/>
+          <w:i/>
+          <w:iCs/>
+        </w:rPr>
+        <w:t>text</w:t>
+      </w:r>
+      <w:r>
+        <w:rPr>
+          <w:rFonts w:eastAsiaTheme="minorEastAsia"/>
+        </w:rPr>
+        <w:t xml:space="preserve"> consisting of English letters (both uppercase and lowercase), your task is to count all triplets of consecutive characters where the first and last characters are the same (case insensitive).</w:t>
+      </w:r>
+    </w:p>
+    <w:p>
+      <w:pPr>
+        <w:ind w:left="720"/>
+        <w:rPr>
+          <w:rFonts w:eastAsiaTheme="minorEastAsia"/>
+        </w:rPr>
+      </w:pPr>
+    </w:p>
+    <w:p>
+      <w:pPr>
+        <w:ind w:left="720"/>
+        <w:rPr>
+          <w:rFonts w:eastAsiaTheme="minorEastAsia"/>
+        </w:rPr>
+      </w:pPr>
+      <w:r>
+        <w:rPr>
+          <w:rFonts w:eastAsiaTheme="minorEastAsia"/>
+          <w:b/>
+          <w:bCs/>
+        </w:rPr>
+        <w:t>Example:</w:t>
+      </w:r>
+      <w:r>
+        <w:rPr>
+          <w:rFonts w:eastAsiaTheme="minorEastAsia"/>
+        </w:rPr>
+        <w:t xml:space="preserve"> For </w:t>
+      </w:r>
+      <w:r>
+        <w:rPr>
+          <w:rFonts w:eastAsiaTheme="minorEastAsia"/>
+          <w:i/>
+          <w:iCs/>
+        </w:rPr>
+        <w:t>text = “</w:t>
+      </w:r>
+      <w:proofErr w:type="spellStart"/>
+      <w:r>
+        <w:rPr>
+          <w:rFonts w:eastAsiaTheme="minorEastAsia"/>
+          <w:i/>
+          <w:iCs/>
+        </w:rPr>
+        <w:t>aXA</w:t>
+      </w:r>
+      <w:proofErr w:type="spellEnd"/>
+      <w:r>
+        <w:rPr>
+          <w:rFonts w:eastAsiaTheme="minorEastAsia"/>
+          <w:i/>
+          <w:iCs/>
+        </w:rPr>
+        <w:t>”</w:t>
+      </w:r>
+      <w:r>
+        <w:rPr>
+          <w:rFonts w:eastAsiaTheme="minorEastAsia"/>
+        </w:rPr>
+        <w:t xml:space="preserve">, the output should be </w:t>
+      </w:r>
+      <w:r>
+        <w:rPr>
+          <w:rFonts w:eastAsiaTheme="minorEastAsia"/>
+          <w:i/>
+          <w:iCs/>
+        </w:rPr>
+        <w:t>solution(text) = 1</w:t>
+      </w:r>
+      <w:r>
+        <w:rPr>
+          <w:rFonts w:eastAsiaTheme="minorEastAsia"/>
+        </w:rPr>
+        <w:t xml:space="preserve">. </w:t>
+      </w:r>
+    </w:p>
+    <w:p>
+      <w:pPr>
+        <w:ind w:left="720"/>
+        <w:rPr>
+          <w:rFonts w:eastAsiaTheme="minorEastAsia"/>
+        </w:rPr>
+      </w:pPr>
+    </w:p>
+    <w:p>
+      <w:pPr>
+        <w:ind w:left="720"/>
+        <w:rPr>
+          <w:rFonts w:eastAsiaTheme="minorEastAsia"/>
+        </w:rPr>
+      </w:pPr>
+      <w:r>
+        <w:rPr>
+          <w:rFonts w:eastAsiaTheme="minorEastAsia"/>
+        </w:rPr>
+        <w:t>The only triplet in the string is “</w:t>
+      </w:r>
+      <w:proofErr w:type="spellStart"/>
+      <w:r>
+        <w:rPr>
+          <w:rFonts w:eastAsiaTheme="minorEastAsia"/>
+        </w:rPr>
+        <w:t>aXA</w:t>
+      </w:r>
+      <w:proofErr w:type="spellEnd"/>
+      <w:r>
+        <w:rPr>
+          <w:rFonts w:eastAsiaTheme="minorEastAsia"/>
+        </w:rPr>
+        <w:t>” and it satisfies the condition where the first and last characters are the same (case insensitive). Hence the answer is 1.</w:t>
+      </w:r>
+    </w:p>
+    <w:p>
+      <w:pPr>
+        <w:rPr>
+          <w:rFonts w:eastAsiaTheme="minorEastAsia"/>
+        </w:rPr>
+      </w:pPr>
+    </w:p>
+    <w:p>
+      <w:pPr>
+        <w:pStyle w:val="ListParagraph"/>
+        <w:numPr>
+          <w:ilvl w:val="0"/>
+          <w:numId w:val="1"/>
+        </w:numPr>
+        <w:rPr>
+          <w:rFonts w:eastAsiaTheme="minorEastAsia"/>
+        </w:rPr>
+      </w:pPr>
+      <w:r>
+        <w:rPr>
+          <w:rFonts w:eastAsiaTheme="minorEastAsia"/>
+        </w:rPr>
+        <w:t>You have been tasked with ensuring the integrity of sensor data used in a real-time monitoring system. Occasionally, sensors produce readings with consecutive duplicate digits that need to be corrected.</w:t>
+      </w:r>
+    </w:p>
+    <w:p>
+      <w:pPr>
+        <w:rPr>
+          <w:rFonts w:eastAsiaTheme="minorEastAsia"/>
+        </w:rPr>
+      </w:pPr>
+    </w:p>
+    <w:p>
+      <w:pPr>
+        <w:ind w:left="720"/>
+        <w:rPr>
+          <w:rFonts w:eastAsiaTheme="minorEastAsia"/>
+        </w:rPr>
+      </w:pPr>
+      <w:r>
+        <w:rPr>
+          <w:rFonts w:eastAsiaTheme="minorEastAsia"/>
+        </w:rPr>
+        <w:t xml:space="preserve">Given a string of space-separated numbers </w:t>
+      </w:r>
+      <w:proofErr w:type="spellStart"/>
+      <w:r>
+        <w:rPr>
+          <w:rFonts w:eastAsiaTheme="minorEastAsia"/>
+          <w:i/>
+          <w:iCs/>
+        </w:rPr>
+        <w:t>sensorReadings</w:t>
+      </w:r>
+      <w:proofErr w:type="spellEnd"/>
+      <w:r>
+        <w:rPr>
+          <w:rFonts w:eastAsiaTheme="minorEastAsia"/>
+        </w:rPr>
+        <w:t>, identify each number with at least two consecutive duplicate digits. For each of these numbers, replace it with the sum of its digits. Return the modified string with the number separated by spaces in their original order.</w:t>
+      </w:r>
+    </w:p>
+    <w:p>
+      <w:pPr>
+        <w:ind w:left="720"/>
+        <w:rPr>
+          <w:rFonts w:eastAsiaTheme="minorEastAsia"/>
+        </w:rPr>
+      </w:pPr>
+    </w:p>
+    <w:p>
+      <w:pPr>
+        <w:ind w:left="720"/>
+        <w:rPr>
+          <w:rFonts w:eastAsiaTheme="minorEastAsia"/>
+        </w:rPr>
+      </w:pPr>
+      <w:r>
+        <w:rPr>
+          <w:rFonts w:eastAsiaTheme="minorEastAsia"/>
+          <w:b/>
+          <w:bCs/>
+        </w:rPr>
+        <w:t>Example:</w:t>
+      </w:r>
+      <w:r>
+        <w:rPr>
+          <w:rFonts w:eastAsiaTheme="minorEastAsia"/>
+        </w:rPr>
+        <w:t xml:space="preserve"> For </w:t>
+      </w:r>
+      <w:proofErr w:type="spellStart"/>
+      <w:r>
+        <w:rPr>
+          <w:rFonts w:eastAsiaTheme="minorEastAsia"/>
+          <w:i/>
+          <w:iCs/>
+        </w:rPr>
+        <w:t>sensorReadings</w:t>
+      </w:r>
+      <w:proofErr w:type="spellEnd"/>
+      <w:r>
+        <w:rPr>
+          <w:rFonts w:eastAsiaTheme="minorEastAsia"/>
+          <w:i/>
+          <w:iCs/>
+        </w:rPr>
+        <w:t xml:space="preserve"> = “123 4558 787”</w:t>
+      </w:r>
+      <w:r>
+        <w:rPr>
+          <w:rFonts w:eastAsiaTheme="minorEastAsia"/>
+        </w:rPr>
+        <w:t xml:space="preserve">, the output should be </w:t>
+      </w:r>
+      <w:r>
+        <w:rPr>
+          <w:rFonts w:eastAsiaTheme="minorEastAsia"/>
+          <w:i/>
+          <w:iCs/>
+        </w:rPr>
+        <w:t>solution(</w:t>
+      </w:r>
+      <w:proofErr w:type="spellStart"/>
+      <w:r>
+        <w:rPr>
+          <w:rFonts w:eastAsiaTheme="minorEastAsia"/>
+          <w:i/>
+          <w:iCs/>
+        </w:rPr>
+        <w:t>sensorReadings</w:t>
+      </w:r>
+      <w:proofErr w:type="spellEnd"/>
+      <w:r>
+        <w:rPr>
+          <w:rFonts w:eastAsiaTheme="minorEastAsia"/>
+          <w:i/>
+          <w:iCs/>
+        </w:rPr>
+        <w:t>) = “123 22 787”</w:t>
+      </w:r>
+      <w:r>
+        <w:rPr>
+          <w:rFonts w:eastAsiaTheme="minorEastAsia"/>
+        </w:rPr>
+        <w:t>.</w:t>
+      </w:r>
+    </w:p>
+    <w:p>
+      <w:pPr>
+        <w:ind w:left="720"/>
+        <w:rPr>
+          <w:rFonts w:eastAsiaTheme="minorEastAsia"/>
+        </w:rPr>
+      </w:pPr>
+    </w:p>
+    <w:p>
+      <w:pPr>
+        <w:ind w:left="720"/>
+        <w:rPr>
+          <w:rFonts w:eastAsiaTheme="minorEastAsia"/>
+        </w:rPr>
+      </w:pPr>
+      <w:r>
+        <w:rPr>
+          <w:rFonts w:eastAsiaTheme="minorEastAsia"/>
+        </w:rPr>
+        <w:t>The number 4558 has consecutive duplicate digits 5. The sum of digits in 4558 is 4 + 5 + 5 + 8= 22, so it is replaced with 22. The number 787 has duplicate digits 7 but they are not consecutive, so it remains unchanged.</w:t>
+      </w:r>
+    </w:p>
+    <w:p>
+      <w:pPr>
+        <w:rPr>
+          <w:rFonts w:eastAsiaTheme="minorEastAsia"/>
+        </w:rPr>
+      </w:pPr>
+    </w:p>
+    <w:p>
+      <w:pPr>
+        <w:pStyle w:val="ListParagraph"/>
+        <w:numPr>
+          <w:ilvl w:val="0"/>
+          <w:numId w:val="1"/>
+        </w:numPr>
+        <w:rPr>
+          <w:rFonts w:eastAsiaTheme="minorEastAsia"/>
+        </w:rPr>
+      </w:pPr>
+      <w:r>
+        <w:rPr>
+          <w:rFonts w:eastAsiaTheme="minorEastAsia"/>
+        </w:rPr>
+        <w:t xml:space="preserve">In a distant universe, there exists a planet entirely covered in crystals with vibrant energy. These crystals can communicate among themselves, but their transmissions are only successful if the crystals are located close to each other. You are presented with a list of integer pairs called </w:t>
+      </w:r>
+      <w:r>
+        <w:rPr>
+          <w:rFonts w:eastAsiaTheme="minorEastAsia"/>
+          <w:i/>
+          <w:iCs/>
+        </w:rPr>
+        <w:t>centers</w:t>
+      </w:r>
+      <w:r>
+        <w:rPr>
+          <w:rFonts w:eastAsiaTheme="minorEastAsia"/>
+        </w:rPr>
+        <w:t>, where each pair represents the coordinates of a crystal on this planet. Each crystal protects a field of influence forming a square area around itself with sides measuring 2 units. Two crystal fields are said to intersect if they share at least one point. Determine how many pairs of crystals have overlapping fields.</w:t>
+      </w:r>
+    </w:p>
+    <w:p>
+      <w:pPr>
+        <w:rPr>
+          <w:rFonts w:eastAsiaTheme="minorEastAsia"/>
+        </w:rPr>
+      </w:pPr>
+    </w:p>
+    <w:p>
+      <w:pPr>
+        <w:ind w:left="720"/>
+        <w:rPr>
+          <w:rFonts w:eastAsiaTheme="minorEastAsia"/>
+        </w:rPr>
+      </w:pPr>
+      <w:r>
+        <w:rPr>
+          <w:rFonts w:eastAsiaTheme="minorEastAsia"/>
+          <w:b/>
+          <w:bCs/>
+        </w:rPr>
+        <w:t>Example:</w:t>
+      </w:r>
+      <w:r>
+        <w:rPr>
+          <w:rFonts w:eastAsiaTheme="minorEastAsia"/>
+        </w:rPr>
+        <w:t xml:space="preserve"> For </w:t>
+      </w:r>
+      <w:r>
+        <w:rPr>
+          <w:rFonts w:eastAsiaTheme="minorEastAsia"/>
+          <w:i/>
+          <w:iCs/>
+        </w:rPr>
+        <w:t>centers = [[1,1], [2,2], [0,4]]</w:t>
+      </w:r>
+      <w:r>
+        <w:rPr>
+          <w:rFonts w:eastAsiaTheme="minorEastAsia"/>
+        </w:rPr>
+        <w:t xml:space="preserve">, the solution is </w:t>
+      </w:r>
+      <w:r>
+        <w:rPr>
+          <w:rFonts w:eastAsiaTheme="minorEastAsia"/>
+          <w:i/>
+          <w:iCs/>
+        </w:rPr>
+        <w:t>solution(centers) = 1</w:t>
+      </w:r>
+      <w:r>
+        <w:rPr>
+          <w:rFonts w:eastAsiaTheme="minorEastAsia"/>
+        </w:rPr>
+        <w:t>.</w:t>
+      </w:r>
+    </w:p>
+    <w:p>
+      <w:pPr>
+        <w:ind w:left="720"/>
+        <w:rPr>
+          <w:rFonts w:eastAsiaTheme="minorEastAsia"/>
+        </w:rPr>
+      </w:pPr>
+    </w:p>
+    <w:p>
+      <w:pPr>
+        <w:ind w:left="720"/>
+        <w:rPr>
+          <w:rFonts w:eastAsiaTheme="minorEastAsia"/>
+        </w:rPr>
+      </w:pPr>
+      <w:r>
+        <w:rPr>
+          <w:rFonts w:eastAsiaTheme="minorEastAsia"/>
+          <w:highlight w:val="yellow"/>
+        </w:rPr>
+        <w:t>Note – This is problem 31 but worded differently. Test cases are the exact same as 31.</w:t>
+      </w:r>
+    </w:p>
+    <w:p>
+      <w:pPr>
+        <w:ind w:left="720"/>
+        <w:rPr>
+          <w:rFonts w:eastAsiaTheme="minorEastAsia"/>
+        </w:rPr>
+      </w:pPr>
+    </w:p>
+    <w:p>
+      <w:pPr>
+        <w:ind w:left="720"/>
+        <w:rPr>
+          <w:rFonts w:eastAsiaTheme="minorEastAsia"/>
+        </w:rPr>
+      </w:pPr>
+      <w:r>
+        <w:rPr>
+          <w:rFonts w:eastAsiaTheme="minorEastAsia"/>
+        </w:rPr>
+        <w:t xml:space="preserve">Answer: Question31 </w:t>
+      </w:r>
+    </w:p>
     <w:sectPr>
       <w:pgSz w:w="12240" w:h="15840"/>
       <w:pgMar w:top="1440" w:right="1440" w:bottom="1440" w:left="1440" w:header="720" w:footer="720" w:gutter="0"/>
@@ -18818,7 +19302,7 @@
 </file>
 
 <file path=word/numbering.xml><?xml version="1.0" encoding="utf-8"?>
-<w:numbering xmlns:wpc="http://schemas.microsoft.com/office/word/2010/wordprocessingCanvas" xmlns:cx="http://schemas.microsoft.com/office/drawing/2014/chartex" xmlns:cx1="http://schemas.microsoft.com/office/drawing/2015/9/8/chartex" xmlns:cx2="http://schemas.microsoft.com/office/drawing/2015/10/21/chartex" xmlns:cx3="http://schemas.microsoft.com/office/drawing/2016/5/9/chartex" xmlns:cx4="http://schemas.microsoft.com/office/drawing/2016/5/10/chartex" xmlns:cx5="http://schemas.microsoft.com/office/drawing/2016/5/11/chartex" xmlns:cx6="http://schemas.microsoft.com/office/drawing/2016/5/12/chartex" xmlns:cx7="http://schemas.microsoft.com/office/drawing/2016/5/13/chartex" xmlns:cx8="http://schemas.microsoft.com/office/drawing/2016/5/14/chartex" xmlns:mc="http://schemas.openxmlformats.org/markup-compatibility/2006" xmlns:aink="http://schemas.microsoft.com/office/drawing/2016/ink" xmlns:am3d="http://schemas.microsoft.com/office/drawing/2017/model3d" xmlns:o="urn:schemas-microsoft-com:office:office" xmlns:oel="http://schemas.microsoft.com/office/2019/extlst" xmlns:r="http://schemas.openxmlformats.org/officeDocument/2006/relationships" xmlns:m="http://schemas.openxmlformats.org/officeDocument/2006/math" xmlns:v="urn:schemas-microsoft-com:vml" xmlns:wp14="http://schemas.microsoft.com/office/word/2010/wordprocessingDrawing" xmlns:wp="http://schemas.openxmlformats.org/drawingml/2006/wordprocessingDrawing" xmlns:w10="urn:schemas-microsoft-com:office:word" xmlns:w="http://schemas.openxmlformats.org/wordprocessingml/2006/main" xmlns:w14="http://schemas.microsoft.com/office/word/2010/wordml" xmlns:w15="http://schemas.microsoft.com/office/word/2012/wordml" xmlns:w16cex="http://schemas.microsoft.com/office/word/2018/wordml/cex" xmlns:w16cid="http://schemas.microsoft.com/office/word/2016/wordml/cid" xmlns:w16="http://schemas.microsoft.com/office/word/2018/wordml" xmlns:w16du="http://schemas.microsoft.com/office/word/2023/wordml/word16du" xmlns:w16sdtdh="http://schemas.microsoft.com/office/word/2020/wordml/sdtdatahash" xmlns:w16se="http://schemas.microsoft.com/office/word/2015/wordml/symex" xmlns:wpg="http://schemas.microsoft.com/office/word/2010/wordprocessingGroup" xmlns:wpi="http://schemas.microsoft.com/office/word/2010/wordprocessingInk" xmlns:wne="http://schemas.microsoft.com/office/word/2006/wordml" xmlns:wps="http://schemas.microsoft.com/office/word/2010/wordprocessingShape" mc:Ignorable="w14 w15 w16se w16cid w16 w16cex w16sdtdh w16du wp14">
+<w:numbering xmlns:wpc="http://schemas.microsoft.com/office/word/2010/wordprocessingCanvas" xmlns:cx="http://schemas.microsoft.com/office/drawing/2014/chartex" xmlns:cx1="http://schemas.microsoft.com/office/drawing/2015/9/8/chartex" xmlns:cx2="http://schemas.microsoft.com/office/drawing/2015/10/21/chartex" xmlns:cx3="http://schemas.microsoft.com/office/drawing/2016/5/9/chartex" xmlns:cx4="http://schemas.microsoft.com/office/drawing/2016/5/10/chartex" xmlns:cx5="http://schemas.microsoft.com/office/drawing/2016/5/11/chartex" xmlns:cx6="http://schemas.microsoft.com/office/drawing/2016/5/12/chartex" xmlns:cx7="http://schemas.microsoft.com/office/drawing/2016/5/13/chartex" xmlns:cx8="http://schemas.microsoft.com/office/drawing/2016/5/14/chartex" xmlns:mc="http://schemas.openxmlformats.org/markup-compatibility/2006" xmlns:aink="http://schemas.microsoft.com/office/drawing/2016/ink" xmlns:am3d="http://schemas.microsoft.com/office/drawing/2017/model3d" xmlns:o="urn:schemas-microsoft-com:office:office" xmlns:oel="http://schemas.microsoft.com/office/2019/extlst" xmlns:r="http://schemas.openxmlformats.org/officeDocument/2006/relationships" xmlns:m="http://schemas.openxmlformats.org/officeDocument/2006/math" xmlns:v="urn:schemas-microsoft-com:vml" xmlns:wp14="http://schemas.microsoft.com/office/word/2010/wordprocessingDrawing" xmlns:wp="http://schemas.openxmlformats.org/drawingml/2006/wordprocessingDrawing" xmlns:w10="urn:schemas-microsoft-com:office:word" xmlns:w="http://schemas.openxmlformats.org/wordprocessingml/2006/main" xmlns:w14="http://schemas.microsoft.com/office/word/2010/wordml" xmlns:w15="http://schemas.microsoft.com/office/word/2012/wordml" xmlns:w16cex="http://schemas.microsoft.com/office/word/2018/wordml/cex" xmlns:w16cid="http://schemas.microsoft.com/office/word/2016/wordml/cid" xmlns:w16="http://schemas.microsoft.com/office/word/2018/wordml" xmlns:w16du="http://schemas.microsoft.com/office/word/2023/wordml/word16du" xmlns:w16sdtdh="http://schemas.microsoft.com/office/word/2020/wordml/sdtdatahash" xmlns:w16sdtfl="http://schemas.microsoft.com/office/word/2024/wordml/sdtformatlock" xmlns:w16se="http://schemas.microsoft.com/office/word/2015/wordml/symex" xmlns:wpg="http://schemas.microsoft.com/office/word/2010/wordprocessingGroup" xmlns:wpi="http://schemas.microsoft.com/office/word/2010/wordprocessingInk" xmlns:wne="http://schemas.microsoft.com/office/word/2006/wordml" xmlns:wps="http://schemas.microsoft.com/office/word/2010/wordprocessingShape" mc:Ignorable="w14 w15 w16se w16cid w16 w16cex w16sdtdh w16sdtfl w16du wp14">
   <w:abstractNum w:abstractNumId="0" w15:restartNumberingAfterBreak="0">
     <w:nsid w:val="058D1387"/>
     <w:multiLevelType w:val="hybridMultilevel"/>
@@ -20524,7 +21008,7 @@
 </file>
 
 <file path=word/styles.xml><?xml version="1.0" encoding="utf-8"?>
-<w:styles xmlns:mc="http://schemas.openxmlformats.org/markup-compatibility/2006" xmlns:r="http://schemas.openxmlformats.org/officeDocument/2006/relationships" xmlns:w="http://schemas.openxmlformats.org/wordprocessingml/2006/main" xmlns:w14="http://schemas.microsoft.com/office/word/2010/wordml" xmlns:w15="http://schemas.microsoft.com/office/word/2012/wordml" xmlns:w16cex="http://schemas.microsoft.com/office/word/2018/wordml/cex" xmlns:w16cid="http://schemas.microsoft.com/office/word/2016/wordml/cid" xmlns:w16="http://schemas.microsoft.com/office/word/2018/wordml" xmlns:w16du="http://schemas.microsoft.com/office/word/2023/wordml/word16du" xmlns:w16sdtdh="http://schemas.microsoft.com/office/word/2020/wordml/sdtdatahash" xmlns:w16se="http://schemas.microsoft.com/office/word/2015/wordml/symex" mc:Ignorable="w14 w15 w16se w16cid w16 w16cex w16sdtdh w16du">
+<w:styles xmlns:mc="http://schemas.openxmlformats.org/markup-compatibility/2006" xmlns:r="http://schemas.openxmlformats.org/officeDocument/2006/relationships" xmlns:w="http://schemas.openxmlformats.org/wordprocessingml/2006/main" xmlns:w14="http://schemas.microsoft.com/office/word/2010/wordml" xmlns:w15="http://schemas.microsoft.com/office/word/2012/wordml" xmlns:w16cex="http://schemas.microsoft.com/office/word/2018/wordml/cex" xmlns:w16cid="http://schemas.microsoft.com/office/word/2016/wordml/cid" xmlns:w16="http://schemas.microsoft.com/office/word/2018/wordml" xmlns:w16du="http://schemas.microsoft.com/office/word/2023/wordml/word16du" xmlns:w16sdtdh="http://schemas.microsoft.com/office/word/2020/wordml/sdtdatahash" xmlns:w16sdtfl="http://schemas.microsoft.com/office/word/2024/wordml/sdtformatlock" xmlns:w16se="http://schemas.microsoft.com/office/word/2015/wordml/symex" mc:Ignorable="w14 w15 w16se w16cid w16 w16cex w16sdtdh w16sdtfl w16du">
   <w:docDefaults>
     <w:rPrDefault>
       <w:rPr>

</xml_diff>

<commit_message>
Added Question66 and Question67 for Codesignal SWE
</commit_message>
<xml_diff>
--- a/src/main/resources/capitalone/codesignal/swe/CodeSignal_Questions_SWE.docx
+++ b/src/main/resources/capitalone/codesignal/swe/CodeSignal_Questions_SWE.docx
@@ -19291,6 +19291,572 @@
         <w:t xml:space="preserve">Answer: Question31 </w:t>
       </w:r>
     </w:p>
+    <w:p>
+      <w:pPr>
+        <w:rPr>
+          <w:rFonts w:eastAsiaTheme="minorEastAsia"/>
+        </w:rPr>
+      </w:pPr>
+    </w:p>
+    <w:p>
+      <w:pPr>
+        <w:pStyle w:val="ListParagraph"/>
+        <w:numPr>
+          <w:ilvl w:val="0"/>
+          <w:numId w:val="1"/>
+        </w:numPr>
+        <w:rPr>
+          <w:rFonts w:eastAsiaTheme="minorEastAsia"/>
+        </w:rPr>
+      </w:pPr>
+      <w:r>
+        <w:rPr>
+          <w:rFonts w:eastAsiaTheme="minorEastAsia"/>
+        </w:rPr>
+        <w:t xml:space="preserve">Imagine you are managing a city’s transit archive looking back at past bus departure records. You are provided with an array </w:t>
+      </w:r>
+      <w:proofErr w:type="spellStart"/>
+      <w:r>
+        <w:rPr>
+          <w:rFonts w:eastAsiaTheme="minorEastAsia"/>
+          <w:i/>
+          <w:iCs/>
+        </w:rPr>
+        <w:t>departure_times</w:t>
+      </w:r>
+      <w:proofErr w:type="spellEnd"/>
+      <w:r>
+        <w:rPr>
+          <w:rFonts w:eastAsiaTheme="minorEastAsia"/>
+        </w:rPr>
+        <w:t xml:space="preserve"> which lists when buses departed throughout the day. Your job is to determine how many minutes have passed since the most recent bus left the station. If no bus has departed by the current time return -1.</w:t>
+      </w:r>
+    </w:p>
+    <w:p>
+      <w:pPr>
+        <w:rPr>
+          <w:rFonts w:eastAsiaTheme="minorEastAsia"/>
+        </w:rPr>
+      </w:pPr>
+    </w:p>
+    <w:p>
+      <w:pPr>
+        <w:ind w:left="720"/>
+        <w:rPr>
+          <w:rFonts w:eastAsiaTheme="minorEastAsia"/>
+        </w:rPr>
+      </w:pPr>
+      <w:r>
+        <w:rPr>
+          <w:rFonts w:eastAsiaTheme="minorEastAsia"/>
+        </w:rPr>
+        <w:t>Time is formatted as strings in HH:MM within a 24-hour clock. All departures are ordered chronologically.</w:t>
+      </w:r>
+    </w:p>
+    <w:p>
+      <w:pPr>
+        <w:ind w:left="720"/>
+        <w:rPr>
+          <w:rFonts w:eastAsiaTheme="minorEastAsia"/>
+        </w:rPr>
+      </w:pPr>
+      <w:r>
+        <w:rPr>
+          <w:rFonts w:eastAsiaTheme="minorEastAsia"/>
+        </w:rPr>
+        <w:lastRenderedPageBreak/>
+        <w:t xml:space="preserve">Assume that a bus scheduled to leave exactly at </w:t>
+      </w:r>
+      <w:proofErr w:type="spellStart"/>
+      <w:r>
+        <w:rPr>
+          <w:rFonts w:eastAsiaTheme="minorEastAsia"/>
+          <w:i/>
+          <w:iCs/>
+        </w:rPr>
+        <w:t>current_time</w:t>
+      </w:r>
+      <w:proofErr w:type="spellEnd"/>
+      <w:r>
+        <w:rPr>
+          <w:rFonts w:eastAsiaTheme="minorEastAsia"/>
+        </w:rPr>
+        <w:t xml:space="preserve"> has not yet departed.</w:t>
+      </w:r>
+    </w:p>
+    <w:p>
+      <w:pPr>
+        <w:ind w:left="720"/>
+        <w:rPr>
+          <w:rFonts w:eastAsiaTheme="minorEastAsia"/>
+        </w:rPr>
+      </w:pPr>
+    </w:p>
+    <w:p>
+      <w:pPr>
+        <w:ind w:left="720"/>
+        <w:rPr>
+          <w:rFonts w:eastAsiaTheme="minorEastAsia"/>
+        </w:rPr>
+      </w:pPr>
+      <w:r>
+        <w:rPr>
+          <w:rFonts w:eastAsiaTheme="minorEastAsia"/>
+          <w:b/>
+          <w:bCs/>
+        </w:rPr>
+        <w:t>Example:</w:t>
+      </w:r>
+      <w:r>
+        <w:rPr>
+          <w:rFonts w:eastAsiaTheme="minorEastAsia"/>
+        </w:rPr>
+        <w:t xml:space="preserve"> For </w:t>
+      </w:r>
+      <w:proofErr w:type="spellStart"/>
+      <w:r>
+        <w:rPr>
+          <w:rFonts w:eastAsiaTheme="minorEastAsia"/>
+          <w:i/>
+          <w:iCs/>
+        </w:rPr>
+        <w:t>departure_times</w:t>
+      </w:r>
+      <w:proofErr w:type="spellEnd"/>
+      <w:r>
+        <w:rPr>
+          <w:rFonts w:eastAsiaTheme="minorEastAsia"/>
+          <w:i/>
+          <w:iCs/>
+        </w:rPr>
+        <w:t xml:space="preserve"> = [“12:30”, “14:00”, “19:55”]</w:t>
+      </w:r>
+      <w:r>
+        <w:rPr>
+          <w:rFonts w:eastAsiaTheme="minorEastAsia"/>
+        </w:rPr>
+        <w:t xml:space="preserve"> and </w:t>
+      </w:r>
+      <w:proofErr w:type="spellStart"/>
+      <w:r>
+        <w:rPr>
+          <w:rFonts w:eastAsiaTheme="minorEastAsia"/>
+          <w:i/>
+          <w:iCs/>
+        </w:rPr>
+        <w:t>current_time</w:t>
+      </w:r>
+      <w:proofErr w:type="spellEnd"/>
+      <w:r>
+        <w:rPr>
+          <w:rFonts w:eastAsiaTheme="minorEastAsia"/>
+          <w:i/>
+          <w:iCs/>
+        </w:rPr>
+        <w:t xml:space="preserve"> = “14:30”</w:t>
+      </w:r>
+      <w:r>
+        <w:rPr>
+          <w:rFonts w:eastAsiaTheme="minorEastAsia"/>
+        </w:rPr>
+        <w:t xml:space="preserve">, the output should be </w:t>
+      </w:r>
+      <w:proofErr w:type="gramStart"/>
+      <w:r>
+        <w:rPr>
+          <w:rFonts w:eastAsiaTheme="minorEastAsia"/>
+          <w:i/>
+          <w:iCs/>
+        </w:rPr>
+        <w:t>solution(</w:t>
+      </w:r>
+      <w:proofErr w:type="spellStart"/>
+      <w:proofErr w:type="gramEnd"/>
+      <w:r>
+        <w:rPr>
+          <w:rFonts w:eastAsiaTheme="minorEastAsia"/>
+          <w:i/>
+          <w:iCs/>
+        </w:rPr>
+        <w:t>departure_times</w:t>
+      </w:r>
+      <w:proofErr w:type="spellEnd"/>
+      <w:r>
+        <w:rPr>
+          <w:rFonts w:eastAsiaTheme="minorEastAsia"/>
+          <w:i/>
+          <w:iCs/>
+        </w:rPr>
+        <w:t xml:space="preserve">, </w:t>
+      </w:r>
+      <w:proofErr w:type="spellStart"/>
+      <w:r>
+        <w:rPr>
+          <w:rFonts w:eastAsiaTheme="minorEastAsia"/>
+          <w:i/>
+          <w:iCs/>
+        </w:rPr>
+        <w:t>current_time</w:t>
+      </w:r>
+      <w:proofErr w:type="spellEnd"/>
+      <w:r>
+        <w:rPr>
+          <w:rFonts w:eastAsiaTheme="minorEastAsia"/>
+          <w:i/>
+          <w:iCs/>
+        </w:rPr>
+        <w:t>) = 30</w:t>
+      </w:r>
+      <w:r>
+        <w:rPr>
+          <w:rFonts w:eastAsiaTheme="minorEastAsia"/>
+        </w:rPr>
+        <w:t>.</w:t>
+      </w:r>
+    </w:p>
+    <w:p>
+      <w:pPr>
+        <w:ind w:left="720"/>
+        <w:rPr>
+          <w:rFonts w:eastAsiaTheme="minorEastAsia"/>
+        </w:rPr>
+      </w:pPr>
+    </w:p>
+    <w:p>
+      <w:pPr>
+        <w:ind w:left="720"/>
+        <w:rPr>
+          <w:rFonts w:eastAsiaTheme="minorEastAsia"/>
+        </w:rPr>
+      </w:pPr>
+      <w:r>
+        <w:rPr>
+          <w:rFonts w:eastAsiaTheme="minorEastAsia"/>
+        </w:rPr>
+        <w:t>Answer: Question65</w:t>
+      </w:r>
+    </w:p>
+    <w:p>
+      <w:pPr>
+        <w:rPr>
+          <w:rFonts w:eastAsiaTheme="minorEastAsia"/>
+        </w:rPr>
+      </w:pPr>
+    </w:p>
+    <w:p>
+      <w:pPr>
+        <w:pStyle w:val="ListParagraph"/>
+        <w:numPr>
+          <w:ilvl w:val="0"/>
+          <w:numId w:val="1"/>
+        </w:numPr>
+        <w:rPr>
+          <w:rFonts w:eastAsiaTheme="minorEastAsia"/>
+        </w:rPr>
+      </w:pPr>
+      <w:r>
+        <w:t xml:space="preserve">Given an empty array that should contain integers numbers, your task is to process a list of queries on it. </w:t>
+      </w:r>
+      <w:proofErr w:type="gramStart"/>
+      <w:r>
+        <w:t>Specifically</w:t>
+      </w:r>
+      <w:proofErr w:type="gramEnd"/>
+      <w:r>
+        <w:t xml:space="preserve"> there are two types of queries: </w:t>
+      </w:r>
+    </w:p>
+    <w:p>
+      <w:pPr>
+        <w:pStyle w:val="ListParagraph"/>
+        <w:numPr>
+          <w:ilvl w:val="1"/>
+          <w:numId w:val="1"/>
+        </w:numPr>
+        <w:rPr>
+          <w:rFonts w:eastAsiaTheme="minorEastAsia"/>
+        </w:rPr>
+      </w:pPr>
+      <w:r>
+        <w:t xml:space="preserve">+x - append x to numbers, numbers may contain multiple instances of the same int </w:t>
+      </w:r>
+    </w:p>
+    <w:p>
+      <w:pPr>
+        <w:pStyle w:val="ListParagraph"/>
+        <w:numPr>
+          <w:ilvl w:val="1"/>
+          <w:numId w:val="1"/>
+        </w:numPr>
+        <w:rPr>
+          <w:rFonts w:eastAsiaTheme="minorEastAsia"/>
+        </w:rPr>
+      </w:pPr>
+      <w:r>
+        <w:t xml:space="preserve">-x - remove all instances of x from numbers </w:t>
+      </w:r>
+    </w:p>
+    <w:p/>
+    <w:p>
+      <w:pPr>
+        <w:ind w:left="720"/>
+      </w:pPr>
+      <w:r>
+        <w:t>After processing each query, count the number of triples (</w:t>
+      </w:r>
+      <w:proofErr w:type="spellStart"/>
+      <w:proofErr w:type="gramStart"/>
+      <w:r>
+        <w:t>x,y</w:t>
+      </w:r>
+      <w:proofErr w:type="gramEnd"/>
+      <w:r>
+        <w:t>,z</w:t>
+      </w:r>
+      <w:proofErr w:type="spellEnd"/>
+      <w:r>
+        <w:t xml:space="preserve">) in numbers which meet this condition: </w:t>
+      </w:r>
+    </w:p>
+    <w:p>
+      <w:pPr>
+        <w:ind w:left="720" w:firstLine="720"/>
+      </w:pPr>
+      <w:r>
+        <w:t xml:space="preserve">- both x - y and y - z are equal to a given diff. </w:t>
+      </w:r>
+    </w:p>
+    <w:p>
+      <w:pPr>
+        <w:ind w:left="720"/>
+      </w:pPr>
+    </w:p>
+    <w:p>
+      <w:pPr>
+        <w:ind w:left="720"/>
+      </w:pPr>
+      <w:r>
+        <w:t>Note that elements in numbers can be rearranged to form triples to meet the condition. The final output should be an array of counts after each query in queries.</w:t>
+      </w:r>
+    </w:p>
+    <w:p>
+      <w:pPr>
+        <w:ind w:left="720"/>
+      </w:pPr>
+    </w:p>
+    <w:p>
+      <w:pPr>
+        <w:ind w:left="720"/>
+      </w:pPr>
+      <w:r>
+        <w:rPr>
+          <w:b/>
+          <w:bCs/>
+        </w:rPr>
+        <w:t>Example:</w:t>
+      </w:r>
+      <w:r>
+        <w:t xml:space="preserve"> For queries = [“+4”, “+5”, “+6”, “+4”, “+3”, “-4”] and diff = 1, the </w:t>
+      </w:r>
+      <w:proofErr w:type="gramStart"/>
+      <w:r>
+        <w:rPr>
+          <w:i/>
+          <w:iCs/>
+        </w:rPr>
+        <w:t>solution(</w:t>
+      </w:r>
+      <w:proofErr w:type="gramEnd"/>
+      <w:r>
+        <w:rPr>
+          <w:i/>
+          <w:iCs/>
+        </w:rPr>
+        <w:t>queries, diff)</w:t>
+      </w:r>
+      <w:r>
+        <w:t xml:space="preserve"> = </w:t>
+      </w:r>
+      <w:r>
+        <w:rPr>
+          <w:i/>
+          <w:iCs/>
+        </w:rPr>
+        <w:t>[0, 0, 1, 2, 4, 0]</w:t>
+      </w:r>
+    </w:p>
+    <w:p>
+      <w:pPr>
+        <w:ind w:left="720"/>
+        <w:rPr>
+          <w:rFonts w:eastAsiaTheme="minorEastAsia"/>
+        </w:rPr>
+      </w:pPr>
+    </w:p>
+    <w:p>
+      <w:pPr>
+        <w:ind w:left="720"/>
+        <w:rPr>
+          <w:rFonts w:eastAsiaTheme="minorEastAsia"/>
+        </w:rPr>
+      </w:pPr>
+      <w:r>
+        <w:rPr>
+          <w:rFonts w:eastAsiaTheme="minorEastAsia"/>
+        </w:rPr>
+        <w:t>Answer: Question66</w:t>
+      </w:r>
+    </w:p>
+    <w:p>
+      <w:pPr>
+        <w:rPr>
+          <w:rFonts w:eastAsiaTheme="minorEastAsia"/>
+        </w:rPr>
+      </w:pPr>
+    </w:p>
+    <w:p>
+      <w:pPr>
+        <w:pStyle w:val="ListParagraph"/>
+        <w:numPr>
+          <w:ilvl w:val="0"/>
+          <w:numId w:val="1"/>
+        </w:numPr>
+        <w:rPr>
+          <w:rFonts w:eastAsiaTheme="minorEastAsia"/>
+        </w:rPr>
+      </w:pPr>
+      <w:r>
+        <w:t xml:space="preserve">Think about a team chat with numerous users writing messages in it. </w:t>
+      </w:r>
+    </w:p>
+    <w:p>
+      <w:pPr>
+        <w:pStyle w:val="ListParagraph"/>
+        <w:rPr>
+          <w:rFonts w:eastAsiaTheme="minorEastAsia"/>
+        </w:rPr>
+      </w:pPr>
+    </w:p>
+    <w:p>
+      <w:pPr>
+        <w:pStyle w:val="ListParagraph"/>
+        <w:numPr>
+          <w:ilvl w:val="0"/>
+          <w:numId w:val="15"/>
+        </w:numPr>
+      </w:pPr>
+      <w:r>
+        <w:t xml:space="preserve">MESSAGE - messages a set of users. The format looks as follows: ["MESSAGE", "&lt;timestamp&gt;", "&lt;mentions&gt;"]. Mentions string can contain the following space separated tokens: </w:t>
+      </w:r>
+    </w:p>
+    <w:p>
+      <w:pPr>
+        <w:pStyle w:val="ListParagraph"/>
+        <w:numPr>
+          <w:ilvl w:val="0"/>
+          <w:numId w:val="15"/>
+        </w:numPr>
+      </w:pPr>
+      <w:r>
+        <w:t xml:space="preserve">id&lt;number&gt; where &lt;number&gt; is an int in range [1,999] mentioning of individual users - ALL - mentioning all users - HERE - mentioning </w:t>
+      </w:r>
+      <w:proofErr w:type="spellStart"/>
+      <w:r>
+        <w:t>acive</w:t>
+      </w:r>
+      <w:proofErr w:type="spellEnd"/>
+      <w:r>
+        <w:t xml:space="preserve"> users </w:t>
+      </w:r>
+    </w:p>
+    <w:p>
+      <w:pPr>
+        <w:pStyle w:val="ListParagraph"/>
+        <w:numPr>
+          <w:ilvl w:val="0"/>
+          <w:numId w:val="15"/>
+        </w:numPr>
+      </w:pPr>
+      <w:r>
+        <w:t xml:space="preserve">OFFLINE - makes a user with given id inactive for 60min time tickets - the user will be active again at the time &lt;timestamp&gt; + 60. It is guaranteed that the user with given &lt;id&gt; will be active when this action is applied. The format looks as follows </w:t>
+      </w:r>
+    </w:p>
+    <w:p>
+      <w:pPr>
+        <w:pStyle w:val="ListParagraph"/>
+      </w:pPr>
+    </w:p>
+    <w:p>
+      <w:pPr>
+        <w:pStyle w:val="ListParagraph"/>
+      </w:pPr>
+      <w:r>
+        <w:t xml:space="preserve">[OFFLINE, &lt;timestamp&gt; &lt;id&gt;] </w:t>
+      </w:r>
+    </w:p>
+    <w:p>
+      <w:pPr>
+        <w:pStyle w:val="ListParagraph"/>
+      </w:pPr>
+    </w:p>
+    <w:p>
+      <w:pPr>
+        <w:pStyle w:val="ListParagraph"/>
+      </w:pPr>
+      <w:r>
+        <w:t xml:space="preserve">Your task is to calculate mention statistics. given a list of users in the group chat and a list of chat events, count the number of message events that each user is mentioned in. Return the results in an array of strings with each string following this format [user </w:t>
+      </w:r>
+      <w:proofErr w:type="gramStart"/>
+      <w:r>
+        <w:t>id]=</w:t>
+      </w:r>
+      <w:proofErr w:type="gramEnd"/>
+      <w:r>
+        <w:t>[mentions count]. The array should be sorted lexicographically by user id in ascending order.</w:t>
+      </w:r>
+    </w:p>
+    <w:p>
+      <w:pPr>
+        <w:pStyle w:val="ListParagraph"/>
+      </w:pPr>
+    </w:p>
+    <w:p>
+      <w:pPr>
+        <w:pStyle w:val="ListParagraph"/>
+      </w:pPr>
+      <w:r>
+        <w:rPr>
+          <w:b/>
+          <w:bCs/>
+        </w:rPr>
+        <w:t xml:space="preserve">Example: </w:t>
+      </w:r>
+      <w:r>
+        <w:t>No example</w:t>
+      </w:r>
+    </w:p>
+    <w:p>
+      <w:pPr>
+        <w:pStyle w:val="ListParagraph"/>
+        <w:rPr>
+          <w:rFonts w:eastAsiaTheme="minorEastAsia"/>
+        </w:rPr>
+      </w:pPr>
+      <w:r>
+        <w:rPr>
+          <w:rFonts w:eastAsiaTheme="minorEastAsia"/>
+        </w:rPr>
+        <w:t>Answer: Question67</w:t>
+      </w:r>
+    </w:p>
+    <w:p>
+      <w:pPr>
+        <w:pStyle w:val="ListParagraph"/>
+        <w:rPr>
+          <w:rFonts w:eastAsiaTheme="minorEastAsia"/>
+        </w:rPr>
+      </w:pPr>
+    </w:p>
     <w:sectPr>
       <w:pgSz w:w="12240" w:h="15840"/>
       <w:pgMar w:top="1440" w:right="1440" w:bottom="1440" w:left="1440" w:header="720" w:footer="720" w:gutter="0"/>
@@ -19530,6 +20096,119 @@
     </w:lvl>
   </w:abstractNum>
   <w:abstractNum w:abstractNumId="2" w15:restartNumberingAfterBreak="0">
+    <w:nsid w:val="27FE7F02"/>
+    <w:multiLevelType w:val="hybridMultilevel"/>
+    <w:tmpl w:val="9CDAD668"/>
+    <w:lvl w:ilvl="0" w:tplc="04090001">
+      <w:start w:val="1"/>
+      <w:numFmt w:val="bullet"/>
+      <w:lvlText w:val=""/>
+      <w:lvlJc w:val="left"/>
+      <w:pPr>
+        <w:ind w:left="1440" w:hanging="360"/>
+      </w:pPr>
+      <w:rPr>
+        <w:rFonts w:ascii="Symbol" w:hAnsi="Symbol" w:hint="default"/>
+      </w:rPr>
+    </w:lvl>
+    <w:lvl w:ilvl="1" w:tplc="04090003" w:tentative="1">
+      <w:start w:val="1"/>
+      <w:numFmt w:val="bullet"/>
+      <w:lvlText w:val="o"/>
+      <w:lvlJc w:val="left"/>
+      <w:pPr>
+        <w:ind w:left="2160" w:hanging="360"/>
+      </w:pPr>
+      <w:rPr>
+        <w:rFonts w:ascii="Courier New" w:hAnsi="Courier New" w:cs="Courier New" w:hint="default"/>
+      </w:rPr>
+    </w:lvl>
+    <w:lvl w:ilvl="2" w:tplc="04090005" w:tentative="1">
+      <w:start w:val="1"/>
+      <w:numFmt w:val="bullet"/>
+      <w:lvlText w:val=""/>
+      <w:lvlJc w:val="left"/>
+      <w:pPr>
+        <w:ind w:left="2880" w:hanging="360"/>
+      </w:pPr>
+      <w:rPr>
+        <w:rFonts w:ascii="Wingdings" w:hAnsi="Wingdings" w:hint="default"/>
+      </w:rPr>
+    </w:lvl>
+    <w:lvl w:ilvl="3" w:tplc="04090001" w:tentative="1">
+      <w:start w:val="1"/>
+      <w:numFmt w:val="bullet"/>
+      <w:lvlText w:val=""/>
+      <w:lvlJc w:val="left"/>
+      <w:pPr>
+        <w:ind w:left="3600" w:hanging="360"/>
+      </w:pPr>
+      <w:rPr>
+        <w:rFonts w:ascii="Symbol" w:hAnsi="Symbol" w:hint="default"/>
+      </w:rPr>
+    </w:lvl>
+    <w:lvl w:ilvl="4" w:tplc="04090003" w:tentative="1">
+      <w:start w:val="1"/>
+      <w:numFmt w:val="bullet"/>
+      <w:lvlText w:val="o"/>
+      <w:lvlJc w:val="left"/>
+      <w:pPr>
+        <w:ind w:left="4320" w:hanging="360"/>
+      </w:pPr>
+      <w:rPr>
+        <w:rFonts w:ascii="Courier New" w:hAnsi="Courier New" w:cs="Courier New" w:hint="default"/>
+      </w:rPr>
+    </w:lvl>
+    <w:lvl w:ilvl="5" w:tplc="04090005" w:tentative="1">
+      <w:start w:val="1"/>
+      <w:numFmt w:val="bullet"/>
+      <w:lvlText w:val=""/>
+      <w:lvlJc w:val="left"/>
+      <w:pPr>
+        <w:ind w:left="5040" w:hanging="360"/>
+      </w:pPr>
+      <w:rPr>
+        <w:rFonts w:ascii="Wingdings" w:hAnsi="Wingdings" w:hint="default"/>
+      </w:rPr>
+    </w:lvl>
+    <w:lvl w:ilvl="6" w:tplc="04090001" w:tentative="1">
+      <w:start w:val="1"/>
+      <w:numFmt w:val="bullet"/>
+      <w:lvlText w:val=""/>
+      <w:lvlJc w:val="left"/>
+      <w:pPr>
+        <w:ind w:left="5760" w:hanging="360"/>
+      </w:pPr>
+      <w:rPr>
+        <w:rFonts w:ascii="Symbol" w:hAnsi="Symbol" w:hint="default"/>
+      </w:rPr>
+    </w:lvl>
+    <w:lvl w:ilvl="7" w:tplc="04090003" w:tentative="1">
+      <w:start w:val="1"/>
+      <w:numFmt w:val="bullet"/>
+      <w:lvlText w:val="o"/>
+      <w:lvlJc w:val="left"/>
+      <w:pPr>
+        <w:ind w:left="6480" w:hanging="360"/>
+      </w:pPr>
+      <w:rPr>
+        <w:rFonts w:ascii="Courier New" w:hAnsi="Courier New" w:cs="Courier New" w:hint="default"/>
+      </w:rPr>
+    </w:lvl>
+    <w:lvl w:ilvl="8" w:tplc="04090005" w:tentative="1">
+      <w:start w:val="1"/>
+      <w:numFmt w:val="bullet"/>
+      <w:lvlText w:val=""/>
+      <w:lvlJc w:val="left"/>
+      <w:pPr>
+        <w:ind w:left="7200" w:hanging="360"/>
+      </w:pPr>
+      <w:rPr>
+        <w:rFonts w:ascii="Wingdings" w:hAnsi="Wingdings" w:hint="default"/>
+      </w:rPr>
+    </w:lvl>
+  </w:abstractNum>
+  <w:abstractNum w:abstractNumId="3" w15:restartNumberingAfterBreak="0">
     <w:nsid w:val="29A60487"/>
     <w:multiLevelType w:val="multilevel"/>
     <w:tmpl w:val="A00C6F82"/>
@@ -19678,7 +20357,7 @@
       </w:rPr>
     </w:lvl>
   </w:abstractNum>
-  <w:abstractNum w:abstractNumId="3" w15:restartNumberingAfterBreak="0">
+  <w:abstractNum w:abstractNumId="4" w15:restartNumberingAfterBreak="0">
     <w:nsid w:val="2E830469"/>
     <w:multiLevelType w:val="hybridMultilevel"/>
     <w:tmpl w:val="C5FA87C8"/>
@@ -19767,7 +20446,7 @@
       </w:pPr>
     </w:lvl>
   </w:abstractNum>
-  <w:abstractNum w:abstractNumId="4" w15:restartNumberingAfterBreak="0">
+  <w:abstractNum w:abstractNumId="5" w15:restartNumberingAfterBreak="0">
     <w:nsid w:val="2F2B3A14"/>
     <w:multiLevelType w:val="hybridMultilevel"/>
     <w:tmpl w:val="C5FA87C8"/>
@@ -19856,7 +20535,7 @@
       </w:pPr>
     </w:lvl>
   </w:abstractNum>
-  <w:abstractNum w:abstractNumId="5" w15:restartNumberingAfterBreak="0">
+  <w:abstractNum w:abstractNumId="6" w15:restartNumberingAfterBreak="0">
     <w:nsid w:val="397035D6"/>
     <w:multiLevelType w:val="multilevel"/>
     <w:tmpl w:val="1DE40B16"/>
@@ -20005,7 +20684,7 @@
       </w:rPr>
     </w:lvl>
   </w:abstractNum>
-  <w:abstractNum w:abstractNumId="6" w15:restartNumberingAfterBreak="0">
+  <w:abstractNum w:abstractNumId="7" w15:restartNumberingAfterBreak="0">
     <w:nsid w:val="3AB32618"/>
     <w:multiLevelType w:val="hybridMultilevel"/>
     <w:tmpl w:val="59CA2990"/>
@@ -20118,7 +20797,7 @@
       </w:rPr>
     </w:lvl>
   </w:abstractNum>
-  <w:abstractNum w:abstractNumId="7" w15:restartNumberingAfterBreak="0">
+  <w:abstractNum w:abstractNumId="8" w15:restartNumberingAfterBreak="0">
     <w:nsid w:val="41F05E20"/>
     <w:multiLevelType w:val="hybridMultilevel"/>
     <w:tmpl w:val="8C7E68EE"/>
@@ -20231,7 +20910,7 @@
       </w:rPr>
     </w:lvl>
   </w:abstractNum>
-  <w:abstractNum w:abstractNumId="8" w15:restartNumberingAfterBreak="0">
+  <w:abstractNum w:abstractNumId="9" w15:restartNumberingAfterBreak="0">
     <w:nsid w:val="54091F6C"/>
     <w:multiLevelType w:val="hybridMultilevel"/>
     <w:tmpl w:val="37729CD4"/>
@@ -20317,7 +20996,7 @@
       </w:pPr>
     </w:lvl>
   </w:abstractNum>
-  <w:abstractNum w:abstractNumId="9" w15:restartNumberingAfterBreak="0">
+  <w:abstractNum w:abstractNumId="10" w15:restartNumberingAfterBreak="0">
     <w:nsid w:val="60C8113B"/>
     <w:multiLevelType w:val="multilevel"/>
     <w:tmpl w:val="7EF2947A"/>
@@ -20466,7 +21145,7 @@
       </w:rPr>
     </w:lvl>
   </w:abstractNum>
-  <w:abstractNum w:abstractNumId="10" w15:restartNumberingAfterBreak="0">
+  <w:abstractNum w:abstractNumId="11" w15:restartNumberingAfterBreak="0">
     <w:nsid w:val="66A045F4"/>
     <w:multiLevelType w:val="hybridMultilevel"/>
     <w:tmpl w:val="C5FA87C8"/>
@@ -20555,7 +21234,7 @@
       </w:pPr>
     </w:lvl>
   </w:abstractNum>
-  <w:abstractNum w:abstractNumId="11" w15:restartNumberingAfterBreak="0">
+  <w:abstractNum w:abstractNumId="12" w15:restartNumberingAfterBreak="0">
     <w:nsid w:val="6CA55485"/>
     <w:multiLevelType w:val="hybridMultilevel"/>
     <w:tmpl w:val="C5FA87C8"/>
@@ -20644,7 +21323,7 @@
       </w:pPr>
     </w:lvl>
   </w:abstractNum>
-  <w:abstractNum w:abstractNumId="12" w15:restartNumberingAfterBreak="0">
+  <w:abstractNum w:abstractNumId="13" w15:restartNumberingAfterBreak="0">
     <w:nsid w:val="6E9F1506"/>
     <w:multiLevelType w:val="hybridMultilevel"/>
     <w:tmpl w:val="C088DDB2"/>
@@ -20733,7 +21412,7 @@
       </w:pPr>
     </w:lvl>
   </w:abstractNum>
-  <w:abstractNum w:abstractNumId="13" w15:restartNumberingAfterBreak="0">
+  <w:abstractNum w:abstractNumId="14" w15:restartNumberingAfterBreak="0">
     <w:nsid w:val="74BE6F99"/>
     <w:multiLevelType w:val="hybridMultilevel"/>
     <w:tmpl w:val="3E1075F2"/>
@@ -20846,7 +21525,7 @@
       </w:rPr>
     </w:lvl>
   </w:abstractNum>
-  <w:abstractNum w:abstractNumId="14" w15:restartNumberingAfterBreak="0">
+  <w:abstractNum w:abstractNumId="15" w15:restartNumberingAfterBreak="0">
     <w:nsid w:val="7A98760A"/>
     <w:multiLevelType w:val="hybridMultilevel"/>
     <w:tmpl w:val="C30AE510"/>
@@ -20960,49 +21639,52 @@
     </w:lvl>
   </w:abstractNum>
   <w:num w:numId="1" w16cid:durableId="1560088947">
+    <w:abstractNumId w:val="13"/>
+  </w:num>
+  <w:num w:numId="2" w16cid:durableId="72168522">
+    <w:abstractNumId w:val="4"/>
+  </w:num>
+  <w:num w:numId="3" w16cid:durableId="1774131421">
+    <w:abstractNumId w:val="15"/>
+  </w:num>
+  <w:num w:numId="4" w16cid:durableId="870918678">
+    <w:abstractNumId w:val="11"/>
+  </w:num>
+  <w:num w:numId="5" w16cid:durableId="1715541446">
     <w:abstractNumId w:val="12"/>
   </w:num>
-  <w:num w:numId="2" w16cid:durableId="72168522">
-    <w:abstractNumId w:val="3"/>
-  </w:num>
-  <w:num w:numId="3" w16cid:durableId="1774131421">
-    <w:abstractNumId w:val="14"/>
-  </w:num>
-  <w:num w:numId="4" w16cid:durableId="870918678">
-    <w:abstractNumId w:val="10"/>
-  </w:num>
-  <w:num w:numId="5" w16cid:durableId="1715541446">
-    <w:abstractNumId w:val="11"/>
-  </w:num>
   <w:num w:numId="6" w16cid:durableId="1420784439">
-    <w:abstractNumId w:val="4"/>
+    <w:abstractNumId w:val="5"/>
   </w:num>
   <w:num w:numId="7" w16cid:durableId="1279215294">
-    <w:abstractNumId w:val="6"/>
+    <w:abstractNumId w:val="7"/>
   </w:num>
   <w:num w:numId="8" w16cid:durableId="2057318431">
-    <w:abstractNumId w:val="8"/>
+    <w:abstractNumId w:val="9"/>
   </w:num>
   <w:num w:numId="9" w16cid:durableId="221331082">
     <w:abstractNumId w:val="1"/>
   </w:num>
   <w:num w:numId="10" w16cid:durableId="300814174">
-    <w:abstractNumId w:val="7"/>
+    <w:abstractNumId w:val="8"/>
   </w:num>
   <w:num w:numId="11" w16cid:durableId="1305112904">
-    <w:abstractNumId w:val="9"/>
+    <w:abstractNumId w:val="10"/>
   </w:num>
   <w:num w:numId="12" w16cid:durableId="19209770">
-    <w:abstractNumId w:val="13"/>
+    <w:abstractNumId w:val="14"/>
   </w:num>
   <w:num w:numId="13" w16cid:durableId="1224293905">
-    <w:abstractNumId w:val="5"/>
+    <w:abstractNumId w:val="6"/>
   </w:num>
   <w:num w:numId="14" w16cid:durableId="884947237">
-    <w:abstractNumId w:val="2"/>
+    <w:abstractNumId w:val="3"/>
   </w:num>
   <w:num w:numId="15" w16cid:durableId="576131389">
     <w:abstractNumId w:val="0"/>
+  </w:num>
+  <w:num w:numId="16" w16cid:durableId="2059626480">
+    <w:abstractNumId w:val="2"/>
   </w:num>
 </w:numbering>
 </file>

</xml_diff>

<commit_message>
Added Question68 and Question69 for Codesignal SWE
</commit_message>
<xml_diff>
--- a/src/main/resources/capitalone/codesignal/swe/CodeSignal_Questions_SWE.docx
+++ b/src/main/resources/capitalone/codesignal/swe/CodeSignal_Questions_SWE.docx
@@ -19852,6 +19852,1024 @@
     <w:p>
       <w:pPr>
         <w:pStyle w:val="ListParagraph"/>
+        <w:numPr>
+          <w:ilvl w:val="0"/>
+          <w:numId w:val="1"/>
+        </w:numPr>
+        <w:rPr>
+          <w:rFonts w:eastAsiaTheme="minorEastAsia"/>
+        </w:rPr>
+      </w:pPr>
+      <w:r>
+        <w:rPr>
+          <w:rFonts w:eastAsiaTheme="minorEastAsia"/>
+        </w:rPr>
+        <w:lastRenderedPageBreak/>
+        <w:t xml:space="preserve">Given an infinite integer number line, you would like to build some blocks and obstacles on it. Specifically, you </w:t>
+      </w:r>
+      <w:proofErr w:type="gramStart"/>
+      <w:r>
+        <w:rPr>
+          <w:rFonts w:eastAsiaTheme="minorEastAsia"/>
+        </w:rPr>
+        <w:t>have to</w:t>
+      </w:r>
+      <w:proofErr w:type="gramEnd"/>
+      <w:r>
+        <w:rPr>
+          <w:rFonts w:eastAsiaTheme="minorEastAsia"/>
+        </w:rPr>
+        <w:t xml:space="preserve"> implement code that supports two types of operations:</w:t>
+      </w:r>
+    </w:p>
+    <w:p>
+      <w:pPr>
+        <w:pStyle w:val="ListParagraph"/>
+        <w:numPr>
+          <w:ilvl w:val="0"/>
+          <w:numId w:val="18"/>
+        </w:numPr>
+        <w:rPr>
+          <w:rFonts w:eastAsiaTheme="minorEastAsia"/>
+        </w:rPr>
+      </w:pPr>
+      <w:r>
+        <w:rPr>
+          <w:rFonts w:eastAsiaTheme="minorEastAsia"/>
+        </w:rPr>
+        <w:t>[1, x] - Builds an obstacle at coordinate x along the number line.</w:t>
+      </w:r>
+    </w:p>
+    <w:p>
+      <w:pPr>
+        <w:pStyle w:val="ListParagraph"/>
+        <w:numPr>
+          <w:ilvl w:val="1"/>
+          <w:numId w:val="18"/>
+        </w:numPr>
+        <w:rPr>
+          <w:rFonts w:eastAsiaTheme="minorEastAsia"/>
+        </w:rPr>
+      </w:pPr>
+      <w:r>
+        <w:rPr>
+          <w:rFonts w:eastAsiaTheme="minorEastAsia"/>
+        </w:rPr>
+        <w:t>It is guaranteed that coordinate x does not contain any obstacles when the operation is performed.</w:t>
+      </w:r>
+    </w:p>
+    <w:p>
+      <w:pPr>
+        <w:pStyle w:val="ListParagraph"/>
+        <w:numPr>
+          <w:ilvl w:val="0"/>
+          <w:numId w:val="18"/>
+        </w:numPr>
+        <w:rPr>
+          <w:rFonts w:eastAsiaTheme="minorEastAsia"/>
+        </w:rPr>
+      </w:pPr>
+      <w:r>
+        <w:rPr>
+          <w:rFonts w:eastAsiaTheme="minorEastAsia"/>
+        </w:rPr>
+        <w:t>[2, x, size] - Checks whether it's possible to build a block centered on x and extending size - 1 in each direction.</w:t>
+      </w:r>
+    </w:p>
+    <w:p>
+      <w:pPr>
+        <w:pStyle w:val="ListParagraph"/>
+        <w:numPr>
+          <w:ilvl w:val="1"/>
+          <w:numId w:val="18"/>
+        </w:numPr>
+        <w:rPr>
+          <w:rFonts w:eastAsiaTheme="minorEastAsia"/>
+        </w:rPr>
+      </w:pPr>
+      <w:r>
+        <w:rPr>
+          <w:rFonts w:eastAsiaTheme="minorEastAsia"/>
+        </w:rPr>
+        <w:t>For example, for size = 3 and x = 0, it will check -2 through 2 on the number line for obstacles.</w:t>
+      </w:r>
+    </w:p>
+    <w:p>
+      <w:pPr>
+        <w:pStyle w:val="ListParagraph"/>
+        <w:numPr>
+          <w:ilvl w:val="1"/>
+          <w:numId w:val="18"/>
+        </w:numPr>
+        <w:rPr>
+          <w:rFonts w:eastAsiaTheme="minorEastAsia"/>
+        </w:rPr>
+      </w:pPr>
+      <w:r>
+        <w:rPr>
+          <w:rFonts w:eastAsiaTheme="minorEastAsia"/>
+        </w:rPr>
+        <w:t>Produces "1" if it is possible (i.e., no obstacles in the specified range), otherwise produces "0".</w:t>
+      </w:r>
+    </w:p>
+    <w:p>
+      <w:pPr>
+        <w:pStyle w:val="ListParagraph"/>
+        <w:numPr>
+          <w:ilvl w:val="1"/>
+          <w:numId w:val="18"/>
+        </w:numPr>
+        <w:rPr>
+          <w:rFonts w:eastAsiaTheme="minorEastAsia"/>
+        </w:rPr>
+      </w:pPr>
+      <w:r>
+        <w:rPr>
+          <w:rFonts w:eastAsiaTheme="minorEastAsia"/>
+        </w:rPr>
+        <w:t>This operation does not actually build the block, it only checks whether a block can be built.</w:t>
+      </w:r>
+    </w:p>
+    <w:p>
+      <w:pPr>
+        <w:rPr>
+          <w:rFonts w:eastAsiaTheme="minorEastAsia"/>
+        </w:rPr>
+      </w:pPr>
+    </w:p>
+    <w:p>
+      <w:pPr>
+        <w:ind w:left="720"/>
+        <w:rPr>
+          <w:rFonts w:eastAsiaTheme="minorEastAsia"/>
+        </w:rPr>
+      </w:pPr>
+      <w:r>
+        <w:rPr>
+          <w:rFonts w:eastAsiaTheme="minorEastAsia"/>
+        </w:rPr>
+        <w:t>Example:</w:t>
+      </w:r>
+    </w:p>
+    <w:p>
+      <w:pPr>
+        <w:ind w:left="720"/>
+        <w:rPr>
+          <w:rFonts w:eastAsiaTheme="minorEastAsia"/>
+        </w:rPr>
+      </w:pPr>
+    </w:p>
+    <w:p>
+      <w:pPr>
+        <w:ind w:left="720"/>
+        <w:rPr>
+          <w:rFonts w:eastAsiaTheme="minorEastAsia"/>
+        </w:rPr>
+      </w:pPr>
+      <w:r>
+        <w:rPr>
+          <w:rFonts w:eastAsiaTheme="minorEastAsia"/>
+        </w:rPr>
+        <w:t>operations = [</w:t>
+      </w:r>
+    </w:p>
+    <w:p>
+      <w:pPr>
+        <w:ind w:left="720"/>
+        <w:rPr>
+          <w:rFonts w:eastAsiaTheme="minorEastAsia"/>
+        </w:rPr>
+      </w:pPr>
+      <w:r>
+        <w:rPr>
+          <w:rFonts w:eastAsiaTheme="minorEastAsia"/>
+        </w:rPr>
+        <w:t xml:space="preserve">    [1, 2],</w:t>
+      </w:r>
+    </w:p>
+    <w:p>
+      <w:pPr>
+        <w:ind w:left="720"/>
+        <w:rPr>
+          <w:rFonts w:eastAsiaTheme="minorEastAsia"/>
+        </w:rPr>
+      </w:pPr>
+      <w:r>
+        <w:rPr>
+          <w:rFonts w:eastAsiaTheme="minorEastAsia"/>
+        </w:rPr>
+        <w:t xml:space="preserve">    [1, 6],</w:t>
+      </w:r>
+    </w:p>
+    <w:p>
+      <w:pPr>
+        <w:ind w:left="720"/>
+        <w:rPr>
+          <w:rFonts w:eastAsiaTheme="minorEastAsia"/>
+        </w:rPr>
+      </w:pPr>
+      <w:r>
+        <w:rPr>
+          <w:rFonts w:eastAsiaTheme="minorEastAsia"/>
+        </w:rPr>
+        <w:t xml:space="preserve">    [2, 4, 2],</w:t>
+      </w:r>
+    </w:p>
+    <w:p>
+      <w:pPr>
+        <w:ind w:left="720"/>
+        <w:rPr>
+          <w:rFonts w:eastAsiaTheme="minorEastAsia"/>
+        </w:rPr>
+      </w:pPr>
+      <w:r>
+        <w:rPr>
+          <w:rFonts w:eastAsiaTheme="minorEastAsia"/>
+        </w:rPr>
+        <w:t xml:space="preserve">    [2, 5, 2],</w:t>
+      </w:r>
+    </w:p>
+    <w:p>
+      <w:pPr>
+        <w:ind w:left="720"/>
+        <w:rPr>
+          <w:rFonts w:eastAsiaTheme="minorEastAsia"/>
+        </w:rPr>
+      </w:pPr>
+      <w:r>
+        <w:rPr>
+          <w:rFonts w:eastAsiaTheme="minorEastAsia"/>
+        </w:rPr>
+        <w:t xml:space="preserve">    [2, 1, 1],</w:t>
+      </w:r>
+    </w:p>
+    <w:p>
+      <w:pPr>
+        <w:ind w:left="720"/>
+        <w:rPr>
+          <w:rFonts w:eastAsiaTheme="minorEastAsia"/>
+        </w:rPr>
+      </w:pPr>
+      <w:r>
+        <w:rPr>
+          <w:rFonts w:eastAsiaTheme="minorEastAsia"/>
+        </w:rPr>
+        <w:t xml:space="preserve">    [2, 1, 2]</w:t>
+      </w:r>
+    </w:p>
+    <w:p>
+      <w:pPr>
+        <w:ind w:left="720"/>
+        <w:rPr>
+          <w:rFonts w:eastAsiaTheme="minorEastAsia"/>
+        </w:rPr>
+      </w:pPr>
+      <w:r>
+        <w:rPr>
+          <w:rFonts w:eastAsiaTheme="minorEastAsia"/>
+        </w:rPr>
+        <w:t>]</w:t>
+      </w:r>
+    </w:p>
+    <w:p>
+      <w:pPr>
+        <w:ind w:left="720"/>
+        <w:rPr>
+          <w:rFonts w:eastAsiaTheme="minorEastAsia"/>
+        </w:rPr>
+      </w:pPr>
+    </w:p>
+    <w:p>
+      <w:pPr>
+        <w:ind w:left="720"/>
+        <w:rPr>
+          <w:rFonts w:eastAsiaTheme="minorEastAsia"/>
+          <w:i/>
+          <w:iCs/>
+        </w:rPr>
+      </w:pPr>
+      <w:r>
+        <w:rPr>
+          <w:rFonts w:eastAsiaTheme="minorEastAsia"/>
+        </w:rPr>
+        <w:t xml:space="preserve">Then </w:t>
+      </w:r>
+      <w:r>
+        <w:rPr>
+          <w:rFonts w:eastAsiaTheme="minorEastAsia"/>
+          <w:i/>
+          <w:iCs/>
+        </w:rPr>
+        <w:t>solution(operations) = “1010”</w:t>
+      </w:r>
+    </w:p>
+    <w:p>
+      <w:pPr>
+        <w:ind w:left="720"/>
+        <w:rPr>
+          <w:rFonts w:eastAsiaTheme="minorEastAsia"/>
+          <w:i/>
+          <w:iCs/>
+        </w:rPr>
+      </w:pPr>
+    </w:p>
+    <w:p>
+      <w:pPr>
+        <w:ind w:left="720"/>
+        <w:rPr>
+          <w:rFonts w:eastAsiaTheme="minorEastAsia"/>
+        </w:rPr>
+      </w:pPr>
+      <w:r>
+        <w:rPr>
+          <w:rFonts w:eastAsiaTheme="minorEastAsia"/>
+          <w:highlight w:val="yellow"/>
+        </w:rPr>
+        <w:t xml:space="preserve">Note – this problem is </w:t>
+      </w:r>
+      <w:proofErr w:type="gramStart"/>
+      <w:r>
+        <w:rPr>
+          <w:rFonts w:eastAsiaTheme="minorEastAsia"/>
+          <w:highlight w:val="yellow"/>
+        </w:rPr>
+        <w:t>similar to</w:t>
+      </w:r>
+      <w:proofErr w:type="gramEnd"/>
+      <w:r>
+        <w:rPr>
+          <w:rFonts w:eastAsiaTheme="minorEastAsia"/>
+          <w:highlight w:val="yellow"/>
+        </w:rPr>
+        <w:t xml:space="preserve"> Question 15 however the requirements are very slightly modified.</w:t>
+      </w:r>
+    </w:p>
+    <w:p>
+      <w:pPr>
+        <w:ind w:left="720"/>
+        <w:rPr>
+          <w:rFonts w:eastAsiaTheme="minorEastAsia"/>
+        </w:rPr>
+      </w:pPr>
+    </w:p>
+    <w:p>
+      <w:pPr>
+        <w:ind w:left="720"/>
+        <w:rPr>
+          <w:rFonts w:eastAsiaTheme="minorEastAsia"/>
+        </w:rPr>
+      </w:pPr>
+      <w:r>
+        <w:rPr>
+          <w:rFonts w:eastAsiaTheme="minorEastAsia"/>
+        </w:rPr>
+        <w:t>Answer: Question68</w:t>
+      </w:r>
+    </w:p>
+    <w:p>
+      <w:pPr>
+        <w:rPr>
+          <w:rFonts w:eastAsiaTheme="minorEastAsia"/>
+        </w:rPr>
+      </w:pPr>
+    </w:p>
+    <w:p>
+      <w:pPr>
+        <w:pStyle w:val="ListParagraph"/>
+        <w:numPr>
+          <w:ilvl w:val="0"/>
+          <w:numId w:val="1"/>
+        </w:numPr>
+        <w:rPr>
+          <w:rFonts w:eastAsiaTheme="minorEastAsia"/>
+        </w:rPr>
+      </w:pPr>
+      <w:r>
+        <w:rPr>
+          <w:rFonts w:eastAsiaTheme="minorEastAsia"/>
+        </w:rPr>
+        <w:t>Let's define the diagonal neighbors of a given cell as the surrounding cells with precisely one corner touching the corner of the given cell.</w:t>
+      </w:r>
+    </w:p>
+    <w:p>
+      <w:pPr>
+        <w:pStyle w:val="ListParagraph"/>
+        <w:rPr>
+          <w:rFonts w:eastAsiaTheme="minorEastAsia"/>
+        </w:rPr>
+      </w:pPr>
+    </w:p>
+    <w:p>
+      <w:pPr>
+        <w:pStyle w:val="ListParagraph"/>
+        <w:rPr>
+          <w:rFonts w:eastAsiaTheme="minorEastAsia"/>
+        </w:rPr>
+      </w:pPr>
+      <w:r>
+        <w:rPr>
+          <w:rFonts w:eastAsiaTheme="minorEastAsia"/>
+        </w:rPr>
+        <w:t>Given a board of cells containing a bubble of a specific color, your task is to emulate a bubble-popping game.</w:t>
+      </w:r>
+      <w:r>
+        <w:rPr>
+          <w:rFonts w:eastAsiaTheme="minorEastAsia"/>
+        </w:rPr>
+        <w:br/>
+        <w:t>In this game, the player can click a cell every turn to pop bubbles.</w:t>
+      </w:r>
+    </w:p>
+    <w:p>
+      <w:pPr>
+        <w:pStyle w:val="ListParagraph"/>
+        <w:rPr>
+          <w:rFonts w:eastAsiaTheme="minorEastAsia"/>
+        </w:rPr>
+      </w:pPr>
+    </w:p>
+    <w:p>
+      <w:pPr>
+        <w:pStyle w:val="ListParagraph"/>
+        <w:rPr>
+          <w:rFonts w:eastAsiaTheme="minorEastAsia"/>
+        </w:rPr>
+      </w:pPr>
+      <w:r>
+        <w:rPr>
+          <w:rFonts w:eastAsiaTheme="minorEastAsia"/>
+        </w:rPr>
+        <w:t>Game Mechanics:</w:t>
+      </w:r>
+    </w:p>
+    <w:p>
+      <w:pPr>
+        <w:pStyle w:val="ListParagraph"/>
+        <w:numPr>
+          <w:ilvl w:val="1"/>
+          <w:numId w:val="1"/>
+        </w:numPr>
+        <w:rPr>
+          <w:rFonts w:eastAsiaTheme="minorEastAsia"/>
+        </w:rPr>
+      </w:pPr>
+      <w:r>
+        <w:rPr>
+          <w:rFonts w:eastAsiaTheme="minorEastAsia"/>
+        </w:rPr>
+        <w:t>The bubble in the clicked cell and bubbles of the same color among its diagonal neighbors are "popped" (removed), resulting in empty cells.</w:t>
+      </w:r>
+    </w:p>
+    <w:p>
+      <w:pPr>
+        <w:pStyle w:val="ListParagraph"/>
+        <w:numPr>
+          <w:ilvl w:val="1"/>
+          <w:numId w:val="1"/>
+        </w:numPr>
+        <w:rPr>
+          <w:rFonts w:eastAsiaTheme="minorEastAsia"/>
+        </w:rPr>
+      </w:pPr>
+      <w:r>
+        <w:rPr>
+          <w:rFonts w:eastAsiaTheme="minorEastAsia"/>
+        </w:rPr>
+        <w:t xml:space="preserve">After bubbles are removed, remaining bubbles </w:t>
+      </w:r>
+      <w:r>
+        <w:rPr>
+          <w:rFonts w:eastAsiaTheme="minorEastAsia"/>
+        </w:rPr>
+        <w:t>fall</w:t>
+      </w:r>
+      <w:r>
+        <w:rPr>
+          <w:rFonts w:eastAsiaTheme="minorEastAsia"/>
+        </w:rPr>
+        <w:t xml:space="preserve"> to fill empty cells.</w:t>
+      </w:r>
+    </w:p>
+    <w:p>
+      <w:pPr>
+        <w:pStyle w:val="ListParagraph"/>
+        <w:numPr>
+          <w:ilvl w:val="1"/>
+          <w:numId w:val="1"/>
+        </w:numPr>
+        <w:rPr>
+          <w:rFonts w:eastAsiaTheme="minorEastAsia"/>
+        </w:rPr>
+      </w:pPr>
+      <w:r>
+        <w:rPr>
+          <w:rFonts w:eastAsiaTheme="minorEastAsia"/>
+        </w:rPr>
+        <w:t>If the clicked cell is empty, nothing happens.</w:t>
+      </w:r>
+    </w:p>
+    <w:p>
+      <w:pPr>
+        <w:rPr>
+          <w:rFonts w:eastAsiaTheme="minorEastAsia"/>
+        </w:rPr>
+      </w:pPr>
+    </w:p>
+    <w:p>
+      <w:pPr>
+        <w:ind w:left="720"/>
+        <w:rPr>
+          <w:rFonts w:eastAsiaTheme="minorEastAsia"/>
+        </w:rPr>
+      </w:pPr>
+      <w:r>
+        <w:rPr>
+          <w:rFonts w:eastAsiaTheme="minorEastAsia"/>
+        </w:rPr>
+        <w:t>The input consists of two arrays:</w:t>
+      </w:r>
+    </w:p>
+    <w:p>
+      <w:pPr>
+        <w:numPr>
+          <w:ilvl w:val="0"/>
+          <w:numId w:val="20"/>
+        </w:numPr>
+        <w:tabs>
+          <w:tab w:val="num" w:pos="720"/>
+        </w:tabs>
+        <w:rPr>
+          <w:rFonts w:eastAsiaTheme="minorEastAsia"/>
+        </w:rPr>
+      </w:pPr>
+      <w:r>
+        <w:rPr>
+          <w:rFonts w:eastAsiaTheme="minorEastAsia"/>
+        </w:rPr>
+        <w:lastRenderedPageBreak/>
+        <w:t>bubbles → A multidimensional array of integers representing cells containing different colored bubbles.</w:t>
+      </w:r>
+    </w:p>
+    <w:p>
+      <w:pPr>
+        <w:numPr>
+          <w:ilvl w:val="0"/>
+          <w:numId w:val="20"/>
+        </w:numPr>
+        <w:rPr>
+          <w:rFonts w:eastAsiaTheme="minorEastAsia"/>
+        </w:rPr>
+      </w:pPr>
+      <w:r>
+        <w:rPr>
+          <w:rFonts w:eastAsiaTheme="minorEastAsia"/>
+        </w:rPr>
+        <w:t>operations → A list of 2-element integer arrays representing the row and column the player clicked on.</w:t>
+      </w:r>
+    </w:p>
+    <w:p>
+      <w:pPr>
+        <w:rPr>
+          <w:rFonts w:eastAsiaTheme="minorEastAsia"/>
+        </w:rPr>
+      </w:pPr>
+    </w:p>
+    <w:p>
+      <w:pPr>
+        <w:ind w:left="360" w:firstLine="360"/>
+        <w:rPr>
+          <w:rFonts w:eastAsiaTheme="minorEastAsia"/>
+        </w:rPr>
+      </w:pPr>
+      <w:r>
+        <w:rPr>
+          <w:rFonts w:eastAsiaTheme="minorEastAsia"/>
+        </w:rPr>
+        <w:t>Output:</w:t>
+      </w:r>
+    </w:p>
+    <w:p>
+      <w:pPr>
+        <w:ind w:left="360"/>
+        <w:rPr>
+          <w:rFonts w:eastAsiaTheme="minorEastAsia"/>
+        </w:rPr>
+      </w:pPr>
+    </w:p>
+    <w:p>
+      <w:pPr>
+        <w:ind w:left="720"/>
+        <w:rPr>
+          <w:rFonts w:eastAsiaTheme="minorEastAsia"/>
+        </w:rPr>
+      </w:pPr>
+      <w:r>
+        <w:rPr>
+          <w:rFonts w:eastAsiaTheme="minorEastAsia"/>
+        </w:rPr>
+        <w:t>Return the final state of the game board after all operations are processed.</w:t>
+      </w:r>
+      <w:r>
+        <w:rPr>
+          <w:rFonts w:eastAsiaTheme="minorEastAsia"/>
+        </w:rPr>
+        <w:br/>
+        <w:t xml:space="preserve">The output should be a multidimensional array with the same size as </w:t>
+      </w:r>
+      <w:proofErr w:type="gramStart"/>
+      <w:r>
+        <w:rPr>
+          <w:rFonts w:eastAsiaTheme="minorEastAsia"/>
+        </w:rPr>
+        <w:t>bubbles, but</w:t>
+      </w:r>
+      <w:proofErr w:type="gramEnd"/>
+      <w:r>
+        <w:rPr>
+          <w:rFonts w:eastAsiaTheme="minorEastAsia"/>
+        </w:rPr>
+        <w:t xml:space="preserve"> replace all empty cells with 0.</w:t>
+      </w:r>
+    </w:p>
+    <w:p>
+      <w:pPr>
+        <w:ind w:left="720"/>
+        <w:rPr>
+          <w:rFonts w:eastAsiaTheme="minorEastAsia"/>
+        </w:rPr>
+      </w:pPr>
+    </w:p>
+    <w:p>
+      <w:pPr>
+        <w:ind w:left="720"/>
+        <w:rPr>
+          <w:rFonts w:eastAsiaTheme="minorEastAsia"/>
+        </w:rPr>
+      </w:pPr>
+      <w:r>
+        <w:rPr>
+          <w:rFonts w:eastAsiaTheme="minorEastAsia"/>
+          <w:b/>
+          <w:bCs/>
+        </w:rPr>
+        <w:t>Example:</w:t>
+      </w:r>
+    </w:p>
+    <w:p>
+      <w:pPr>
+        <w:ind w:left="720"/>
+        <w:rPr>
+          <w:rFonts w:eastAsiaTheme="minorEastAsia"/>
+        </w:rPr>
+      </w:pPr>
+    </w:p>
+    <w:p>
+      <w:pPr>
+        <w:ind w:left="720"/>
+        <w:rPr>
+          <w:rFonts w:eastAsiaTheme="minorEastAsia"/>
+        </w:rPr>
+      </w:pPr>
+      <w:r>
+        <w:rPr>
+          <w:rFonts w:eastAsiaTheme="minorEastAsia"/>
+        </w:rPr>
+        <w:t>bubbles = [</w:t>
+      </w:r>
+    </w:p>
+    <w:p>
+      <w:pPr>
+        <w:ind w:left="720"/>
+        <w:rPr>
+          <w:rFonts w:eastAsiaTheme="minorEastAsia"/>
+        </w:rPr>
+      </w:pPr>
+      <w:r>
+        <w:rPr>
+          <w:rFonts w:eastAsiaTheme="minorEastAsia"/>
+        </w:rPr>
+        <w:t xml:space="preserve">    [1, 1, 1, 4, 3],</w:t>
+      </w:r>
+    </w:p>
+    <w:p>
+      <w:pPr>
+        <w:ind w:left="720"/>
+        <w:rPr>
+          <w:rFonts w:eastAsiaTheme="minorEastAsia"/>
+        </w:rPr>
+      </w:pPr>
+      <w:r>
+        <w:rPr>
+          <w:rFonts w:eastAsiaTheme="minorEastAsia"/>
+        </w:rPr>
+        <w:t xml:space="preserve">    [4, 1, 2, 3, 3],</w:t>
+      </w:r>
+    </w:p>
+    <w:p>
+      <w:pPr>
+        <w:ind w:left="720"/>
+        <w:rPr>
+          <w:rFonts w:eastAsiaTheme="minorEastAsia"/>
+        </w:rPr>
+      </w:pPr>
+      <w:r>
+        <w:rPr>
+          <w:rFonts w:eastAsiaTheme="minorEastAsia"/>
+        </w:rPr>
+        <w:t xml:space="preserve">    [1, 5, 1, 1, 2],</w:t>
+      </w:r>
+    </w:p>
+    <w:p>
+      <w:pPr>
+        <w:ind w:left="720"/>
+        <w:rPr>
+          <w:rFonts w:eastAsiaTheme="minorEastAsia"/>
+        </w:rPr>
+      </w:pPr>
+      <w:r>
+        <w:rPr>
+          <w:rFonts w:eastAsiaTheme="minorEastAsia"/>
+        </w:rPr>
+        <w:t xml:space="preserve">    [4, 3, 2, 2, 4]</w:t>
+      </w:r>
+    </w:p>
+    <w:p>
+      <w:pPr>
+        <w:ind w:left="720"/>
+        <w:rPr>
+          <w:rFonts w:eastAsiaTheme="minorEastAsia"/>
+        </w:rPr>
+      </w:pPr>
+      <w:r>
+        <w:rPr>
+          <w:rFonts w:eastAsiaTheme="minorEastAsia"/>
+        </w:rPr>
+        <w:t>]</w:t>
+      </w:r>
+    </w:p>
+    <w:p>
+      <w:pPr>
+        <w:ind w:left="720"/>
+        <w:rPr>
+          <w:rFonts w:eastAsiaTheme="minorEastAsia"/>
+        </w:rPr>
+      </w:pPr>
+    </w:p>
+    <w:p>
+      <w:pPr>
+        <w:ind w:left="720"/>
+        <w:rPr>
+          <w:rFonts w:eastAsiaTheme="minorEastAsia"/>
+        </w:rPr>
+      </w:pPr>
+      <w:r>
+        <w:rPr>
+          <w:rFonts w:eastAsiaTheme="minorEastAsia"/>
+        </w:rPr>
+        <w:t>operations = [</w:t>
+      </w:r>
+    </w:p>
+    <w:p>
+      <w:pPr>
+        <w:ind w:left="720"/>
+        <w:rPr>
+          <w:rFonts w:eastAsiaTheme="minorEastAsia"/>
+        </w:rPr>
+      </w:pPr>
+      <w:r>
+        <w:rPr>
+          <w:rFonts w:eastAsiaTheme="minorEastAsia"/>
+        </w:rPr>
+        <w:t xml:space="preserve">    [1, 1],</w:t>
+      </w:r>
+    </w:p>
+    <w:p>
+      <w:pPr>
+        <w:ind w:left="720"/>
+        <w:rPr>
+          <w:rFonts w:eastAsiaTheme="minorEastAsia"/>
+        </w:rPr>
+      </w:pPr>
+      <w:r>
+        <w:rPr>
+          <w:rFonts w:eastAsiaTheme="minorEastAsia"/>
+        </w:rPr>
+        <w:t xml:space="preserve">    [3, 3],</w:t>
+      </w:r>
+    </w:p>
+    <w:p>
+      <w:pPr>
+        <w:ind w:left="720"/>
+        <w:rPr>
+          <w:rFonts w:eastAsiaTheme="minorEastAsia"/>
+        </w:rPr>
+      </w:pPr>
+      <w:r>
+        <w:rPr>
+          <w:rFonts w:eastAsiaTheme="minorEastAsia"/>
+        </w:rPr>
+        <w:t xml:space="preserve">    [2, 2],</w:t>
+      </w:r>
+    </w:p>
+    <w:p>
+      <w:pPr>
+        <w:ind w:left="720"/>
+        <w:rPr>
+          <w:rFonts w:eastAsiaTheme="minorEastAsia"/>
+        </w:rPr>
+      </w:pPr>
+      <w:r>
+        <w:rPr>
+          <w:rFonts w:eastAsiaTheme="minorEastAsia"/>
+        </w:rPr>
+        <w:t xml:space="preserve">    [3, 0]</w:t>
+      </w:r>
+    </w:p>
+    <w:p>
+      <w:pPr>
+        <w:ind w:left="720"/>
+        <w:rPr>
+          <w:rFonts w:eastAsiaTheme="minorEastAsia"/>
+        </w:rPr>
+      </w:pPr>
+      <w:r>
+        <w:rPr>
+          <w:rFonts w:eastAsiaTheme="minorEastAsia"/>
+        </w:rPr>
+        <w:t>]</w:t>
+      </w:r>
+    </w:p>
+    <w:p>
+      <w:pPr>
+        <w:ind w:left="720"/>
+        <w:rPr>
+          <w:rFonts w:eastAsiaTheme="minorEastAsia"/>
+        </w:rPr>
+      </w:pPr>
+    </w:p>
+    <w:p>
+      <w:pPr>
+        <w:ind w:left="720"/>
+        <w:rPr>
+          <w:rFonts w:eastAsiaTheme="minorEastAsia"/>
+          <w:i/>
+          <w:iCs/>
+        </w:rPr>
+      </w:pPr>
+      <w:proofErr w:type="gramStart"/>
+      <w:r>
+        <w:rPr>
+          <w:rFonts w:eastAsiaTheme="minorEastAsia"/>
+          <w:i/>
+          <w:iCs/>
+        </w:rPr>
+        <w:t>solution(</w:t>
+      </w:r>
+      <w:proofErr w:type="gramEnd"/>
+      <w:r>
+        <w:rPr>
+          <w:rFonts w:eastAsiaTheme="minorEastAsia"/>
+          <w:i/>
+          <w:iCs/>
+        </w:rPr>
+        <w:t>bubbles, operations) = [</w:t>
+      </w:r>
+    </w:p>
+    <w:p>
+      <w:pPr>
+        <w:ind w:left="720"/>
+        <w:rPr>
+          <w:rFonts w:eastAsiaTheme="minorEastAsia"/>
+          <w:i/>
+          <w:iCs/>
+        </w:rPr>
+      </w:pPr>
+      <w:r>
+        <w:rPr>
+          <w:rFonts w:eastAsiaTheme="minorEastAsia"/>
+          <w:i/>
+          <w:iCs/>
+        </w:rPr>
+        <w:t xml:space="preserve">    [0, 0, 0, 0, 0],</w:t>
+      </w:r>
+    </w:p>
+    <w:p>
+      <w:pPr>
+        <w:ind w:left="720"/>
+        <w:rPr>
+          <w:rFonts w:eastAsiaTheme="minorEastAsia"/>
+          <w:i/>
+          <w:iCs/>
+        </w:rPr>
+      </w:pPr>
+      <w:r>
+        <w:rPr>
+          <w:rFonts w:eastAsiaTheme="minorEastAsia"/>
+          <w:i/>
+          <w:iCs/>
+        </w:rPr>
+        <w:t xml:space="preserve">    [0, 1, 0, 4, 3],</w:t>
+      </w:r>
+    </w:p>
+    <w:p>
+      <w:pPr>
+        <w:ind w:left="720"/>
+        <w:rPr>
+          <w:rFonts w:eastAsiaTheme="minorEastAsia"/>
+          <w:i/>
+          <w:iCs/>
+        </w:rPr>
+      </w:pPr>
+      <w:r>
+        <w:rPr>
+          <w:rFonts w:eastAsiaTheme="minorEastAsia"/>
+          <w:i/>
+          <w:iCs/>
+        </w:rPr>
+        <w:t xml:space="preserve">    [0, 5, 0, 3, 3],</w:t>
+      </w:r>
+    </w:p>
+    <w:p>
+      <w:pPr>
+        <w:ind w:left="720"/>
+        <w:rPr>
+          <w:rFonts w:eastAsiaTheme="minorEastAsia"/>
+          <w:i/>
+          <w:iCs/>
+        </w:rPr>
+      </w:pPr>
+      <w:r>
+        <w:rPr>
+          <w:rFonts w:eastAsiaTheme="minorEastAsia"/>
+          <w:i/>
+          <w:iCs/>
+        </w:rPr>
+        <w:t xml:space="preserve">    [4, 3, 2, 1, 4]</w:t>
+      </w:r>
+    </w:p>
+    <w:p>
+      <w:pPr>
+        <w:ind w:left="720"/>
+        <w:rPr>
+          <w:rFonts w:eastAsiaTheme="minorEastAsia"/>
+          <w:i/>
+          <w:iCs/>
+        </w:rPr>
+      </w:pPr>
+      <w:r>
+        <w:rPr>
+          <w:rFonts w:eastAsiaTheme="minorEastAsia"/>
+          <w:i/>
+          <w:iCs/>
+        </w:rPr>
+        <w:t>]</w:t>
+      </w:r>
+    </w:p>
+    <w:p>
+      <w:pPr>
+        <w:ind w:left="360"/>
+        <w:rPr>
+          <w:rFonts w:eastAsiaTheme="minorEastAsia"/>
+        </w:rPr>
+      </w:pPr>
+    </w:p>
+    <w:p>
+      <w:pPr>
+        <w:ind w:left="720"/>
+        <w:rPr>
+          <w:rFonts w:eastAsiaTheme="minorEastAsia"/>
+        </w:rPr>
+      </w:pPr>
+      <w:r>
+        <w:rPr>
+          <w:rFonts w:eastAsiaTheme="minorEastAsia"/>
+        </w:rPr>
+        <w:t>Answer: Question69</w:t>
+      </w:r>
+    </w:p>
+    <w:p>
+      <w:pPr>
+        <w:ind w:left="720"/>
+        <w:rPr>
+          <w:rFonts w:eastAsiaTheme="minorEastAsia"/>
+        </w:rPr>
+      </w:pPr>
+    </w:p>
+    <w:p>
+      <w:pPr>
+        <w:pStyle w:val="ListParagraph"/>
+        <w:numPr>
+          <w:ilvl w:val="0"/>
+          <w:numId w:val="1"/>
+        </w:numPr>
+        <w:rPr>
+          <w:rFonts w:eastAsiaTheme="minorEastAsia"/>
+        </w:rPr>
+      </w:pPr>
+    </w:p>
+    <w:p>
+      <w:pPr>
+        <w:pStyle w:val="ListParagraph"/>
         <w:rPr>
           <w:rFonts w:eastAsiaTheme="minorEastAsia"/>
         </w:rPr>
@@ -20096,6 +21114,155 @@
     </w:lvl>
   </w:abstractNum>
   <w:abstractNum w:abstractNumId="2" w15:restartNumberingAfterBreak="0">
+    <w:nsid w:val="13C63C00"/>
+    <w:multiLevelType w:val="multilevel"/>
+    <w:tmpl w:val="24E4BCE8"/>
+    <w:lvl w:ilvl="0">
+      <w:start w:val="1"/>
+      <w:numFmt w:val="bullet"/>
+      <w:lvlText w:val=""/>
+      <w:lvlJc w:val="left"/>
+      <w:pPr>
+        <w:tabs>
+          <w:tab w:val="num" w:pos="1440"/>
+        </w:tabs>
+        <w:ind w:left="1440" w:hanging="360"/>
+      </w:pPr>
+      <w:rPr>
+        <w:rFonts w:ascii="Symbol" w:hAnsi="Symbol" w:hint="default"/>
+        <w:sz w:val="20"/>
+      </w:rPr>
+    </w:lvl>
+    <w:lvl w:ilvl="1" w:tentative="1">
+      <w:start w:val="1"/>
+      <w:numFmt w:val="bullet"/>
+      <w:lvlText w:val="o"/>
+      <w:lvlJc w:val="left"/>
+      <w:pPr>
+        <w:tabs>
+          <w:tab w:val="num" w:pos="2160"/>
+        </w:tabs>
+        <w:ind w:left="2160" w:hanging="360"/>
+      </w:pPr>
+      <w:rPr>
+        <w:rFonts w:ascii="Courier New" w:hAnsi="Courier New" w:hint="default"/>
+        <w:sz w:val="20"/>
+      </w:rPr>
+    </w:lvl>
+    <w:lvl w:ilvl="2" w:tentative="1">
+      <w:start w:val="1"/>
+      <w:numFmt w:val="bullet"/>
+      <w:lvlText w:val=""/>
+      <w:lvlJc w:val="left"/>
+      <w:pPr>
+        <w:tabs>
+          <w:tab w:val="num" w:pos="2880"/>
+        </w:tabs>
+        <w:ind w:left="2880" w:hanging="360"/>
+      </w:pPr>
+      <w:rPr>
+        <w:rFonts w:ascii="Wingdings" w:hAnsi="Wingdings" w:hint="default"/>
+        <w:sz w:val="20"/>
+      </w:rPr>
+    </w:lvl>
+    <w:lvl w:ilvl="3" w:tentative="1">
+      <w:start w:val="1"/>
+      <w:numFmt w:val="bullet"/>
+      <w:lvlText w:val=""/>
+      <w:lvlJc w:val="left"/>
+      <w:pPr>
+        <w:tabs>
+          <w:tab w:val="num" w:pos="3600"/>
+        </w:tabs>
+        <w:ind w:left="3600" w:hanging="360"/>
+      </w:pPr>
+      <w:rPr>
+        <w:rFonts w:ascii="Wingdings" w:hAnsi="Wingdings" w:hint="default"/>
+        <w:sz w:val="20"/>
+      </w:rPr>
+    </w:lvl>
+    <w:lvl w:ilvl="4" w:tentative="1">
+      <w:start w:val="1"/>
+      <w:numFmt w:val="bullet"/>
+      <w:lvlText w:val=""/>
+      <w:lvlJc w:val="left"/>
+      <w:pPr>
+        <w:tabs>
+          <w:tab w:val="num" w:pos="4320"/>
+        </w:tabs>
+        <w:ind w:left="4320" w:hanging="360"/>
+      </w:pPr>
+      <w:rPr>
+        <w:rFonts w:ascii="Wingdings" w:hAnsi="Wingdings" w:hint="default"/>
+        <w:sz w:val="20"/>
+      </w:rPr>
+    </w:lvl>
+    <w:lvl w:ilvl="5" w:tentative="1">
+      <w:start w:val="1"/>
+      <w:numFmt w:val="bullet"/>
+      <w:lvlText w:val=""/>
+      <w:lvlJc w:val="left"/>
+      <w:pPr>
+        <w:tabs>
+          <w:tab w:val="num" w:pos="5040"/>
+        </w:tabs>
+        <w:ind w:left="5040" w:hanging="360"/>
+      </w:pPr>
+      <w:rPr>
+        <w:rFonts w:ascii="Wingdings" w:hAnsi="Wingdings" w:hint="default"/>
+        <w:sz w:val="20"/>
+      </w:rPr>
+    </w:lvl>
+    <w:lvl w:ilvl="6" w:tentative="1">
+      <w:start w:val="1"/>
+      <w:numFmt w:val="bullet"/>
+      <w:lvlText w:val=""/>
+      <w:lvlJc w:val="left"/>
+      <w:pPr>
+        <w:tabs>
+          <w:tab w:val="num" w:pos="5760"/>
+        </w:tabs>
+        <w:ind w:left="5760" w:hanging="360"/>
+      </w:pPr>
+      <w:rPr>
+        <w:rFonts w:ascii="Wingdings" w:hAnsi="Wingdings" w:hint="default"/>
+        <w:sz w:val="20"/>
+      </w:rPr>
+    </w:lvl>
+    <w:lvl w:ilvl="7" w:tentative="1">
+      <w:start w:val="1"/>
+      <w:numFmt w:val="bullet"/>
+      <w:lvlText w:val=""/>
+      <w:lvlJc w:val="left"/>
+      <w:pPr>
+        <w:tabs>
+          <w:tab w:val="num" w:pos="6480"/>
+        </w:tabs>
+        <w:ind w:left="6480" w:hanging="360"/>
+      </w:pPr>
+      <w:rPr>
+        <w:rFonts w:ascii="Wingdings" w:hAnsi="Wingdings" w:hint="default"/>
+        <w:sz w:val="20"/>
+      </w:rPr>
+    </w:lvl>
+    <w:lvl w:ilvl="8" w:tentative="1">
+      <w:start w:val="1"/>
+      <w:numFmt w:val="bullet"/>
+      <w:lvlText w:val=""/>
+      <w:lvlJc w:val="left"/>
+      <w:pPr>
+        <w:tabs>
+          <w:tab w:val="num" w:pos="7200"/>
+        </w:tabs>
+        <w:ind w:left="7200" w:hanging="360"/>
+      </w:pPr>
+      <w:rPr>
+        <w:rFonts w:ascii="Wingdings" w:hAnsi="Wingdings" w:hint="default"/>
+        <w:sz w:val="20"/>
+      </w:rPr>
+    </w:lvl>
+  </w:abstractNum>
+  <w:abstractNum w:abstractNumId="3" w15:restartNumberingAfterBreak="0">
     <w:nsid w:val="27FE7F02"/>
     <w:multiLevelType w:val="hybridMultilevel"/>
     <w:tmpl w:val="9CDAD668"/>
@@ -20208,7 +21375,7 @@
       </w:rPr>
     </w:lvl>
   </w:abstractNum>
-  <w:abstractNum w:abstractNumId="3" w15:restartNumberingAfterBreak="0">
+  <w:abstractNum w:abstractNumId="4" w15:restartNumberingAfterBreak="0">
     <w:nsid w:val="29A60487"/>
     <w:multiLevelType w:val="multilevel"/>
     <w:tmpl w:val="A00C6F82"/>
@@ -20357,7 +21524,7 @@
       </w:rPr>
     </w:lvl>
   </w:abstractNum>
-  <w:abstractNum w:abstractNumId="4" w15:restartNumberingAfterBreak="0">
+  <w:abstractNum w:abstractNumId="5" w15:restartNumberingAfterBreak="0">
     <w:nsid w:val="2E830469"/>
     <w:multiLevelType w:val="hybridMultilevel"/>
     <w:tmpl w:val="C5FA87C8"/>
@@ -20446,7 +21613,7 @@
       </w:pPr>
     </w:lvl>
   </w:abstractNum>
-  <w:abstractNum w:abstractNumId="5" w15:restartNumberingAfterBreak="0">
+  <w:abstractNum w:abstractNumId="6" w15:restartNumberingAfterBreak="0">
     <w:nsid w:val="2F2B3A14"/>
     <w:multiLevelType w:val="hybridMultilevel"/>
     <w:tmpl w:val="C5FA87C8"/>
@@ -20535,7 +21702,7 @@
       </w:pPr>
     </w:lvl>
   </w:abstractNum>
-  <w:abstractNum w:abstractNumId="6" w15:restartNumberingAfterBreak="0">
+  <w:abstractNum w:abstractNumId="7" w15:restartNumberingAfterBreak="0">
     <w:nsid w:val="397035D6"/>
     <w:multiLevelType w:val="multilevel"/>
     <w:tmpl w:val="1DE40B16"/>
@@ -20684,7 +21851,7 @@
       </w:rPr>
     </w:lvl>
   </w:abstractNum>
-  <w:abstractNum w:abstractNumId="7" w15:restartNumberingAfterBreak="0">
+  <w:abstractNum w:abstractNumId="8" w15:restartNumberingAfterBreak="0">
     <w:nsid w:val="3AB32618"/>
     <w:multiLevelType w:val="hybridMultilevel"/>
     <w:tmpl w:val="59CA2990"/>
@@ -20797,7 +21964,7 @@
       </w:rPr>
     </w:lvl>
   </w:abstractNum>
-  <w:abstractNum w:abstractNumId="8" w15:restartNumberingAfterBreak="0">
+  <w:abstractNum w:abstractNumId="9" w15:restartNumberingAfterBreak="0">
     <w:nsid w:val="41F05E20"/>
     <w:multiLevelType w:val="hybridMultilevel"/>
     <w:tmpl w:val="8C7E68EE"/>
@@ -20910,7 +22077,7 @@
       </w:rPr>
     </w:lvl>
   </w:abstractNum>
-  <w:abstractNum w:abstractNumId="9" w15:restartNumberingAfterBreak="0">
+  <w:abstractNum w:abstractNumId="10" w15:restartNumberingAfterBreak="0">
     <w:nsid w:val="54091F6C"/>
     <w:multiLevelType w:val="hybridMultilevel"/>
     <w:tmpl w:val="37729CD4"/>
@@ -20996,7 +22163,120 @@
       </w:pPr>
     </w:lvl>
   </w:abstractNum>
-  <w:abstractNum w:abstractNumId="10" w15:restartNumberingAfterBreak="0">
+  <w:abstractNum w:abstractNumId="11" w15:restartNumberingAfterBreak="0">
+    <w:nsid w:val="5D542929"/>
+    <w:multiLevelType w:val="multilevel"/>
+    <w:tmpl w:val="6F626686"/>
+    <w:lvl w:ilvl="0">
+      <w:start w:val="1"/>
+      <w:numFmt w:val="decimal"/>
+      <w:lvlText w:val="%1."/>
+      <w:lvlJc w:val="left"/>
+      <w:pPr>
+        <w:tabs>
+          <w:tab w:val="num" w:pos="720"/>
+        </w:tabs>
+        <w:ind w:left="720" w:hanging="360"/>
+      </w:pPr>
+    </w:lvl>
+    <w:lvl w:ilvl="1" w:tentative="1">
+      <w:start w:val="1"/>
+      <w:numFmt w:val="decimal"/>
+      <w:lvlText w:val="%2."/>
+      <w:lvlJc w:val="left"/>
+      <w:pPr>
+        <w:tabs>
+          <w:tab w:val="num" w:pos="1440"/>
+        </w:tabs>
+        <w:ind w:left="1440" w:hanging="360"/>
+      </w:pPr>
+    </w:lvl>
+    <w:lvl w:ilvl="2" w:tentative="1">
+      <w:start w:val="1"/>
+      <w:numFmt w:val="decimal"/>
+      <w:lvlText w:val="%3."/>
+      <w:lvlJc w:val="left"/>
+      <w:pPr>
+        <w:tabs>
+          <w:tab w:val="num" w:pos="2160"/>
+        </w:tabs>
+        <w:ind w:left="2160" w:hanging="360"/>
+      </w:pPr>
+    </w:lvl>
+    <w:lvl w:ilvl="3" w:tentative="1">
+      <w:start w:val="1"/>
+      <w:numFmt w:val="decimal"/>
+      <w:lvlText w:val="%4."/>
+      <w:lvlJc w:val="left"/>
+      <w:pPr>
+        <w:tabs>
+          <w:tab w:val="num" w:pos="2880"/>
+        </w:tabs>
+        <w:ind w:left="2880" w:hanging="360"/>
+      </w:pPr>
+    </w:lvl>
+    <w:lvl w:ilvl="4" w:tentative="1">
+      <w:start w:val="1"/>
+      <w:numFmt w:val="decimal"/>
+      <w:lvlText w:val="%5."/>
+      <w:lvlJc w:val="left"/>
+      <w:pPr>
+        <w:tabs>
+          <w:tab w:val="num" w:pos="3600"/>
+        </w:tabs>
+        <w:ind w:left="3600" w:hanging="360"/>
+      </w:pPr>
+    </w:lvl>
+    <w:lvl w:ilvl="5" w:tentative="1">
+      <w:start w:val="1"/>
+      <w:numFmt w:val="decimal"/>
+      <w:lvlText w:val="%6."/>
+      <w:lvlJc w:val="left"/>
+      <w:pPr>
+        <w:tabs>
+          <w:tab w:val="num" w:pos="4320"/>
+        </w:tabs>
+        <w:ind w:left="4320" w:hanging="360"/>
+      </w:pPr>
+    </w:lvl>
+    <w:lvl w:ilvl="6" w:tentative="1">
+      <w:start w:val="1"/>
+      <w:numFmt w:val="decimal"/>
+      <w:lvlText w:val="%7."/>
+      <w:lvlJc w:val="left"/>
+      <w:pPr>
+        <w:tabs>
+          <w:tab w:val="num" w:pos="5040"/>
+        </w:tabs>
+        <w:ind w:left="5040" w:hanging="360"/>
+      </w:pPr>
+    </w:lvl>
+    <w:lvl w:ilvl="7" w:tentative="1">
+      <w:start w:val="1"/>
+      <w:numFmt w:val="decimal"/>
+      <w:lvlText w:val="%8."/>
+      <w:lvlJc w:val="left"/>
+      <w:pPr>
+        <w:tabs>
+          <w:tab w:val="num" w:pos="5760"/>
+        </w:tabs>
+        <w:ind w:left="5760" w:hanging="360"/>
+      </w:pPr>
+    </w:lvl>
+    <w:lvl w:ilvl="8" w:tentative="1">
+      <w:start w:val="1"/>
+      <w:numFmt w:val="decimal"/>
+      <w:lvlText w:val="%9."/>
+      <w:lvlJc w:val="left"/>
+      <w:pPr>
+        <w:tabs>
+          <w:tab w:val="num" w:pos="6480"/>
+        </w:tabs>
+        <w:ind w:left="6480" w:hanging="360"/>
+      </w:pPr>
+    </w:lvl>
+  </w:abstractNum>
+  <w:abstractNum w:abstractNumId="12" w15:restartNumberingAfterBreak="0">
     <w:nsid w:val="60C8113B"/>
     <w:multiLevelType w:val="multilevel"/>
     <w:tmpl w:val="7EF2947A"/>
@@ -21145,7 +22425,7 @@
       </w:rPr>
     </w:lvl>
   </w:abstractNum>
-  <w:abstractNum w:abstractNumId="11" w15:restartNumberingAfterBreak="0">
+  <w:abstractNum w:abstractNumId="13" w15:restartNumberingAfterBreak="0">
     <w:nsid w:val="66A045F4"/>
     <w:multiLevelType w:val="hybridMultilevel"/>
     <w:tmpl w:val="C5FA87C8"/>
@@ -21234,7 +22514,120 @@
       </w:pPr>
     </w:lvl>
   </w:abstractNum>
-  <w:abstractNum w:abstractNumId="12" w15:restartNumberingAfterBreak="0">
+  <w:abstractNum w:abstractNumId="14" w15:restartNumberingAfterBreak="0">
+    <w:nsid w:val="6924468F"/>
+    <w:multiLevelType w:val="hybridMultilevel"/>
+    <w:tmpl w:val="3E6E8D42"/>
+    <w:lvl w:ilvl="0" w:tplc="04090001">
+      <w:start w:val="1"/>
+      <w:numFmt w:val="bullet"/>
+      <w:lvlText w:val=""/>
+      <w:lvlJc w:val="left"/>
+      <w:pPr>
+        <w:ind w:left="1440" w:hanging="360"/>
+      </w:pPr>
+      <w:rPr>
+        <w:rFonts w:ascii="Symbol" w:hAnsi="Symbol" w:hint="default"/>
+      </w:rPr>
+    </w:lvl>
+    <w:lvl w:ilvl="1" w:tplc="04090003">
+      <w:start w:val="1"/>
+      <w:numFmt w:val="bullet"/>
+      <w:lvlText w:val="o"/>
+      <w:lvlJc w:val="left"/>
+      <w:pPr>
+        <w:ind w:left="2160" w:hanging="360"/>
+      </w:pPr>
+      <w:rPr>
+        <w:rFonts w:ascii="Courier New" w:hAnsi="Courier New" w:cs="Courier New" w:hint="default"/>
+      </w:rPr>
+    </w:lvl>
+    <w:lvl w:ilvl="2" w:tplc="04090005" w:tentative="1">
+      <w:start w:val="1"/>
+      <w:numFmt w:val="bullet"/>
+      <w:lvlText w:val=""/>
+      <w:lvlJc w:val="left"/>
+      <w:pPr>
+        <w:ind w:left="2880" w:hanging="360"/>
+      </w:pPr>
+      <w:rPr>
+        <w:rFonts w:ascii="Wingdings" w:hAnsi="Wingdings" w:hint="default"/>
+      </w:rPr>
+    </w:lvl>
+    <w:lvl w:ilvl="3" w:tplc="04090001" w:tentative="1">
+      <w:start w:val="1"/>
+      <w:numFmt w:val="bullet"/>
+      <w:lvlText w:val=""/>
+      <w:lvlJc w:val="left"/>
+      <w:pPr>
+        <w:ind w:left="3600" w:hanging="360"/>
+      </w:pPr>
+      <w:rPr>
+        <w:rFonts w:ascii="Symbol" w:hAnsi="Symbol" w:hint="default"/>
+      </w:rPr>
+    </w:lvl>
+    <w:lvl w:ilvl="4" w:tplc="04090003" w:tentative="1">
+      <w:start w:val="1"/>
+      <w:numFmt w:val="bullet"/>
+      <w:lvlText w:val="o"/>
+      <w:lvlJc w:val="left"/>
+      <w:pPr>
+        <w:ind w:left="4320" w:hanging="360"/>
+      </w:pPr>
+      <w:rPr>
+        <w:rFonts w:ascii="Courier New" w:hAnsi="Courier New" w:cs="Courier New" w:hint="default"/>
+      </w:rPr>
+    </w:lvl>
+    <w:lvl w:ilvl="5" w:tplc="04090005" w:tentative="1">
+      <w:start w:val="1"/>
+      <w:numFmt w:val="bullet"/>
+      <w:lvlText w:val=""/>
+      <w:lvlJc w:val="left"/>
+      <w:pPr>
+        <w:ind w:left="5040" w:hanging="360"/>
+      </w:pPr>
+      <w:rPr>
+        <w:rFonts w:ascii="Wingdings" w:hAnsi="Wingdings" w:hint="default"/>
+      </w:rPr>
+    </w:lvl>
+    <w:lvl w:ilvl="6" w:tplc="04090001" w:tentative="1">
+      <w:start w:val="1"/>
+      <w:numFmt w:val="bullet"/>
+      <w:lvlText w:val=""/>
+      <w:lvlJc w:val="left"/>
+      <w:pPr>
+        <w:ind w:left="5760" w:hanging="360"/>
+      </w:pPr>
+      <w:rPr>
+        <w:rFonts w:ascii="Symbol" w:hAnsi="Symbol" w:hint="default"/>
+      </w:rPr>
+    </w:lvl>
+    <w:lvl w:ilvl="7" w:tplc="04090003" w:tentative="1">
+      <w:start w:val="1"/>
+      <w:numFmt w:val="bullet"/>
+      <w:lvlText w:val="o"/>
+      <w:lvlJc w:val="left"/>
+      <w:pPr>
+        <w:ind w:left="6480" w:hanging="360"/>
+      </w:pPr>
+      <w:rPr>
+        <w:rFonts w:ascii="Courier New" w:hAnsi="Courier New" w:cs="Courier New" w:hint="default"/>
+      </w:rPr>
+    </w:lvl>
+    <w:lvl w:ilvl="8" w:tplc="04090005" w:tentative="1">
+      <w:start w:val="1"/>
+      <w:numFmt w:val="bullet"/>
+      <w:lvlText w:val=""/>
+      <w:lvlJc w:val="left"/>
+      <w:pPr>
+        <w:ind w:left="7200" w:hanging="360"/>
+      </w:pPr>
+      <w:rPr>
+        <w:rFonts w:ascii="Wingdings" w:hAnsi="Wingdings" w:hint="default"/>
+      </w:rPr>
+    </w:lvl>
+  </w:abstractNum>
+  <w:abstractNum w:abstractNumId="15" w15:restartNumberingAfterBreak="0">
     <w:nsid w:val="6CA55485"/>
     <w:multiLevelType w:val="hybridMultilevel"/>
     <w:tmpl w:val="C5FA87C8"/>
@@ -21323,7 +22716,7 @@
       </w:pPr>
     </w:lvl>
   </w:abstractNum>
-  <w:abstractNum w:abstractNumId="13" w15:restartNumberingAfterBreak="0">
+  <w:abstractNum w:abstractNumId="16" w15:restartNumberingAfterBreak="0">
     <w:nsid w:val="6E9F1506"/>
     <w:multiLevelType w:val="hybridMultilevel"/>
     <w:tmpl w:val="C088DDB2"/>
@@ -21412,7 +22805,7 @@
       </w:pPr>
     </w:lvl>
   </w:abstractNum>
-  <w:abstractNum w:abstractNumId="14" w15:restartNumberingAfterBreak="0">
+  <w:abstractNum w:abstractNumId="17" w15:restartNumberingAfterBreak="0">
     <w:nsid w:val="74BE6F99"/>
     <w:multiLevelType w:val="hybridMultilevel"/>
     <w:tmpl w:val="3E1075F2"/>
@@ -21525,7 +22918,124 @@
       </w:rPr>
     </w:lvl>
   </w:abstractNum>
-  <w:abstractNum w:abstractNumId="15" w15:restartNumberingAfterBreak="0">
+  <w:abstractNum w:abstractNumId="18" w15:restartNumberingAfterBreak="0">
+    <w:nsid w:val="795A4531"/>
+    <w:multiLevelType w:val="multilevel"/>
+    <w:tmpl w:val="43F6C0CA"/>
+    <w:lvl w:ilvl="0">
+      <w:start w:val="1"/>
+      <w:numFmt w:val="decimal"/>
+      <w:lvlText w:val="%1."/>
+      <w:lvlJc w:val="left"/>
+      <w:pPr>
+        <w:tabs>
+          <w:tab w:val="num" w:pos="720"/>
+        </w:tabs>
+        <w:ind w:left="720" w:hanging="360"/>
+      </w:pPr>
+    </w:lvl>
+    <w:lvl w:ilvl="1">
+      <w:start w:val="1"/>
+      <w:numFmt w:val="bullet"/>
+      <w:lvlText w:val="o"/>
+      <w:lvlJc w:val="left"/>
+      <w:pPr>
+        <w:tabs>
+          <w:tab w:val="num" w:pos="1440"/>
+        </w:tabs>
+        <w:ind w:left="1440" w:hanging="360"/>
+      </w:pPr>
+      <w:rPr>
+        <w:rFonts w:ascii="Courier New" w:hAnsi="Courier New" w:hint="default"/>
+        <w:sz w:val="20"/>
+      </w:rPr>
+    </w:lvl>
+    <w:lvl w:ilvl="2" w:tentative="1">
+      <w:start w:val="1"/>
+      <w:numFmt w:val="decimal"/>
+      <w:lvlText w:val="%3."/>
+      <w:lvlJc w:val="left"/>
+      <w:pPr>
+        <w:tabs>
+          <w:tab w:val="num" w:pos="2160"/>
+        </w:tabs>
+        <w:ind w:left="2160" w:hanging="360"/>
+      </w:pPr>
+    </w:lvl>
+    <w:lvl w:ilvl="3" w:tentative="1">
+      <w:start w:val="1"/>
+      <w:numFmt w:val="decimal"/>
+      <w:lvlText w:val="%4."/>
+      <w:lvlJc w:val="left"/>
+      <w:pPr>
+        <w:tabs>
+          <w:tab w:val="num" w:pos="2880"/>
+        </w:tabs>
+        <w:ind w:left="2880" w:hanging="360"/>
+      </w:pPr>
+    </w:lvl>
+    <w:lvl w:ilvl="4" w:tentative="1">
+      <w:start w:val="1"/>
+      <w:numFmt w:val="decimal"/>
+      <w:lvlText w:val="%5."/>
+      <w:lvlJc w:val="left"/>
+      <w:pPr>
+        <w:tabs>
+          <w:tab w:val="num" w:pos="3600"/>
+        </w:tabs>
+        <w:ind w:left="3600" w:hanging="360"/>
+      </w:pPr>
+    </w:lvl>
+    <w:lvl w:ilvl="5" w:tentative="1">
+      <w:start w:val="1"/>
+      <w:numFmt w:val="decimal"/>
+      <w:lvlText w:val="%6."/>
+      <w:lvlJc w:val="left"/>
+      <w:pPr>
+        <w:tabs>
+          <w:tab w:val="num" w:pos="4320"/>
+        </w:tabs>
+        <w:ind w:left="4320" w:hanging="360"/>
+      </w:pPr>
+    </w:lvl>
+    <w:lvl w:ilvl="6" w:tentative="1">
+      <w:start w:val="1"/>
+      <w:numFmt w:val="decimal"/>
+      <w:lvlText w:val="%7."/>
+      <w:lvlJc w:val="left"/>
+      <w:pPr>
+        <w:tabs>
+          <w:tab w:val="num" w:pos="5040"/>
+        </w:tabs>
+        <w:ind w:left="5040" w:hanging="360"/>
+      </w:pPr>
+    </w:lvl>
+    <w:lvl w:ilvl="7" w:tentative="1">
+      <w:start w:val="1"/>
+      <w:numFmt w:val="decimal"/>
+      <w:lvlText w:val="%8."/>
+      <w:lvlJc w:val="left"/>
+      <w:pPr>
+        <w:tabs>
+          <w:tab w:val="num" w:pos="5760"/>
+        </w:tabs>
+        <w:ind w:left="5760" w:hanging="360"/>
+      </w:pPr>
+    </w:lvl>
+    <w:lvl w:ilvl="8" w:tentative="1">
+      <w:start w:val="1"/>
+      <w:numFmt w:val="decimal"/>
+      <w:lvlText w:val="%9."/>
+      <w:lvlJc w:val="left"/>
+      <w:pPr>
+        <w:tabs>
+          <w:tab w:val="num" w:pos="6480"/>
+        </w:tabs>
+        <w:ind w:left="6480" w:hanging="360"/>
+      </w:pPr>
+    </w:lvl>
+  </w:abstractNum>
+  <w:abstractNum w:abstractNumId="19" w15:restartNumberingAfterBreak="0">
     <w:nsid w:val="7A98760A"/>
     <w:multiLevelType w:val="hybridMultilevel"/>
     <w:tmpl w:val="C30AE510"/>
@@ -21639,51 +23149,63 @@
     </w:lvl>
   </w:abstractNum>
   <w:num w:numId="1" w16cid:durableId="1560088947">
+    <w:abstractNumId w:val="16"/>
+  </w:num>
+  <w:num w:numId="2" w16cid:durableId="72168522">
+    <w:abstractNumId w:val="5"/>
+  </w:num>
+  <w:num w:numId="3" w16cid:durableId="1774131421">
+    <w:abstractNumId w:val="19"/>
+  </w:num>
+  <w:num w:numId="4" w16cid:durableId="870918678">
     <w:abstractNumId w:val="13"/>
   </w:num>
-  <w:num w:numId="2" w16cid:durableId="72168522">
-    <w:abstractNumId w:val="4"/>
-  </w:num>
-  <w:num w:numId="3" w16cid:durableId="1774131421">
+  <w:num w:numId="5" w16cid:durableId="1715541446">
     <w:abstractNumId w:val="15"/>
   </w:num>
-  <w:num w:numId="4" w16cid:durableId="870918678">
-    <w:abstractNumId w:val="11"/>
-  </w:num>
-  <w:num w:numId="5" w16cid:durableId="1715541446">
-    <w:abstractNumId w:val="12"/>
-  </w:num>
   <w:num w:numId="6" w16cid:durableId="1420784439">
-    <w:abstractNumId w:val="5"/>
+    <w:abstractNumId w:val="6"/>
   </w:num>
   <w:num w:numId="7" w16cid:durableId="1279215294">
-    <w:abstractNumId w:val="7"/>
+    <w:abstractNumId w:val="8"/>
   </w:num>
   <w:num w:numId="8" w16cid:durableId="2057318431">
-    <w:abstractNumId w:val="9"/>
+    <w:abstractNumId w:val="10"/>
   </w:num>
   <w:num w:numId="9" w16cid:durableId="221331082">
     <w:abstractNumId w:val="1"/>
   </w:num>
   <w:num w:numId="10" w16cid:durableId="300814174">
-    <w:abstractNumId w:val="8"/>
+    <w:abstractNumId w:val="9"/>
   </w:num>
   <w:num w:numId="11" w16cid:durableId="1305112904">
-    <w:abstractNumId w:val="10"/>
+    <w:abstractNumId w:val="12"/>
   </w:num>
   <w:num w:numId="12" w16cid:durableId="19209770">
-    <w:abstractNumId w:val="14"/>
+    <w:abstractNumId w:val="17"/>
   </w:num>
   <w:num w:numId="13" w16cid:durableId="1224293905">
-    <w:abstractNumId w:val="6"/>
+    <w:abstractNumId w:val="7"/>
   </w:num>
   <w:num w:numId="14" w16cid:durableId="884947237">
-    <w:abstractNumId w:val="3"/>
+    <w:abstractNumId w:val="4"/>
   </w:num>
   <w:num w:numId="15" w16cid:durableId="576131389">
     <w:abstractNumId w:val="0"/>
   </w:num>
   <w:num w:numId="16" w16cid:durableId="2059626480">
+    <w:abstractNumId w:val="3"/>
+  </w:num>
+  <w:num w:numId="17" w16cid:durableId="1187016753">
+    <w:abstractNumId w:val="18"/>
+  </w:num>
+  <w:num w:numId="18" w16cid:durableId="1985815629">
+    <w:abstractNumId w:val="14"/>
+  </w:num>
+  <w:num w:numId="19" w16cid:durableId="1166627153">
+    <w:abstractNumId w:val="11"/>
+  </w:num>
+  <w:num w:numId="20" w16cid:durableId="1177114361">
     <w:abstractNumId w:val="2"/>
   </w:num>
 </w:numbering>
@@ -22088,7 +23610,6 @@
   <w:style w:type="character" w:default="1" w:styleId="DefaultParagraphFont">
     <w:name w:val="Default Paragraph Font"/>
     <w:uiPriority w:val="1"/>
-    <w:semiHidden/>
     <w:unhideWhenUsed/>
   </w:style>
   <w:style w:type="table" w:default="1" w:styleId="TableNormal">

</xml_diff>

<commit_message>
Added Question70 for Codesignal SWE
</commit_message>
<xml_diff>
--- a/src/main/resources/capitalone/codesignal/swe/CodeSignal_Questions_SWE.docx
+++ b/src/main/resources/capitalone/codesignal/swe/CodeSignal_Questions_SWE.docx
@@ -20335,19 +20335,7 @@
         <w:rPr>
           <w:rFonts w:eastAsiaTheme="minorEastAsia"/>
         </w:rPr>
-        <w:t xml:space="preserve">After bubbles are removed, remaining bubbles </w:t>
-      </w:r>
-      <w:r>
-        <w:rPr>
-          <w:rFonts w:eastAsiaTheme="minorEastAsia"/>
-        </w:rPr>
-        <w:t>fall</w:t>
-      </w:r>
-      <w:r>
-        <w:rPr>
-          <w:rFonts w:eastAsiaTheme="minorEastAsia"/>
-        </w:rPr>
-        <w:t xml:space="preserve"> to fill empty cells.</w:t>
+        <w:t>After bubbles are removed, remaining bubbles fall to fill empty cells.</w:t>
       </w:r>
     </w:p>
     <w:p>
@@ -20866,10 +20854,410 @@
           <w:rFonts w:eastAsiaTheme="minorEastAsia"/>
         </w:rPr>
       </w:pPr>
-    </w:p>
-    <w:p>
-      <w:pPr>
-        <w:pStyle w:val="ListParagraph"/>
+      <w:r>
+        <w:rPr>
+          <w:rFonts w:eastAsiaTheme="minorEastAsia"/>
+        </w:rPr>
+        <w:t>Your task is to implement a simulation of a change directory (cd) command. This command changes the current working directory to the specified one.</w:t>
+      </w:r>
+    </w:p>
+    <w:p>
+      <w:pPr>
+        <w:pStyle w:val="ListParagraph"/>
+        <w:rPr>
+          <w:rFonts w:eastAsiaTheme="minorEastAsia"/>
+        </w:rPr>
+      </w:pPr>
+    </w:p>
+    <w:p>
+      <w:pPr>
+        <w:pStyle w:val="ListParagraph"/>
+        <w:rPr>
+          <w:rFonts w:eastAsiaTheme="minorEastAsia"/>
+        </w:rPr>
+      </w:pPr>
+      <w:r>
+        <w:rPr>
+          <w:rFonts w:eastAsiaTheme="minorEastAsia"/>
+        </w:rPr>
+        <w:t>The initial working directory is root (/). You are given a list of cd commands (commands), and you must determine the absolute path after executing all the commands in order.</w:t>
+      </w:r>
+    </w:p>
+    <w:p>
+      <w:pPr>
+        <w:pStyle w:val="ListParagraph"/>
+        <w:rPr>
+          <w:rFonts w:eastAsiaTheme="minorEastAsia"/>
+        </w:rPr>
+      </w:pPr>
+    </w:p>
+    <w:p>
+      <w:pPr>
+        <w:pStyle w:val="ListParagraph"/>
+        <w:rPr>
+          <w:rFonts w:eastAsiaTheme="minorEastAsia"/>
+        </w:rPr>
+      </w:pPr>
+      <w:r>
+        <w:rPr>
+          <w:rFonts w:eastAsiaTheme="minorEastAsia"/>
+        </w:rPr>
+        <w:t>There are multiple options for command arguments:</w:t>
+      </w:r>
+    </w:p>
+    <w:p>
+      <w:pPr>
+        <w:pStyle w:val="ListParagraph"/>
+        <w:numPr>
+          <w:ilvl w:val="0"/>
+          <w:numId w:val="21"/>
+        </w:numPr>
+        <w:rPr>
+          <w:rFonts w:eastAsiaTheme="minorEastAsia"/>
+        </w:rPr>
+      </w:pPr>
+      <w:r>
+        <w:rPr>
+          <w:rFonts w:eastAsiaTheme="minorEastAsia"/>
+        </w:rPr>
+        <w:t>cd / → Changes the working directory to the root directory (/).</w:t>
+      </w:r>
+    </w:p>
+    <w:p>
+      <w:pPr>
+        <w:pStyle w:val="ListParagraph"/>
+        <w:numPr>
+          <w:ilvl w:val="0"/>
+          <w:numId w:val="21"/>
+        </w:numPr>
+        <w:rPr>
+          <w:rFonts w:eastAsiaTheme="minorEastAsia"/>
+        </w:rPr>
+      </w:pPr>
+      <w:proofErr w:type="gramStart"/>
+      <w:r>
+        <w:rPr>
+          <w:rFonts w:eastAsiaTheme="minorEastAsia"/>
+        </w:rPr>
+        <w:t>cd .</w:t>
+      </w:r>
+      <w:proofErr w:type="gramEnd"/>
+      <w:r>
+        <w:rPr>
+          <w:rFonts w:eastAsiaTheme="minorEastAsia"/>
+        </w:rPr>
+        <w:t xml:space="preserve"> → Stays in the current directory (does nothing).</w:t>
+      </w:r>
+    </w:p>
+    <w:p>
+      <w:pPr>
+        <w:pStyle w:val="ListParagraph"/>
+        <w:numPr>
+          <w:ilvl w:val="0"/>
+          <w:numId w:val="21"/>
+        </w:numPr>
+        <w:rPr>
+          <w:rFonts w:eastAsiaTheme="minorEastAsia"/>
+        </w:rPr>
+      </w:pPr>
+      <w:r>
+        <w:rPr>
+          <w:rFonts w:eastAsiaTheme="minorEastAsia"/>
+        </w:rPr>
+        <w:lastRenderedPageBreak/>
+        <w:t>cd</w:t>
+      </w:r>
+      <w:proofErr w:type="gramStart"/>
+      <w:r>
+        <w:rPr>
+          <w:rFonts w:eastAsiaTheme="minorEastAsia"/>
+        </w:rPr>
+        <w:t xml:space="preserve"> ..</w:t>
+      </w:r>
+      <w:proofErr w:type="gramEnd"/>
+      <w:r>
+        <w:rPr>
+          <w:rFonts w:eastAsiaTheme="minorEastAsia"/>
+        </w:rPr>
+        <w:t xml:space="preserve"> → Moves the working directory one level up.</w:t>
+      </w:r>
+    </w:p>
+    <w:p>
+      <w:pPr>
+        <w:pStyle w:val="ListParagraph"/>
+        <w:numPr>
+          <w:ilvl w:val="1"/>
+          <w:numId w:val="21"/>
+        </w:numPr>
+        <w:rPr>
+          <w:rFonts w:eastAsiaTheme="minorEastAsia"/>
+        </w:rPr>
+      </w:pPr>
+      <w:r>
+        <w:rPr>
+          <w:rFonts w:eastAsiaTheme="minorEastAsia"/>
+        </w:rPr>
+        <w:t>If already in the root directory, this command does nothing.</w:t>
+      </w:r>
+    </w:p>
+    <w:p>
+      <w:pPr>
+        <w:pStyle w:val="ListParagraph"/>
+        <w:numPr>
+          <w:ilvl w:val="0"/>
+          <w:numId w:val="21"/>
+        </w:numPr>
+        <w:rPr>
+          <w:rFonts w:eastAsiaTheme="minorEastAsia"/>
+        </w:rPr>
+      </w:pPr>
+      <w:r>
+        <w:rPr>
+          <w:rFonts w:eastAsiaTheme="minorEastAsia"/>
+        </w:rPr>
+        <w:t>cd &lt;subdirectory&gt; → Moves into the specified subdirectory.</w:t>
+      </w:r>
+    </w:p>
+    <w:p>
+      <w:pPr>
+        <w:pStyle w:val="ListParagraph"/>
+        <w:numPr>
+          <w:ilvl w:val="1"/>
+          <w:numId w:val="21"/>
+        </w:numPr>
+        <w:rPr>
+          <w:rFonts w:eastAsiaTheme="minorEastAsia"/>
+        </w:rPr>
+      </w:pPr>
+      <w:r>
+        <w:rPr>
+          <w:rFonts w:eastAsiaTheme="minorEastAsia"/>
+        </w:rPr>
+        <w:t>&lt;subdirectory&gt; is a string of lowercase English letters.</w:t>
+      </w:r>
+    </w:p>
+    <w:p>
+      <w:pPr>
+        <w:pStyle w:val="ListParagraph"/>
+        <w:numPr>
+          <w:ilvl w:val="1"/>
+          <w:numId w:val="21"/>
+        </w:numPr>
+        <w:rPr>
+          <w:rFonts w:eastAsiaTheme="minorEastAsia"/>
+        </w:rPr>
+      </w:pPr>
+      <w:r>
+        <w:rPr>
+          <w:rFonts w:eastAsiaTheme="minorEastAsia"/>
+        </w:rPr>
+        <w:t>All specified directories exist.</w:t>
+      </w:r>
+    </w:p>
+    <w:p>
+      <w:pPr>
+        <w:pStyle w:val="ListParagraph"/>
+        <w:rPr>
+          <w:rFonts w:eastAsiaTheme="minorEastAsia"/>
+        </w:rPr>
+      </w:pPr>
+    </w:p>
+    <w:p>
+      <w:pPr>
+        <w:pStyle w:val="ListParagraph"/>
+        <w:rPr>
+          <w:rFonts w:eastAsiaTheme="minorEastAsia"/>
+        </w:rPr>
+      </w:pPr>
+      <w:r>
+        <w:rPr>
+          <w:rFonts w:eastAsiaTheme="minorEastAsia"/>
+        </w:rPr>
+        <w:t xml:space="preserve">All specified directories exist. Return the absolute path from the root to the working directory after executing all </w:t>
+      </w:r>
+      <w:r>
+        <w:rPr>
+          <w:rFonts w:eastAsiaTheme="minorEastAsia"/>
+          <w:i/>
+          <w:iCs/>
+        </w:rPr>
+        <w:t>cd</w:t>
+      </w:r>
+      <w:r>
+        <w:rPr>
+          <w:rFonts w:eastAsiaTheme="minorEastAsia"/>
+        </w:rPr>
+        <w:t xml:space="preserve"> commands in the given order. </w:t>
+      </w:r>
+      <w:r>
+        <w:rPr>
+          <w:rFonts w:eastAsiaTheme="minorEastAsia"/>
+          <w:i/>
+          <w:iCs/>
+        </w:rPr>
+        <w:t>/</w:t>
+      </w:r>
+      <w:r>
+        <w:rPr>
+          <w:rFonts w:eastAsiaTheme="minorEastAsia"/>
+        </w:rPr>
+        <w:t xml:space="preserve"> </w:t>
+      </w:r>
+      <w:proofErr w:type="gramStart"/>
+      <w:r>
+        <w:rPr>
+          <w:rFonts w:eastAsiaTheme="minorEastAsia"/>
+        </w:rPr>
+        <w:t>should</w:t>
+      </w:r>
+      <w:proofErr w:type="gramEnd"/>
+      <w:r>
+        <w:rPr>
+          <w:rFonts w:eastAsiaTheme="minorEastAsia"/>
+        </w:rPr>
+        <w:t xml:space="preserve"> be used as separators.</w:t>
+      </w:r>
+    </w:p>
+    <w:p>
+      <w:pPr>
+        <w:pStyle w:val="ListParagraph"/>
+        <w:rPr>
+          <w:rFonts w:eastAsiaTheme="minorEastAsia"/>
+        </w:rPr>
+      </w:pPr>
+    </w:p>
+    <w:p>
+      <w:pPr>
+        <w:pStyle w:val="ListParagraph"/>
+        <w:rPr>
+          <w:rFonts w:eastAsiaTheme="minorEastAsia"/>
+        </w:rPr>
+      </w:pPr>
+      <w:r>
+        <w:rPr>
+          <w:rFonts w:eastAsiaTheme="minorEastAsia"/>
+          <w:b/>
+          <w:bCs/>
+        </w:rPr>
+        <w:t>Example:</w:t>
+      </w:r>
+    </w:p>
+    <w:p>
+      <w:pPr>
+        <w:pStyle w:val="ListParagraph"/>
+        <w:rPr>
+          <w:rFonts w:eastAsiaTheme="minorEastAsia"/>
+        </w:rPr>
+      </w:pPr>
+    </w:p>
+    <w:p>
+      <w:pPr>
+        <w:pStyle w:val="ListParagraph"/>
+        <w:rPr>
+          <w:rFonts w:eastAsiaTheme="minorEastAsia"/>
+        </w:rPr>
+      </w:pPr>
+      <w:r>
+        <w:rPr>
+          <w:rFonts w:eastAsiaTheme="minorEastAsia"/>
+        </w:rPr>
+        <w:t xml:space="preserve">commands = ["cd users", "cd </w:t>
+      </w:r>
+      <w:proofErr w:type="spellStart"/>
+      <w:r>
+        <w:rPr>
+          <w:rFonts w:eastAsiaTheme="minorEastAsia"/>
+        </w:rPr>
+        <w:t>codesignal</w:t>
+      </w:r>
+      <w:proofErr w:type="spellEnd"/>
+      <w:r>
+        <w:rPr>
+          <w:rFonts w:eastAsiaTheme="minorEastAsia"/>
+        </w:rPr>
+        <w:t>", "cd</w:t>
+      </w:r>
+      <w:proofErr w:type="gramStart"/>
+      <w:r>
+        <w:rPr>
+          <w:rFonts w:eastAsiaTheme="minorEastAsia"/>
+        </w:rPr>
+        <w:t xml:space="preserve"> ..</w:t>
+      </w:r>
+      <w:proofErr w:type="gramEnd"/>
+      <w:r>
+        <w:rPr>
+          <w:rFonts w:eastAsiaTheme="minorEastAsia"/>
+        </w:rPr>
+        <w:t>", "cd admin"]</w:t>
+      </w:r>
+    </w:p>
+    <w:p>
+      <w:pPr>
+        <w:pStyle w:val="ListParagraph"/>
+        <w:rPr>
+          <w:rFonts w:eastAsiaTheme="minorEastAsia"/>
+        </w:rPr>
+      </w:pPr>
+    </w:p>
+    <w:p>
+      <w:pPr>
+        <w:pStyle w:val="ListParagraph"/>
+        <w:rPr>
+          <w:rFonts w:eastAsiaTheme="minorEastAsia"/>
+        </w:rPr>
+      </w:pPr>
+      <w:r>
+        <w:rPr>
+          <w:rFonts w:eastAsiaTheme="minorEastAsia"/>
+        </w:rPr>
+        <w:t xml:space="preserve">Then the output should be </w:t>
+      </w:r>
+      <w:r>
+        <w:rPr>
+          <w:rFonts w:eastAsiaTheme="minorEastAsia"/>
+          <w:i/>
+          <w:iCs/>
+        </w:rPr>
+        <w:t>solution(commands) = “/users/admin</w:t>
+      </w:r>
+    </w:p>
+    <w:p>
+      <w:pPr>
+        <w:pStyle w:val="ListParagraph"/>
+        <w:rPr>
+          <w:rFonts w:eastAsiaTheme="minorEastAsia"/>
+        </w:rPr>
+      </w:pPr>
+    </w:p>
+    <w:p>
+      <w:pPr>
+        <w:pStyle w:val="ListParagraph"/>
+        <w:rPr>
+          <w:rFonts w:eastAsiaTheme="minorEastAsia"/>
+        </w:rPr>
+      </w:pPr>
+      <w:r>
+        <w:rPr>
+          <w:rFonts w:eastAsiaTheme="minorEastAsia"/>
+        </w:rPr>
+        <w:t>Answer: Question70</w:t>
+      </w:r>
+    </w:p>
+    <w:p>
+      <w:pPr>
+        <w:rPr>
+          <w:rFonts w:eastAsiaTheme="minorEastAsia"/>
+        </w:rPr>
+      </w:pPr>
+    </w:p>
+    <w:p>
+      <w:pPr>
+        <w:pStyle w:val="ListParagraph"/>
+        <w:numPr>
+          <w:ilvl w:val="0"/>
+          <w:numId w:val="1"/>
+        </w:numPr>
         <w:rPr>
           <w:rFonts w:eastAsiaTheme="minorEastAsia"/>
         </w:rPr>
@@ -22919,6 +23307,95 @@
     </w:lvl>
   </w:abstractNum>
   <w:abstractNum w:abstractNumId="18" w15:restartNumberingAfterBreak="0">
+    <w:nsid w:val="75215483"/>
+    <w:multiLevelType w:val="hybridMultilevel"/>
+    <w:tmpl w:val="79227242"/>
+    <w:lvl w:ilvl="0" w:tplc="EB220822">
+      <w:start w:val="1"/>
+      <w:numFmt w:val="decimal"/>
+      <w:lvlText w:val="%1."/>
+      <w:lvlJc w:val="left"/>
+      <w:pPr>
+        <w:ind w:left="1800" w:hanging="360"/>
+      </w:pPr>
+      <w:rPr>
+        <w:rFonts w:hint="default"/>
+      </w:rPr>
+    </w:lvl>
+    <w:lvl w:ilvl="1" w:tplc="04090019">
+      <w:start w:val="1"/>
+      <w:numFmt w:val="lowerLetter"/>
+      <w:lvlText w:val="%2."/>
+      <w:lvlJc w:val="left"/>
+      <w:pPr>
+        <w:ind w:left="2520" w:hanging="360"/>
+      </w:pPr>
+    </w:lvl>
+    <w:lvl w:ilvl="2" w:tplc="0409001B" w:tentative="1">
+      <w:start w:val="1"/>
+      <w:numFmt w:val="lowerRoman"/>
+      <w:lvlText w:val="%3."/>
+      <w:lvlJc w:val="right"/>
+      <w:pPr>
+        <w:ind w:left="3240" w:hanging="180"/>
+      </w:pPr>
+    </w:lvl>
+    <w:lvl w:ilvl="3" w:tplc="0409000F" w:tentative="1">
+      <w:start w:val="1"/>
+      <w:numFmt w:val="decimal"/>
+      <w:lvlText w:val="%4."/>
+      <w:lvlJc w:val="left"/>
+      <w:pPr>
+        <w:ind w:left="3960" w:hanging="360"/>
+      </w:pPr>
+    </w:lvl>
+    <w:lvl w:ilvl="4" w:tplc="04090019" w:tentative="1">
+      <w:start w:val="1"/>
+      <w:numFmt w:val="lowerLetter"/>
+      <w:lvlText w:val="%5."/>
+      <w:lvlJc w:val="left"/>
+      <w:pPr>
+        <w:ind w:left="4680" w:hanging="360"/>
+      </w:pPr>
+    </w:lvl>
+    <w:lvl w:ilvl="5" w:tplc="0409001B" w:tentative="1">
+      <w:start w:val="1"/>
+      <w:numFmt w:val="lowerRoman"/>
+      <w:lvlText w:val="%6."/>
+      <w:lvlJc w:val="right"/>
+      <w:pPr>
+        <w:ind w:left="5400" w:hanging="180"/>
+      </w:pPr>
+    </w:lvl>
+    <w:lvl w:ilvl="6" w:tplc="0409000F" w:tentative="1">
+      <w:start w:val="1"/>
+      <w:numFmt w:val="decimal"/>
+      <w:lvlText w:val="%7."/>
+      <w:lvlJc w:val="left"/>
+      <w:pPr>
+        <w:ind w:left="6120" w:hanging="360"/>
+      </w:pPr>
+    </w:lvl>
+    <w:lvl w:ilvl="7" w:tplc="04090019" w:tentative="1">
+      <w:start w:val="1"/>
+      <w:numFmt w:val="lowerLetter"/>
+      <w:lvlText w:val="%8."/>
+      <w:lvlJc w:val="left"/>
+      <w:pPr>
+        <w:ind w:left="6840" w:hanging="360"/>
+      </w:pPr>
+    </w:lvl>
+    <w:lvl w:ilvl="8" w:tplc="0409001B" w:tentative="1">
+      <w:start w:val="1"/>
+      <w:numFmt w:val="lowerRoman"/>
+      <w:lvlText w:val="%9."/>
+      <w:lvlJc w:val="right"/>
+      <w:pPr>
+        <w:ind w:left="7560" w:hanging="180"/>
+      </w:pPr>
+    </w:lvl>
+  </w:abstractNum>
+  <w:abstractNum w:abstractNumId="19" w15:restartNumberingAfterBreak="0">
     <w:nsid w:val="795A4531"/>
     <w:multiLevelType w:val="multilevel"/>
     <w:tmpl w:val="43F6C0CA"/>
@@ -23035,7 +23512,7 @@
       </w:pPr>
     </w:lvl>
   </w:abstractNum>
-  <w:abstractNum w:abstractNumId="19" w15:restartNumberingAfterBreak="0">
+  <w:abstractNum w:abstractNumId="20" w15:restartNumberingAfterBreak="0">
     <w:nsid w:val="7A98760A"/>
     <w:multiLevelType w:val="hybridMultilevel"/>
     <w:tmpl w:val="C30AE510"/>
@@ -23155,7 +23632,7 @@
     <w:abstractNumId w:val="5"/>
   </w:num>
   <w:num w:numId="3" w16cid:durableId="1774131421">
-    <w:abstractNumId w:val="19"/>
+    <w:abstractNumId w:val="20"/>
   </w:num>
   <w:num w:numId="4" w16cid:durableId="870918678">
     <w:abstractNumId w:val="13"/>
@@ -23197,7 +23674,7 @@
     <w:abstractNumId w:val="3"/>
   </w:num>
   <w:num w:numId="17" w16cid:durableId="1187016753">
-    <w:abstractNumId w:val="18"/>
+    <w:abstractNumId w:val="19"/>
   </w:num>
   <w:num w:numId="18" w16cid:durableId="1985815629">
     <w:abstractNumId w:val="14"/>
@@ -23207,6 +23684,9 @@
   </w:num>
   <w:num w:numId="20" w16cid:durableId="1177114361">
     <w:abstractNumId w:val="2"/>
+  </w:num>
+  <w:num w:numId="21" w16cid:durableId="1090077349">
+    <w:abstractNumId w:val="18"/>
   </w:num>
 </w:numbering>
 </file>
@@ -23610,6 +24090,7 @@
   <w:style w:type="character" w:default="1" w:styleId="DefaultParagraphFont">
     <w:name w:val="Default Paragraph Font"/>
     <w:uiPriority w:val="1"/>
+    <w:semiHidden/>
     <w:unhideWhenUsed/>
   </w:style>
   <w:style w:type="table" w:default="1" w:styleId="TableNormal">

</xml_diff>

<commit_message>
Updated JPMC Hackerrank Questions and Codesignal
</commit_message>
<xml_diff>
--- a/src/main/resources/capitalone/codesignal/swe/CodeSignal_Questions_SWE.docx
+++ b/src/main/resources/capitalone/codesignal/swe/CodeSignal_Questions_SWE.docx
@@ -25767,11 +25767,1795 @@
     </w:p>
     <w:p>
       <w:pPr>
-        <w:ind w:left="720"/>
-        <w:rPr>
-          <w:rFonts w:eastAsiaTheme="minorEastAsia"/>
-        </w:rPr>
-      </w:pPr>
+        <w:pStyle w:val="ListParagraph"/>
+        <w:numPr>
+          <w:ilvl w:val="0"/>
+          <w:numId w:val="1"/>
+        </w:numPr>
+        <w:rPr>
+          <w:rFonts w:eastAsiaTheme="minorEastAsia"/>
+        </w:rPr>
+      </w:pPr>
+      <w:r>
+        <w:rPr>
+          <w:rFonts w:eastAsiaTheme="minorEastAsia"/>
+        </w:rPr>
+        <w:t>On the planet Octavia, astronomers track time using 8 distinct lunar phases instead of weekdays: “</w:t>
+      </w:r>
+      <w:proofErr w:type="spellStart"/>
+      <w:r>
+        <w:rPr>
+          <w:rFonts w:eastAsiaTheme="minorEastAsia"/>
+        </w:rPr>
+        <w:t>NewMoon</w:t>
+      </w:r>
+      <w:proofErr w:type="spellEnd"/>
+      <w:r>
+        <w:rPr>
+          <w:rFonts w:eastAsiaTheme="minorEastAsia"/>
+        </w:rPr>
+        <w:t>”, “Crescent”, “Quarter”, “Gibbous”, “Full”, “Waning”, “Eclipse”, and “Twilight”. These phases repeat cyclically.</w:t>
+      </w:r>
+    </w:p>
+    <w:p>
+      <w:pPr>
+        <w:rPr>
+          <w:rFonts w:eastAsiaTheme="minorEastAsia"/>
+        </w:rPr>
+      </w:pPr>
+    </w:p>
+    <w:p>
+      <w:pPr>
+        <w:ind w:left="720"/>
+        <w:rPr>
+          <w:rFonts w:eastAsiaTheme="minorEastAsia"/>
+        </w:rPr>
+      </w:pPr>
+      <w:r>
+        <w:rPr>
+          <w:rFonts w:eastAsiaTheme="minorEastAsia"/>
+        </w:rPr>
+        <w:t>The Octavian year is divided into 12 seasons (identical to Earth months in length), and each date has a corresponding lunar phase.</w:t>
+      </w:r>
+    </w:p>
+    <w:p>
+      <w:pPr>
+        <w:ind w:left="720"/>
+        <w:rPr>
+          <w:rFonts w:eastAsiaTheme="minorEastAsia"/>
+        </w:rPr>
+      </w:pPr>
+    </w:p>
+    <w:p>
+      <w:pPr>
+        <w:ind w:left="720"/>
+        <w:rPr>
+          <w:rFonts w:eastAsiaTheme="minorEastAsia"/>
+        </w:rPr>
+      </w:pPr>
+      <w:r>
+        <w:rPr>
+          <w:rFonts w:eastAsiaTheme="minorEastAsia"/>
+        </w:rPr>
+        <w:t>Given a specific date (a season and day number) and the lunar phase with which the year began, determine the lunar phase for that date.</w:t>
+      </w:r>
+    </w:p>
+    <w:p>
+      <w:pPr>
+        <w:ind w:left="720"/>
+        <w:rPr>
+          <w:rFonts w:eastAsiaTheme="minorEastAsia"/>
+        </w:rPr>
+      </w:pPr>
+    </w:p>
+    <w:p>
+      <w:pPr>
+        <w:ind w:left="720"/>
+        <w:rPr>
+          <w:rFonts w:eastAsiaTheme="minorEastAsia"/>
+        </w:rPr>
+      </w:pPr>
+      <w:r>
+        <w:rPr>
+          <w:rFonts w:eastAsiaTheme="minorEastAsia"/>
+        </w:rPr>
+        <w:t>Notes:</w:t>
+      </w:r>
+    </w:p>
+    <w:p>
+      <w:pPr>
+        <w:pStyle w:val="ListParagraph"/>
+        <w:numPr>
+          <w:ilvl w:val="0"/>
+          <w:numId w:val="15"/>
+        </w:numPr>
+        <w:rPr>
+          <w:rFonts w:eastAsiaTheme="minorEastAsia"/>
+        </w:rPr>
+      </w:pPr>
+      <w:r>
+        <w:rPr>
+          <w:rFonts w:eastAsiaTheme="minorEastAsia"/>
+        </w:rPr>
+        <w:t xml:space="preserve">The number of </w:t>
+      </w:r>
+      <w:proofErr w:type="spellStart"/>
+      <w:r>
+        <w:rPr>
+          <w:rFonts w:eastAsiaTheme="minorEastAsia"/>
+        </w:rPr>
+        <w:t>dats</w:t>
+      </w:r>
+      <w:proofErr w:type="spellEnd"/>
+      <w:r>
+        <w:rPr>
+          <w:rFonts w:eastAsiaTheme="minorEastAsia"/>
+        </w:rPr>
+        <w:t xml:space="preserve"> in each season in a non-leap year is in order:</w:t>
+      </w:r>
+    </w:p>
+    <w:p>
+      <w:pPr>
+        <w:pStyle w:val="ListParagraph"/>
+        <w:numPr>
+          <w:ilvl w:val="2"/>
+          <w:numId w:val="15"/>
+        </w:numPr>
+        <w:rPr>
+          <w:rFonts w:eastAsiaTheme="minorEastAsia"/>
+        </w:rPr>
+      </w:pPr>
+      <w:r>
+        <w:rPr>
+          <w:rFonts w:eastAsiaTheme="minorEastAsia"/>
+        </w:rPr>
+        <w:t>January – 31</w:t>
+      </w:r>
+    </w:p>
+    <w:p>
+      <w:pPr>
+        <w:pStyle w:val="ListParagraph"/>
+        <w:numPr>
+          <w:ilvl w:val="2"/>
+          <w:numId w:val="15"/>
+        </w:numPr>
+        <w:rPr>
+          <w:rFonts w:eastAsiaTheme="minorEastAsia"/>
+        </w:rPr>
+      </w:pPr>
+      <w:r>
+        <w:rPr>
+          <w:rFonts w:eastAsiaTheme="minorEastAsia"/>
+        </w:rPr>
+        <w:t>February – 28</w:t>
+      </w:r>
+    </w:p>
+    <w:p>
+      <w:pPr>
+        <w:pStyle w:val="ListParagraph"/>
+        <w:numPr>
+          <w:ilvl w:val="2"/>
+          <w:numId w:val="15"/>
+        </w:numPr>
+        <w:rPr>
+          <w:rFonts w:eastAsiaTheme="minorEastAsia"/>
+        </w:rPr>
+      </w:pPr>
+      <w:r>
+        <w:rPr>
+          <w:rFonts w:eastAsiaTheme="minorEastAsia"/>
+        </w:rPr>
+        <w:t>March – 31</w:t>
+      </w:r>
+    </w:p>
+    <w:p>
+      <w:pPr>
+        <w:pStyle w:val="ListParagraph"/>
+        <w:numPr>
+          <w:ilvl w:val="2"/>
+          <w:numId w:val="15"/>
+        </w:numPr>
+        <w:rPr>
+          <w:rFonts w:eastAsiaTheme="minorEastAsia"/>
+        </w:rPr>
+      </w:pPr>
+      <w:r>
+        <w:rPr>
+          <w:rFonts w:eastAsiaTheme="minorEastAsia"/>
+        </w:rPr>
+        <w:t>April – 30</w:t>
+      </w:r>
+    </w:p>
+    <w:p>
+      <w:pPr>
+        <w:pStyle w:val="ListParagraph"/>
+        <w:numPr>
+          <w:ilvl w:val="2"/>
+          <w:numId w:val="15"/>
+        </w:numPr>
+        <w:rPr>
+          <w:rFonts w:eastAsiaTheme="minorEastAsia"/>
+        </w:rPr>
+      </w:pPr>
+      <w:r>
+        <w:rPr>
+          <w:rFonts w:eastAsiaTheme="minorEastAsia"/>
+        </w:rPr>
+        <w:t>May – 31</w:t>
+      </w:r>
+    </w:p>
+    <w:p>
+      <w:pPr>
+        <w:pStyle w:val="ListParagraph"/>
+        <w:numPr>
+          <w:ilvl w:val="2"/>
+          <w:numId w:val="15"/>
+        </w:numPr>
+        <w:rPr>
+          <w:rFonts w:eastAsiaTheme="minorEastAsia"/>
+        </w:rPr>
+      </w:pPr>
+      <w:r>
+        <w:rPr>
+          <w:rFonts w:eastAsiaTheme="minorEastAsia"/>
+        </w:rPr>
+        <w:t>June – 30</w:t>
+      </w:r>
+    </w:p>
+    <w:p>
+      <w:pPr>
+        <w:pStyle w:val="ListParagraph"/>
+        <w:numPr>
+          <w:ilvl w:val="2"/>
+          <w:numId w:val="15"/>
+        </w:numPr>
+        <w:rPr>
+          <w:rFonts w:eastAsiaTheme="minorEastAsia"/>
+        </w:rPr>
+      </w:pPr>
+      <w:r>
+        <w:rPr>
+          <w:rFonts w:eastAsiaTheme="minorEastAsia"/>
+        </w:rPr>
+        <w:t>July – 31</w:t>
+      </w:r>
+    </w:p>
+    <w:p>
+      <w:pPr>
+        <w:pStyle w:val="ListParagraph"/>
+        <w:numPr>
+          <w:ilvl w:val="2"/>
+          <w:numId w:val="15"/>
+        </w:numPr>
+        <w:rPr>
+          <w:rFonts w:eastAsiaTheme="minorEastAsia"/>
+        </w:rPr>
+      </w:pPr>
+      <w:r>
+        <w:rPr>
+          <w:rFonts w:eastAsiaTheme="minorEastAsia"/>
+        </w:rPr>
+        <w:t>August – 31</w:t>
+      </w:r>
+    </w:p>
+    <w:p>
+      <w:pPr>
+        <w:pStyle w:val="ListParagraph"/>
+        <w:numPr>
+          <w:ilvl w:val="2"/>
+          <w:numId w:val="15"/>
+        </w:numPr>
+        <w:rPr>
+          <w:rFonts w:eastAsiaTheme="minorEastAsia"/>
+        </w:rPr>
+      </w:pPr>
+      <w:r>
+        <w:rPr>
+          <w:rFonts w:eastAsiaTheme="minorEastAsia"/>
+        </w:rPr>
+        <w:t>September – 30</w:t>
+      </w:r>
+    </w:p>
+    <w:p>
+      <w:pPr>
+        <w:pStyle w:val="ListParagraph"/>
+        <w:numPr>
+          <w:ilvl w:val="2"/>
+          <w:numId w:val="15"/>
+        </w:numPr>
+        <w:rPr>
+          <w:rFonts w:eastAsiaTheme="minorEastAsia"/>
+        </w:rPr>
+      </w:pPr>
+      <w:r>
+        <w:rPr>
+          <w:rFonts w:eastAsiaTheme="minorEastAsia"/>
+        </w:rPr>
+        <w:t>October – 31</w:t>
+      </w:r>
+    </w:p>
+    <w:p>
+      <w:pPr>
+        <w:pStyle w:val="ListParagraph"/>
+        <w:numPr>
+          <w:ilvl w:val="2"/>
+          <w:numId w:val="15"/>
+        </w:numPr>
+        <w:rPr>
+          <w:rFonts w:eastAsiaTheme="minorEastAsia"/>
+        </w:rPr>
+      </w:pPr>
+      <w:r>
+        <w:rPr>
+          <w:rFonts w:eastAsiaTheme="minorEastAsia"/>
+        </w:rPr>
+        <w:t>November – 30</w:t>
+      </w:r>
+    </w:p>
+    <w:p>
+      <w:pPr>
+        <w:pStyle w:val="ListParagraph"/>
+        <w:numPr>
+          <w:ilvl w:val="2"/>
+          <w:numId w:val="15"/>
+        </w:numPr>
+        <w:rPr>
+          <w:rFonts w:eastAsiaTheme="minorEastAsia"/>
+        </w:rPr>
+      </w:pPr>
+      <w:r>
+        <w:rPr>
+          <w:rFonts w:eastAsiaTheme="minorEastAsia"/>
+        </w:rPr>
+        <w:t>December – 31</w:t>
+      </w:r>
+    </w:p>
+    <w:p>
+      <w:pPr>
+        <w:pStyle w:val="ListParagraph"/>
+        <w:numPr>
+          <w:ilvl w:val="0"/>
+          <w:numId w:val="15"/>
+        </w:numPr>
+        <w:rPr>
+          <w:rFonts w:eastAsiaTheme="minorEastAsia"/>
+        </w:rPr>
+      </w:pPr>
+      <w:r>
+        <w:rPr>
+          <w:rFonts w:eastAsiaTheme="minorEastAsia"/>
+        </w:rPr>
+        <w:t>The lunar phases in Octavian calendar are, in order:</w:t>
+      </w:r>
+    </w:p>
+    <w:p>
+      <w:pPr>
+        <w:pStyle w:val="ListParagraph"/>
+        <w:numPr>
+          <w:ilvl w:val="2"/>
+          <w:numId w:val="15"/>
+        </w:numPr>
+        <w:rPr>
+          <w:rFonts w:eastAsiaTheme="minorEastAsia"/>
+        </w:rPr>
+      </w:pPr>
+      <w:proofErr w:type="spellStart"/>
+      <w:r>
+        <w:rPr>
+          <w:rFonts w:eastAsiaTheme="minorEastAsia"/>
+        </w:rPr>
+        <w:t>NewMoon</w:t>
+      </w:r>
+      <w:proofErr w:type="spellEnd"/>
+      <w:r>
+        <w:rPr>
+          <w:rFonts w:eastAsiaTheme="minorEastAsia"/>
+        </w:rPr>
+        <w:t>, Cresent, Quarter, Gibbous, Full, Waning, Eclipse, and Twilight</w:t>
+      </w:r>
+    </w:p>
+    <w:p>
+      <w:pPr>
+        <w:rPr>
+          <w:rFonts w:eastAsiaTheme="minorEastAsia"/>
+        </w:rPr>
+      </w:pPr>
+    </w:p>
+    <w:p>
+      <w:pPr>
+        <w:ind w:left="720"/>
+        <w:rPr>
+          <w:rFonts w:eastAsiaTheme="minorEastAsia"/>
+        </w:rPr>
+      </w:pPr>
+      <w:r>
+        <w:rPr>
+          <w:rFonts w:eastAsiaTheme="minorEastAsia"/>
+          <w:b/>
+          <w:bCs/>
+        </w:rPr>
+        <w:t>Example:</w:t>
+      </w:r>
+    </w:p>
+    <w:p>
+      <w:pPr>
+        <w:ind w:left="720"/>
+        <w:rPr>
+          <w:rFonts w:eastAsiaTheme="minorEastAsia"/>
+        </w:rPr>
+      </w:pPr>
+    </w:p>
+    <w:p>
+      <w:pPr>
+        <w:ind w:left="720"/>
+        <w:rPr>
+          <w:rFonts w:eastAsiaTheme="minorEastAsia"/>
+        </w:rPr>
+      </w:pPr>
+      <w:r>
+        <w:rPr>
+          <w:rFonts w:eastAsiaTheme="minorEastAsia"/>
+        </w:rPr>
+        <w:t xml:space="preserve">For </w:t>
+      </w:r>
+      <w:r>
+        <w:rPr>
+          <w:rFonts w:eastAsiaTheme="minorEastAsia"/>
+          <w:i/>
+          <w:iCs/>
+        </w:rPr>
+        <w:t xml:space="preserve">season = </w:t>
+      </w:r>
+      <w:r>
+        <w:rPr>
+          <w:rFonts w:eastAsiaTheme="minorEastAsia"/>
+        </w:rPr>
+        <w:t xml:space="preserve">“January”, </w:t>
+      </w:r>
+      <w:proofErr w:type="spellStart"/>
+      <w:r>
+        <w:rPr>
+          <w:rFonts w:eastAsiaTheme="minorEastAsia"/>
+        </w:rPr>
+        <w:t>dayCount</w:t>
+      </w:r>
+      <w:proofErr w:type="spellEnd"/>
+      <w:r>
+        <w:rPr>
+          <w:rFonts w:eastAsiaTheme="minorEastAsia"/>
+        </w:rPr>
+        <w:t xml:space="preserve"> = 4, and </w:t>
+      </w:r>
+      <w:proofErr w:type="spellStart"/>
+      <w:r>
+        <w:rPr>
+          <w:rFonts w:eastAsiaTheme="minorEastAsia"/>
+        </w:rPr>
+        <w:t>initialPhase</w:t>
+      </w:r>
+      <w:proofErr w:type="spellEnd"/>
+      <w:r>
+        <w:rPr>
+          <w:rFonts w:eastAsiaTheme="minorEastAsia"/>
+        </w:rPr>
+        <w:t xml:space="preserve"> = “Full”, the output should be </w:t>
+      </w:r>
+      <w:proofErr w:type="gramStart"/>
+      <w:r>
+        <w:rPr>
+          <w:rFonts w:eastAsiaTheme="minorEastAsia"/>
+          <w:i/>
+          <w:iCs/>
+        </w:rPr>
+        <w:t>solution(</w:t>
+      </w:r>
+      <w:proofErr w:type="gramEnd"/>
+      <w:r>
+        <w:rPr>
+          <w:rFonts w:eastAsiaTheme="minorEastAsia"/>
+          <w:i/>
+          <w:iCs/>
+        </w:rPr>
+        <w:t xml:space="preserve">season, </w:t>
+      </w:r>
+      <w:proofErr w:type="spellStart"/>
+      <w:r>
+        <w:rPr>
+          <w:rFonts w:eastAsiaTheme="minorEastAsia"/>
+          <w:i/>
+          <w:iCs/>
+        </w:rPr>
+        <w:t>dayCount</w:t>
+      </w:r>
+      <w:proofErr w:type="spellEnd"/>
+      <w:r>
+        <w:rPr>
+          <w:rFonts w:eastAsiaTheme="minorEastAsia"/>
+          <w:i/>
+          <w:iCs/>
+        </w:rPr>
+        <w:t xml:space="preserve">, </w:t>
+      </w:r>
+      <w:proofErr w:type="spellStart"/>
+      <w:r>
+        <w:rPr>
+          <w:rFonts w:eastAsiaTheme="minorEastAsia"/>
+          <w:i/>
+          <w:iCs/>
+        </w:rPr>
+        <w:t>initialPhase</w:t>
+      </w:r>
+      <w:proofErr w:type="spellEnd"/>
+      <w:r>
+        <w:rPr>
+          <w:rFonts w:eastAsiaTheme="minorEastAsia"/>
+          <w:i/>
+          <w:iCs/>
+        </w:rPr>
+        <w:t>) = “Twilight”</w:t>
+      </w:r>
+      <w:r>
+        <w:rPr>
+          <w:rFonts w:eastAsiaTheme="minorEastAsia"/>
+        </w:rPr>
+        <w:t>.</w:t>
+      </w:r>
+    </w:p>
+    <w:p>
+      <w:pPr>
+        <w:ind w:left="720"/>
+        <w:rPr>
+          <w:rFonts w:eastAsiaTheme="minorEastAsia"/>
+        </w:rPr>
+      </w:pPr>
+    </w:p>
+    <w:p>
+      <w:pPr>
+        <w:ind w:left="720"/>
+        <w:rPr>
+          <w:rFonts w:eastAsiaTheme="minorEastAsia"/>
+        </w:rPr>
+      </w:pPr>
+      <w:r>
+        <w:rPr>
+          <w:rFonts w:eastAsiaTheme="minorEastAsia"/>
+        </w:rPr>
+        <w:t>Answer: Question81</w:t>
+      </w:r>
+    </w:p>
+    <w:p>
+      <w:pPr>
+        <w:rPr>
+          <w:rFonts w:eastAsiaTheme="minorEastAsia"/>
+        </w:rPr>
+      </w:pPr>
+    </w:p>
+    <w:p>
+      <w:pPr>
+        <w:pStyle w:val="ListParagraph"/>
+        <w:numPr>
+          <w:ilvl w:val="0"/>
+          <w:numId w:val="1"/>
+        </w:numPr>
+        <w:rPr>
+          <w:rFonts w:eastAsiaTheme="minorEastAsia"/>
+        </w:rPr>
+      </w:pPr>
+      <w:r>
+        <w:rPr>
+          <w:rFonts w:eastAsiaTheme="minorEastAsia"/>
+        </w:rPr>
+        <w:t xml:space="preserve">A spy agency has intercepted fragments of a secret code. Each fragment is represented as a positive integer in an array called </w:t>
+      </w:r>
+      <w:r>
+        <w:rPr>
+          <w:rFonts w:eastAsiaTheme="minorEastAsia"/>
+          <w:i/>
+          <w:iCs/>
+        </w:rPr>
+        <w:t>fragments.</w:t>
+      </w:r>
+      <w:r>
+        <w:rPr>
+          <w:rFonts w:eastAsiaTheme="minorEastAsia"/>
+        </w:rPr>
+        <w:t xml:space="preserve"> Intelligence suggests that the complete access code is a specific number called </w:t>
+      </w:r>
+      <w:proofErr w:type="spellStart"/>
+      <w:r>
+        <w:rPr>
+          <w:rFonts w:eastAsiaTheme="minorEastAsia"/>
+          <w:i/>
+          <w:iCs/>
+        </w:rPr>
+        <w:t>accessCode</w:t>
+      </w:r>
+      <w:proofErr w:type="spellEnd"/>
+      <w:r>
+        <w:rPr>
+          <w:rFonts w:eastAsiaTheme="minorEastAsia"/>
+        </w:rPr>
+        <w:t>.</w:t>
+      </w:r>
+    </w:p>
+    <w:p>
+      <w:pPr>
+        <w:rPr>
+          <w:rFonts w:eastAsiaTheme="minorEastAsia"/>
+        </w:rPr>
+      </w:pPr>
+    </w:p>
+    <w:p>
+      <w:pPr>
+        <w:ind w:left="720"/>
+        <w:rPr>
+          <w:rFonts w:eastAsiaTheme="minorEastAsia"/>
+        </w:rPr>
+      </w:pPr>
+      <w:r>
+        <w:rPr>
+          <w:rFonts w:eastAsiaTheme="minorEastAsia"/>
+        </w:rPr>
+        <w:lastRenderedPageBreak/>
+        <w:t xml:space="preserve">Your mission is to determine how </w:t>
+      </w:r>
+      <w:proofErr w:type="gramStart"/>
+      <w:r>
+        <w:rPr>
+          <w:rFonts w:eastAsiaTheme="minorEastAsia"/>
+        </w:rPr>
+        <w:t>many different ways</w:t>
+      </w:r>
+      <w:proofErr w:type="gramEnd"/>
+      <w:r>
+        <w:rPr>
+          <w:rFonts w:eastAsiaTheme="minorEastAsia"/>
+        </w:rPr>
+        <w:t xml:space="preserve"> the fragments can be paired to form the complete access code. The agency’s cryptography rules states that:</w:t>
+      </w:r>
+    </w:p>
+    <w:p>
+      <w:pPr>
+        <w:pStyle w:val="ListParagraph"/>
+        <w:numPr>
+          <w:ilvl w:val="2"/>
+          <w:numId w:val="15"/>
+        </w:numPr>
+        <w:rPr>
+          <w:rFonts w:eastAsiaTheme="minorEastAsia"/>
+        </w:rPr>
+      </w:pPr>
+      <w:r>
+        <w:rPr>
+          <w:rFonts w:eastAsiaTheme="minorEastAsia"/>
+        </w:rPr>
+        <w:t>When fragments are combined, they are simply placed next to each other (not added mathematically)</w:t>
+      </w:r>
+    </w:p>
+    <w:p>
+      <w:pPr>
+        <w:pStyle w:val="ListParagraph"/>
+        <w:numPr>
+          <w:ilvl w:val="2"/>
+          <w:numId w:val="15"/>
+        </w:numPr>
+        <w:rPr>
+          <w:rFonts w:eastAsiaTheme="minorEastAsia"/>
+        </w:rPr>
+      </w:pPr>
+      <w:r>
+        <w:rPr>
+          <w:rFonts w:eastAsiaTheme="minorEastAsia"/>
+        </w:rPr>
+        <w:t xml:space="preserve">Each specific pair of fragments (by </w:t>
+      </w:r>
+      <w:proofErr w:type="spellStart"/>
+      <w:r>
+        <w:rPr>
+          <w:rFonts w:eastAsiaTheme="minorEastAsia"/>
+        </w:rPr>
+        <w:t>positioni</w:t>
+      </w:r>
+      <w:proofErr w:type="spellEnd"/>
+      <w:r>
+        <w:rPr>
+          <w:rFonts w:eastAsiaTheme="minorEastAsia"/>
+        </w:rPr>
+        <w:t xml:space="preserve"> n the array) counts as a unique combination.</w:t>
+      </w:r>
+    </w:p>
+    <w:p>
+      <w:pPr>
+        <w:pStyle w:val="ListParagraph"/>
+        <w:numPr>
+          <w:ilvl w:val="2"/>
+          <w:numId w:val="15"/>
+        </w:numPr>
+        <w:rPr>
+          <w:rFonts w:eastAsiaTheme="minorEastAsia"/>
+        </w:rPr>
+      </w:pPr>
+      <w:r>
+        <w:rPr>
+          <w:rFonts w:eastAsiaTheme="minorEastAsia"/>
+        </w:rPr>
+        <w:t>The fragments can be used in any order, but each fragment position can only be used once in a combination.</w:t>
+      </w:r>
+    </w:p>
+    <w:p>
+      <w:pPr>
+        <w:rPr>
+          <w:rFonts w:eastAsiaTheme="minorEastAsia"/>
+        </w:rPr>
+      </w:pPr>
+    </w:p>
+    <w:p>
+      <w:pPr>
+        <w:ind w:left="720"/>
+        <w:rPr>
+          <w:rFonts w:eastAsiaTheme="minorEastAsia"/>
+        </w:rPr>
+      </w:pPr>
+      <w:r>
+        <w:rPr>
+          <w:rFonts w:eastAsiaTheme="minorEastAsia"/>
+        </w:rPr>
+        <w:t>For example, if fragment “12” is followed by fragment “34”, the result is “1234”.</w:t>
+      </w:r>
+    </w:p>
+    <w:p>
+      <w:pPr>
+        <w:ind w:left="720"/>
+        <w:rPr>
+          <w:rFonts w:eastAsiaTheme="minorEastAsia"/>
+        </w:rPr>
+      </w:pPr>
+    </w:p>
+    <w:p>
+      <w:pPr>
+        <w:ind w:left="720"/>
+        <w:rPr>
+          <w:rFonts w:eastAsiaTheme="minorEastAsia"/>
+          <w:bCs/>
+        </w:rPr>
+      </w:pPr>
+      <w:r>
+        <w:rPr>
+          <w:rFonts w:eastAsiaTheme="minorEastAsia"/>
+          <w:b/>
+        </w:rPr>
+        <w:t>Example:</w:t>
+      </w:r>
+    </w:p>
+    <w:p>
+      <w:pPr>
+        <w:ind w:left="720"/>
+        <w:rPr>
+          <w:rFonts w:eastAsiaTheme="minorEastAsia"/>
+          <w:bCs/>
+        </w:rPr>
+      </w:pPr>
+    </w:p>
+    <w:p>
+      <w:pPr>
+        <w:ind w:left="720"/>
+        <w:rPr>
+          <w:rFonts w:eastAsiaTheme="minorEastAsia"/>
+          <w:bCs/>
+        </w:rPr>
+      </w:pPr>
+      <w:r>
+        <w:rPr>
+          <w:rFonts w:eastAsiaTheme="minorEastAsia"/>
+          <w:bCs/>
+        </w:rPr>
+        <w:t xml:space="preserve">For </w:t>
+      </w:r>
+      <w:r>
+        <w:rPr>
+          <w:rFonts w:eastAsiaTheme="minorEastAsia"/>
+          <w:bCs/>
+          <w:i/>
+          <w:iCs/>
+        </w:rPr>
+        <w:t>fragments = [1, 212, 12, 12]</w:t>
+      </w:r>
+      <w:r>
+        <w:rPr>
+          <w:rFonts w:eastAsiaTheme="minorEastAsia"/>
+          <w:bCs/>
+        </w:rPr>
+        <w:t xml:space="preserve"> and </w:t>
+      </w:r>
+      <w:proofErr w:type="spellStart"/>
+      <w:r>
+        <w:rPr>
+          <w:rFonts w:eastAsiaTheme="minorEastAsia"/>
+          <w:bCs/>
+          <w:i/>
+          <w:iCs/>
+        </w:rPr>
+        <w:t>accessCode</w:t>
+      </w:r>
+      <w:proofErr w:type="spellEnd"/>
+      <w:r>
+        <w:rPr>
+          <w:rFonts w:eastAsiaTheme="minorEastAsia"/>
+          <w:bCs/>
+          <w:i/>
+          <w:iCs/>
+        </w:rPr>
+        <w:t xml:space="preserve"> = 1212</w:t>
+      </w:r>
+      <w:r>
+        <w:rPr>
+          <w:rFonts w:eastAsiaTheme="minorEastAsia"/>
+          <w:bCs/>
+        </w:rPr>
+        <w:t xml:space="preserve">, the output should be </w:t>
+      </w:r>
+      <w:proofErr w:type="gramStart"/>
+      <w:r>
+        <w:rPr>
+          <w:rFonts w:eastAsiaTheme="minorEastAsia"/>
+          <w:bCs/>
+          <w:i/>
+          <w:iCs/>
+        </w:rPr>
+        <w:t>solution(</w:t>
+      </w:r>
+      <w:proofErr w:type="spellStart"/>
+      <w:proofErr w:type="gramEnd"/>
+      <w:r>
+        <w:rPr>
+          <w:rFonts w:eastAsiaTheme="minorEastAsia"/>
+          <w:bCs/>
+          <w:i/>
+          <w:iCs/>
+        </w:rPr>
+        <w:t>fragmnets</w:t>
+      </w:r>
+      <w:proofErr w:type="spellEnd"/>
+      <w:r>
+        <w:rPr>
+          <w:rFonts w:eastAsiaTheme="minorEastAsia"/>
+          <w:bCs/>
+          <w:i/>
+          <w:iCs/>
+        </w:rPr>
+        <w:t xml:space="preserve">, </w:t>
+      </w:r>
+      <w:proofErr w:type="spellStart"/>
+      <w:r>
+        <w:rPr>
+          <w:rFonts w:eastAsiaTheme="minorEastAsia"/>
+          <w:bCs/>
+          <w:i/>
+          <w:iCs/>
+        </w:rPr>
+        <w:t>accessCode</w:t>
+      </w:r>
+      <w:proofErr w:type="spellEnd"/>
+      <w:r>
+        <w:rPr>
+          <w:rFonts w:eastAsiaTheme="minorEastAsia"/>
+          <w:bCs/>
+          <w:i/>
+          <w:iCs/>
+        </w:rPr>
+        <w:t>) = 3.</w:t>
+      </w:r>
+    </w:p>
+    <w:p>
+      <w:pPr>
+        <w:ind w:left="720"/>
+        <w:rPr>
+          <w:rFonts w:eastAsiaTheme="minorEastAsia"/>
+          <w:bCs/>
+        </w:rPr>
+      </w:pPr>
+    </w:p>
+    <w:p>
+      <w:pPr>
+        <w:ind w:left="720"/>
+        <w:rPr>
+          <w:rFonts w:eastAsiaTheme="minorEastAsia"/>
+          <w:bCs/>
+        </w:rPr>
+      </w:pPr>
+      <w:r>
+        <w:rPr>
+          <w:rFonts w:eastAsiaTheme="minorEastAsia"/>
+          <w:bCs/>
+        </w:rPr>
+        <w:t>Answer: Question82</w:t>
+      </w:r>
+    </w:p>
+    <w:p>
+      <w:pPr>
+        <w:rPr>
+          <w:rFonts w:eastAsiaTheme="minorEastAsia"/>
+          <w:bCs/>
+        </w:rPr>
+      </w:pPr>
+    </w:p>
+    <w:p>
+      <w:pPr>
+        <w:pStyle w:val="ListParagraph"/>
+        <w:numPr>
+          <w:ilvl w:val="0"/>
+          <w:numId w:val="1"/>
+        </w:numPr>
+        <w:rPr>
+          <w:rFonts w:eastAsiaTheme="minorEastAsia"/>
+          <w:bCs/>
+        </w:rPr>
+      </w:pPr>
+      <w:r>
+        <w:rPr>
+          <w:rFonts w:eastAsiaTheme="minorEastAsia"/>
+          <w:bCs/>
+        </w:rPr>
+        <w:t xml:space="preserve">A space station network has two major hubs, </w:t>
+      </w:r>
+      <w:r>
+        <w:rPr>
+          <w:rFonts w:eastAsiaTheme="minorEastAsia"/>
+          <w:bCs/>
+          <w:i/>
+          <w:iCs/>
+        </w:rPr>
+        <w:t>Alpha</w:t>
+      </w:r>
+      <w:r>
+        <w:rPr>
+          <w:rFonts w:eastAsiaTheme="minorEastAsia"/>
+          <w:bCs/>
+        </w:rPr>
+        <w:t xml:space="preserve"> and </w:t>
+      </w:r>
+      <w:r>
+        <w:rPr>
+          <w:rFonts w:eastAsiaTheme="minorEastAsia"/>
+          <w:bCs/>
+          <w:i/>
+          <w:iCs/>
+        </w:rPr>
+        <w:t>Beta</w:t>
+      </w:r>
+      <w:r>
+        <w:rPr>
+          <w:rFonts w:eastAsiaTheme="minorEastAsia"/>
+          <w:bCs/>
+        </w:rPr>
+        <w:t xml:space="preserve">, connected by shuttle services. Shuttles from </w:t>
+      </w:r>
+      <w:r>
+        <w:rPr>
+          <w:rFonts w:eastAsiaTheme="minorEastAsia"/>
+          <w:bCs/>
+          <w:i/>
+          <w:iCs/>
+        </w:rPr>
+        <w:t>Alpha</w:t>
+      </w:r>
+      <w:r>
+        <w:rPr>
+          <w:rFonts w:eastAsiaTheme="minorEastAsia"/>
+          <w:bCs/>
+        </w:rPr>
+        <w:t xml:space="preserve"> to </w:t>
+      </w:r>
+      <w:r>
+        <w:rPr>
+          <w:rFonts w:eastAsiaTheme="minorEastAsia"/>
+          <w:bCs/>
+          <w:i/>
+          <w:iCs/>
+        </w:rPr>
+        <w:t>Beta</w:t>
+      </w:r>
+      <w:r>
+        <w:rPr>
+          <w:rFonts w:eastAsiaTheme="minorEastAsia"/>
+          <w:bCs/>
+        </w:rPr>
+        <w:t xml:space="preserve"> take </w:t>
+      </w:r>
+      <w:proofErr w:type="gramStart"/>
+      <w:r>
+        <w:rPr>
+          <w:rFonts w:eastAsiaTheme="minorEastAsia"/>
+          <w:bCs/>
+          <w:i/>
+          <w:iCs/>
+        </w:rPr>
+        <w:t>100</w:t>
+      </w:r>
+      <w:r>
+        <w:rPr>
+          <w:rFonts w:eastAsiaTheme="minorEastAsia"/>
+          <w:bCs/>
+        </w:rPr>
+        <w:t xml:space="preserve"> time</w:t>
+      </w:r>
+      <w:proofErr w:type="gramEnd"/>
+      <w:r>
+        <w:rPr>
+          <w:rFonts w:eastAsiaTheme="minorEastAsia"/>
+          <w:bCs/>
+        </w:rPr>
+        <w:t xml:space="preserve"> units and depart according to a sorted integer array </w:t>
+      </w:r>
+      <w:r>
+        <w:rPr>
+          <w:rFonts w:eastAsiaTheme="minorEastAsia"/>
+          <w:bCs/>
+          <w:i/>
+          <w:iCs/>
+        </w:rPr>
+        <w:t>alpha2beta</w:t>
+      </w:r>
+      <w:r>
+        <w:rPr>
+          <w:rFonts w:eastAsiaTheme="minorEastAsia"/>
+          <w:bCs/>
+        </w:rPr>
+        <w:t xml:space="preserve">. Similarly, shuttles from </w:t>
+      </w:r>
+      <w:r>
+        <w:rPr>
+          <w:rFonts w:eastAsiaTheme="minorEastAsia"/>
+          <w:bCs/>
+          <w:i/>
+          <w:iCs/>
+        </w:rPr>
+        <w:t>Beta</w:t>
+      </w:r>
+      <w:r>
+        <w:rPr>
+          <w:rFonts w:eastAsiaTheme="minorEastAsia"/>
+          <w:bCs/>
+        </w:rPr>
+        <w:t xml:space="preserve"> to </w:t>
+      </w:r>
+      <w:r>
+        <w:rPr>
+          <w:rFonts w:eastAsiaTheme="minorEastAsia"/>
+          <w:bCs/>
+          <w:i/>
+          <w:iCs/>
+        </w:rPr>
+        <w:t>Alpha</w:t>
+      </w:r>
+      <w:r>
+        <w:rPr>
+          <w:rFonts w:eastAsiaTheme="minorEastAsia"/>
+          <w:bCs/>
+        </w:rPr>
+        <w:t xml:space="preserve"> also take </w:t>
+      </w:r>
+      <w:proofErr w:type="gramStart"/>
+      <w:r>
+        <w:rPr>
+          <w:rFonts w:eastAsiaTheme="minorEastAsia"/>
+          <w:bCs/>
+          <w:i/>
+          <w:iCs/>
+        </w:rPr>
+        <w:t>100</w:t>
+      </w:r>
+      <w:r>
+        <w:rPr>
+          <w:rFonts w:eastAsiaTheme="minorEastAsia"/>
+          <w:bCs/>
+        </w:rPr>
+        <w:t xml:space="preserve"> time</w:t>
+      </w:r>
+      <w:proofErr w:type="gramEnd"/>
+      <w:r>
+        <w:rPr>
+          <w:rFonts w:eastAsiaTheme="minorEastAsia"/>
+          <w:bCs/>
+        </w:rPr>
+        <w:t xml:space="preserve"> units and depart at times specified in a sorted integer array</w:t>
+      </w:r>
+      <w:r>
+        <w:rPr>
+          <w:rFonts w:eastAsiaTheme="minorEastAsia"/>
+          <w:bCs/>
+          <w:i/>
+          <w:iCs/>
+        </w:rPr>
+        <w:t xml:space="preserve"> beta2alpha</w:t>
+      </w:r>
+      <w:r>
+        <w:rPr>
+          <w:rFonts w:eastAsiaTheme="minorEastAsia"/>
+          <w:bCs/>
+        </w:rPr>
+        <w:t>.</w:t>
+      </w:r>
+    </w:p>
+    <w:p>
+      <w:pPr>
+        <w:rPr>
+          <w:rFonts w:eastAsiaTheme="minorEastAsia"/>
+          <w:bCs/>
+        </w:rPr>
+      </w:pPr>
+    </w:p>
+    <w:p>
+      <w:pPr>
+        <w:ind w:left="720"/>
+        <w:rPr>
+          <w:rFonts w:eastAsiaTheme="minorEastAsia"/>
+          <w:bCs/>
+        </w:rPr>
+      </w:pPr>
+      <w:r>
+        <w:rPr>
+          <w:rFonts w:eastAsiaTheme="minorEastAsia"/>
+          <w:bCs/>
+        </w:rPr>
+        <w:t xml:space="preserve">You need to complete </w:t>
+      </w:r>
+      <w:r>
+        <w:rPr>
+          <w:rFonts w:eastAsiaTheme="minorEastAsia"/>
+          <w:bCs/>
+          <w:i/>
+          <w:iCs/>
+        </w:rPr>
+        <w:t>missions</w:t>
+      </w:r>
+      <w:r>
+        <w:rPr>
+          <w:rFonts w:eastAsiaTheme="minorEastAsia"/>
+          <w:bCs/>
+        </w:rPr>
+        <w:t xml:space="preserve"> where each mission requires traveling from </w:t>
+      </w:r>
+      <w:r>
+        <w:rPr>
+          <w:rFonts w:eastAsiaTheme="minorEastAsia"/>
+          <w:bCs/>
+          <w:i/>
+          <w:iCs/>
+        </w:rPr>
+        <w:t xml:space="preserve">Alpha </w:t>
+      </w:r>
+      <w:r>
+        <w:rPr>
+          <w:rFonts w:eastAsiaTheme="minorEastAsia"/>
+          <w:bCs/>
+        </w:rPr>
+        <w:t xml:space="preserve">to </w:t>
+      </w:r>
+      <w:r>
+        <w:rPr>
+          <w:rFonts w:eastAsiaTheme="minorEastAsia"/>
+          <w:bCs/>
+          <w:i/>
+          <w:iCs/>
+        </w:rPr>
+        <w:t>Beta</w:t>
+      </w:r>
+      <w:r>
+        <w:rPr>
+          <w:rFonts w:eastAsiaTheme="minorEastAsia"/>
+          <w:bCs/>
+        </w:rPr>
+        <w:t xml:space="preserve"> and back to </w:t>
+      </w:r>
+      <w:r>
+        <w:rPr>
+          <w:rFonts w:eastAsiaTheme="minorEastAsia"/>
+          <w:bCs/>
+          <w:i/>
+          <w:iCs/>
+        </w:rPr>
+        <w:t>Alpha</w:t>
+      </w:r>
+      <w:r>
+        <w:rPr>
+          <w:rFonts w:eastAsiaTheme="minorEastAsia"/>
+          <w:bCs/>
+        </w:rPr>
+        <w:t>. Calculate the time unit when you will complete all missions, assuming you always take the earliest available shuttle.</w:t>
+      </w:r>
+    </w:p>
+    <w:p>
+      <w:pPr>
+        <w:ind w:left="720"/>
+        <w:rPr>
+          <w:rFonts w:eastAsiaTheme="minorEastAsia"/>
+          <w:bCs/>
+        </w:rPr>
+      </w:pPr>
+    </w:p>
+    <w:p>
+      <w:pPr>
+        <w:ind w:left="720"/>
+        <w:rPr>
+          <w:rFonts w:eastAsiaTheme="minorEastAsia"/>
+          <w:bCs/>
+        </w:rPr>
+      </w:pPr>
+      <w:r>
+        <w:rPr>
+          <w:rFonts w:eastAsiaTheme="minorEastAsia"/>
+          <w:bCs/>
+        </w:rPr>
+        <w:t xml:space="preserve">It is guaranteed that it is possible to complete all </w:t>
+      </w:r>
+      <w:r>
+        <w:rPr>
+          <w:rFonts w:eastAsiaTheme="minorEastAsia"/>
+          <w:bCs/>
+          <w:i/>
+          <w:iCs/>
+        </w:rPr>
+        <w:t>missions</w:t>
+      </w:r>
+      <w:r>
+        <w:rPr>
+          <w:rFonts w:eastAsiaTheme="minorEastAsia"/>
+          <w:bCs/>
+        </w:rPr>
+        <w:t xml:space="preserve"> using the provided shuttle schedules. </w:t>
+      </w:r>
+    </w:p>
+    <w:p>
+      <w:pPr>
+        <w:ind w:left="720"/>
+        <w:rPr>
+          <w:rFonts w:eastAsiaTheme="minorEastAsia"/>
+          <w:bCs/>
+        </w:rPr>
+      </w:pPr>
+    </w:p>
+    <w:p>
+      <w:pPr>
+        <w:ind w:left="720"/>
+        <w:rPr>
+          <w:rFonts w:eastAsiaTheme="minorEastAsia"/>
+          <w:b/>
+        </w:rPr>
+      </w:pPr>
+      <w:r>
+        <w:rPr>
+          <w:rFonts w:eastAsiaTheme="minorEastAsia"/>
+          <w:b/>
+        </w:rPr>
+        <w:t>All times are measured in time units from the start of your journey.</w:t>
+      </w:r>
+    </w:p>
+    <w:p>
+      <w:pPr>
+        <w:ind w:left="720"/>
+        <w:rPr>
+          <w:rFonts w:eastAsiaTheme="minorEastAsia"/>
+          <w:b/>
+        </w:rPr>
+      </w:pPr>
+    </w:p>
+    <w:p>
+      <w:pPr>
+        <w:ind w:left="720"/>
+        <w:rPr>
+          <w:rFonts w:eastAsiaTheme="minorEastAsia"/>
+          <w:bCs/>
+        </w:rPr>
+      </w:pPr>
+      <w:r>
+        <w:rPr>
+          <w:rFonts w:eastAsiaTheme="minorEastAsia"/>
+          <w:b/>
+        </w:rPr>
+        <w:t>Example:</w:t>
+      </w:r>
+    </w:p>
+    <w:p>
+      <w:pPr>
+        <w:ind w:left="720"/>
+        <w:rPr>
+          <w:rFonts w:eastAsiaTheme="minorEastAsia"/>
+          <w:bCs/>
+        </w:rPr>
+      </w:pPr>
+    </w:p>
+    <w:p>
+      <w:pPr>
+        <w:ind w:left="720"/>
+        <w:rPr>
+          <w:rFonts w:eastAsiaTheme="minorEastAsia"/>
+          <w:bCs/>
+        </w:rPr>
+      </w:pPr>
+      <w:r>
+        <w:rPr>
+          <w:rFonts w:eastAsiaTheme="minorEastAsia"/>
+          <w:bCs/>
+        </w:rPr>
+        <w:t xml:space="preserve">For </w:t>
+      </w:r>
+      <w:r>
+        <w:rPr>
+          <w:rFonts w:eastAsiaTheme="minorEastAsia"/>
+          <w:bCs/>
+          <w:i/>
+          <w:iCs/>
+        </w:rPr>
+        <w:t>alpha2beta = [0, 200, 500]</w:t>
+      </w:r>
+      <w:r>
+        <w:rPr>
+          <w:rFonts w:eastAsiaTheme="minorEastAsia"/>
+          <w:bCs/>
+        </w:rPr>
+        <w:t xml:space="preserve"> </w:t>
+      </w:r>
+      <w:r>
+        <w:rPr>
+          <w:rFonts w:eastAsiaTheme="minorEastAsia"/>
+          <w:bCs/>
+          <w:i/>
+          <w:iCs/>
+        </w:rPr>
+        <w:t>beta2alpha = [99, 210, 450]</w:t>
+      </w:r>
+      <w:r>
+        <w:rPr>
+          <w:rFonts w:eastAsiaTheme="minorEastAsia"/>
+          <w:bCs/>
+        </w:rPr>
+        <w:t xml:space="preserve">, and </w:t>
+      </w:r>
+      <w:r>
+        <w:rPr>
+          <w:rFonts w:eastAsiaTheme="minorEastAsia"/>
+          <w:bCs/>
+          <w:i/>
+          <w:iCs/>
+        </w:rPr>
+        <w:t>missions = 1</w:t>
+      </w:r>
+      <w:r>
+        <w:rPr>
+          <w:rFonts w:eastAsiaTheme="minorEastAsia"/>
+          <w:bCs/>
+        </w:rPr>
+        <w:t xml:space="preserve">, the output should be </w:t>
+      </w:r>
+      <w:proofErr w:type="gramStart"/>
+      <w:r>
+        <w:rPr>
+          <w:rFonts w:eastAsiaTheme="minorEastAsia"/>
+          <w:bCs/>
+          <w:i/>
+          <w:iCs/>
+        </w:rPr>
+        <w:t>solution(</w:t>
+      </w:r>
+      <w:proofErr w:type="gramEnd"/>
+      <w:r>
+        <w:rPr>
+          <w:rFonts w:eastAsiaTheme="minorEastAsia"/>
+          <w:bCs/>
+          <w:i/>
+          <w:iCs/>
+        </w:rPr>
+        <w:t>alpha2beta, beta2alpha, missions) = 310.</w:t>
+      </w:r>
+    </w:p>
+    <w:p>
+      <w:pPr>
+        <w:ind w:left="720"/>
+        <w:rPr>
+          <w:rFonts w:eastAsiaTheme="minorEastAsia"/>
+          <w:bCs/>
+        </w:rPr>
+      </w:pPr>
+    </w:p>
+    <w:p>
+      <w:pPr>
+        <w:ind w:left="720"/>
+        <w:rPr>
+          <w:rFonts w:eastAsiaTheme="minorEastAsia"/>
+          <w:bCs/>
+        </w:rPr>
+      </w:pPr>
+      <w:r>
+        <w:rPr>
+          <w:rFonts w:eastAsiaTheme="minorEastAsia"/>
+          <w:bCs/>
+        </w:rPr>
+        <w:t>Answer: Question83</w:t>
+      </w:r>
+    </w:p>
+    <w:p>
+      <w:pPr>
+        <w:rPr>
+          <w:rFonts w:eastAsiaTheme="minorEastAsia"/>
+          <w:bCs/>
+        </w:rPr>
+      </w:pPr>
+    </w:p>
+    <w:p>
+      <w:pPr>
+        <w:pStyle w:val="ListParagraph"/>
+        <w:numPr>
+          <w:ilvl w:val="0"/>
+          <w:numId w:val="1"/>
+        </w:numPr>
+        <w:rPr>
+          <w:rFonts w:eastAsiaTheme="minorEastAsia"/>
+          <w:bCs/>
+        </w:rPr>
+      </w:pPr>
+      <w:r>
+        <w:rPr>
+          <w:rFonts w:eastAsiaTheme="minorEastAsia"/>
+          <w:bCs/>
+        </w:rPr>
+        <w:t>A mountaineer is studying a mountain range with several peaks of different heights The peaks are arranged in a line, numbered from 0 onwards. Due to an optical illusion, the mountaineer can only compare peaks that are at least a certain number of positions apart.</w:t>
+      </w:r>
+    </w:p>
+    <w:p>
+      <w:pPr>
+        <w:rPr>
+          <w:rFonts w:eastAsiaTheme="minorEastAsia"/>
+          <w:bCs/>
+        </w:rPr>
+      </w:pPr>
+    </w:p>
+    <w:p>
+      <w:pPr>
+        <w:ind w:left="720"/>
+        <w:rPr>
+          <w:rFonts w:eastAsiaTheme="minorEastAsia"/>
+          <w:bCs/>
+        </w:rPr>
+      </w:pPr>
+      <w:r>
+        <w:rPr>
+          <w:rFonts w:eastAsiaTheme="minorEastAsia"/>
+          <w:bCs/>
+        </w:rPr>
+        <w:t xml:space="preserve">Given the heights of all peaks in meters as </w:t>
+      </w:r>
+      <w:r>
+        <w:rPr>
+          <w:rFonts w:eastAsiaTheme="minorEastAsia"/>
+          <w:bCs/>
+          <w:i/>
+          <w:iCs/>
+        </w:rPr>
+        <w:t>heights</w:t>
+      </w:r>
+      <w:r>
+        <w:rPr>
+          <w:rFonts w:eastAsiaTheme="minorEastAsia"/>
+          <w:bCs/>
+        </w:rPr>
+        <w:t xml:space="preserve"> and the minimum viewing distance </w:t>
+      </w:r>
+      <w:proofErr w:type="spellStart"/>
+      <w:r>
+        <w:rPr>
+          <w:rFonts w:eastAsiaTheme="minorEastAsia"/>
+          <w:bCs/>
+          <w:i/>
+          <w:iCs/>
+        </w:rPr>
+        <w:t>viewingGap</w:t>
+      </w:r>
+      <w:proofErr w:type="spellEnd"/>
+      <w:r>
+        <w:rPr>
+          <w:rFonts w:eastAsiaTheme="minorEastAsia"/>
+          <w:bCs/>
+        </w:rPr>
+        <w:t>, help the mountaineer find the most similar pair of peaks (the pair with the smallest height difference) that can be compared.</w:t>
+      </w:r>
+    </w:p>
+    <w:p>
+      <w:pPr>
+        <w:ind w:left="720"/>
+        <w:rPr>
+          <w:rFonts w:eastAsiaTheme="minorEastAsia"/>
+          <w:bCs/>
+        </w:rPr>
+      </w:pPr>
+    </w:p>
+    <w:p>
+      <w:pPr>
+        <w:ind w:left="720"/>
+        <w:rPr>
+          <w:rFonts w:eastAsiaTheme="minorEastAsia"/>
+          <w:bCs/>
+        </w:rPr>
+      </w:pPr>
+      <w:r>
+        <w:rPr>
+          <w:rFonts w:eastAsiaTheme="minorEastAsia"/>
+          <w:bCs/>
+        </w:rPr>
+        <w:t xml:space="preserve">In other words, determine the minimum value of </w:t>
+      </w:r>
+      <m:oMath>
+        <m:d>
+          <m:dPr>
+            <m:begChr m:val="|"/>
+            <m:endChr m:val="|"/>
+            <m:ctrlPr>
+              <w:rPr>
+                <w:rFonts w:ascii="Cambria Math" w:eastAsiaTheme="minorEastAsia" w:hAnsi="Cambria Math"/>
+                <w:bCs/>
+                <w:i/>
+              </w:rPr>
+            </m:ctrlPr>
+          </m:dPr>
+          <m:e>
+            <m:r>
+              <w:rPr>
+                <w:rFonts w:ascii="Cambria Math" w:eastAsiaTheme="minorEastAsia" w:hAnsi="Cambria Math"/>
+              </w:rPr>
+              <m:t xml:space="preserve"> heights</m:t>
+            </m:r>
+            <m:d>
+              <m:dPr>
+                <m:begChr m:val="["/>
+                <m:endChr m:val="]"/>
+                <m:ctrlPr>
+                  <w:rPr>
+                    <w:rFonts w:ascii="Cambria Math" w:eastAsiaTheme="minorEastAsia" w:hAnsi="Cambria Math"/>
+                    <w:bCs/>
+                    <w:i/>
+                  </w:rPr>
+                </m:ctrlPr>
+              </m:dPr>
+              <m:e>
+                <m:r>
+                  <w:rPr>
+                    <w:rFonts w:ascii="Cambria Math" w:eastAsiaTheme="minorEastAsia" w:hAnsi="Cambria Math"/>
+                  </w:rPr>
+                  <m:t>a</m:t>
+                </m:r>
+              </m:e>
+            </m:d>
+            <m:r>
+              <w:rPr>
+                <w:rFonts w:ascii="Cambria Math" w:eastAsiaTheme="minorEastAsia" w:hAnsi="Cambria Math"/>
+              </w:rPr>
+              <m:t>-heights</m:t>
+            </m:r>
+            <m:d>
+              <m:dPr>
+                <m:begChr m:val="["/>
+                <m:endChr m:val="]"/>
+                <m:ctrlPr>
+                  <w:rPr>
+                    <w:rFonts w:ascii="Cambria Math" w:eastAsiaTheme="minorEastAsia" w:hAnsi="Cambria Math"/>
+                    <w:bCs/>
+                    <w:i/>
+                  </w:rPr>
+                </m:ctrlPr>
+              </m:dPr>
+              <m:e>
+                <m:r>
+                  <w:rPr>
+                    <w:rFonts w:ascii="Cambria Math" w:eastAsiaTheme="minorEastAsia" w:hAnsi="Cambria Math"/>
+                  </w:rPr>
+                  <m:t>b</m:t>
+                </m:r>
+              </m:e>
+            </m:d>
+          </m:e>
+        </m:d>
+      </m:oMath>
+      <w:r>
+        <w:rPr>
+          <w:rFonts w:eastAsiaTheme="minorEastAsia"/>
+          <w:bCs/>
+        </w:rPr>
+        <w:t xml:space="preserve">, where </w:t>
+      </w:r>
+      <m:oMath>
+        <m:d>
+          <m:dPr>
+            <m:begChr m:val="|"/>
+            <m:endChr m:val="|"/>
+            <m:ctrlPr>
+              <w:rPr>
+                <w:rFonts w:ascii="Cambria Math" w:eastAsiaTheme="minorEastAsia" w:hAnsi="Cambria Math"/>
+                <w:bCs/>
+                <w:i/>
+              </w:rPr>
+            </m:ctrlPr>
+          </m:dPr>
+          <m:e>
+            <m:r>
+              <w:rPr>
+                <w:rFonts w:ascii="Cambria Math" w:eastAsiaTheme="minorEastAsia" w:hAnsi="Cambria Math"/>
+              </w:rPr>
+              <m:t>a-b</m:t>
+            </m:r>
+          </m:e>
+        </m:d>
+        <m:r>
+          <w:rPr>
+            <w:rFonts w:ascii="Cambria Math" w:eastAsiaTheme="minorEastAsia" w:hAnsi="Cambria Math"/>
+          </w:rPr>
+          <m:t>≥viewingGap</m:t>
+        </m:r>
+      </m:oMath>
+      <w:r>
+        <w:rPr>
+          <w:rFonts w:eastAsiaTheme="minorEastAsia"/>
+          <w:bCs/>
+        </w:rPr>
+        <w:t>.</w:t>
+      </w:r>
+    </w:p>
+    <w:p>
+      <w:pPr>
+        <w:ind w:left="720"/>
+        <w:rPr>
+          <w:rFonts w:eastAsiaTheme="minorEastAsia"/>
+          <w:bCs/>
+        </w:rPr>
+      </w:pPr>
+    </w:p>
+    <w:p>
+      <w:pPr>
+        <w:ind w:left="720"/>
+        <w:rPr>
+          <w:rFonts w:eastAsiaTheme="minorEastAsia"/>
+          <w:bCs/>
+        </w:rPr>
+      </w:pPr>
+      <w:r>
+        <w:rPr>
+          <w:rFonts w:eastAsiaTheme="minorEastAsia"/>
+          <w:b/>
+        </w:rPr>
+        <w:t>Example:</w:t>
+      </w:r>
+    </w:p>
+    <w:p>
+      <w:pPr>
+        <w:ind w:left="720"/>
+        <w:rPr>
+          <w:rFonts w:eastAsiaTheme="minorEastAsia"/>
+          <w:bCs/>
+        </w:rPr>
+      </w:pPr>
+    </w:p>
+    <w:p>
+      <w:pPr>
+        <w:ind w:left="720"/>
+        <w:rPr>
+          <w:rFonts w:eastAsiaTheme="minorEastAsia"/>
+          <w:bCs/>
+        </w:rPr>
+      </w:pPr>
+      <w:r>
+        <w:rPr>
+          <w:rFonts w:eastAsiaTheme="minorEastAsia"/>
+          <w:bCs/>
+        </w:rPr>
+        <w:t xml:space="preserve">For </w:t>
+      </w:r>
+      <w:r>
+        <w:rPr>
+          <w:rFonts w:eastAsiaTheme="minorEastAsia"/>
+          <w:bCs/>
+          <w:i/>
+          <w:iCs/>
+        </w:rPr>
+        <w:t>heights = [1,5,4,10,9]</w:t>
+      </w:r>
+      <w:r>
+        <w:rPr>
+          <w:rFonts w:eastAsiaTheme="minorEastAsia"/>
+          <w:bCs/>
+        </w:rPr>
+        <w:t xml:space="preserve"> and </w:t>
+      </w:r>
+      <w:proofErr w:type="spellStart"/>
+      <w:r>
+        <w:rPr>
+          <w:rFonts w:eastAsiaTheme="minorEastAsia"/>
+          <w:bCs/>
+          <w:i/>
+          <w:iCs/>
+        </w:rPr>
+        <w:t>viewingGap</w:t>
+      </w:r>
+      <w:proofErr w:type="spellEnd"/>
+      <w:r>
+        <w:rPr>
+          <w:rFonts w:eastAsiaTheme="minorEastAsia"/>
+          <w:bCs/>
+          <w:i/>
+          <w:iCs/>
+        </w:rPr>
+        <w:t xml:space="preserve"> = 3</w:t>
+      </w:r>
+      <w:r>
+        <w:rPr>
+          <w:rFonts w:eastAsiaTheme="minorEastAsia"/>
+          <w:bCs/>
+        </w:rPr>
+        <w:t xml:space="preserve">, the output should be </w:t>
+      </w:r>
+      <w:proofErr w:type="gramStart"/>
+      <w:r>
+        <w:rPr>
+          <w:rFonts w:eastAsiaTheme="minorEastAsia"/>
+          <w:bCs/>
+          <w:i/>
+          <w:iCs/>
+        </w:rPr>
+        <w:t>solution(</w:t>
+      </w:r>
+      <w:proofErr w:type="gramEnd"/>
+      <w:r>
+        <w:rPr>
+          <w:rFonts w:eastAsiaTheme="minorEastAsia"/>
+          <w:bCs/>
+          <w:i/>
+          <w:iCs/>
+        </w:rPr>
+        <w:t xml:space="preserve">heights, </w:t>
+      </w:r>
+      <w:proofErr w:type="spellStart"/>
+      <w:r>
+        <w:rPr>
+          <w:rFonts w:eastAsiaTheme="minorEastAsia"/>
+          <w:bCs/>
+          <w:i/>
+          <w:iCs/>
+        </w:rPr>
+        <w:t>viewingGap</w:t>
+      </w:r>
+      <w:proofErr w:type="spellEnd"/>
+      <w:r>
+        <w:rPr>
+          <w:rFonts w:eastAsiaTheme="minorEastAsia"/>
+          <w:bCs/>
+          <w:i/>
+          <w:iCs/>
+        </w:rPr>
+        <w:t>) = 4.</w:t>
+      </w:r>
+    </w:p>
+    <w:p>
+      <w:pPr>
+        <w:ind w:left="720"/>
+        <w:rPr>
+          <w:rFonts w:eastAsiaTheme="minorEastAsia"/>
+          <w:bCs/>
+        </w:rPr>
+      </w:pPr>
+    </w:p>
+    <w:p>
+      <w:pPr>
+        <w:ind w:left="720"/>
+        <w:rPr>
+          <w:rFonts w:eastAsiaTheme="minorEastAsia"/>
+          <w:bCs/>
+        </w:rPr>
+      </w:pPr>
+      <w:r>
+        <w:rPr>
+          <w:rFonts w:eastAsiaTheme="minorEastAsia"/>
+          <w:bCs/>
+        </w:rPr>
+        <w:t>Answer: Question84</w:t>
+      </w:r>
     </w:p>
     <w:sectPr>
       <w:pgSz w:w="12240" w:h="15840"/>

</xml_diff>

<commit_message>
Updated JPMC Hackerrank and Codesignal questions
</commit_message>
<xml_diff>
--- a/src/main/resources/capitalone/codesignal/swe/CodeSignal_Questions_SWE.docx
+++ b/src/main/resources/capitalone/codesignal/swe/CodeSignal_Questions_SWE.docx
@@ -27555,6 +27555,402 @@
           <w:bCs/>
         </w:rPr>
         <w:t>Answer: Question84</w:t>
+      </w:r>
+    </w:p>
+    <w:p>
+      <w:pPr>
+        <w:rPr>
+          <w:rFonts w:eastAsiaTheme="minorEastAsia"/>
+          <w:bCs/>
+        </w:rPr>
+      </w:pPr>
+    </w:p>
+    <w:p>
+      <w:pPr>
+        <w:pStyle w:val="ListParagraph"/>
+        <w:numPr>
+          <w:ilvl w:val="0"/>
+          <w:numId w:val="1"/>
+        </w:numPr>
+        <w:rPr>
+          <w:rFonts w:eastAsiaTheme="minorEastAsia"/>
+          <w:bCs/>
+        </w:rPr>
+      </w:pPr>
+      <w:r>
+        <w:rPr>
+          <w:rFonts w:eastAsiaTheme="minorEastAsia"/>
+          <w:bCs/>
+        </w:rPr>
+        <w:t xml:space="preserve">You are managing a row of building structures with varying heights represented by an array </w:t>
+      </w:r>
+      <w:proofErr w:type="gramStart"/>
+      <w:r>
+        <w:rPr>
+          <w:rFonts w:eastAsiaTheme="minorEastAsia"/>
+          <w:bCs/>
+          <w:i/>
+          <w:iCs/>
+        </w:rPr>
+        <w:t>structures</w:t>
+      </w:r>
+      <w:proofErr w:type="gramEnd"/>
+      <w:r>
+        <w:rPr>
+          <w:rFonts w:eastAsiaTheme="minorEastAsia"/>
+          <w:bCs/>
+        </w:rPr>
+        <w:t xml:space="preserve">. You want to transform these structures into harmonious pattern where each structure differs from its adjacent neighbors by exactly one unit in height, forming either an ascending or descending sequence. </w:t>
+      </w:r>
+    </w:p>
+    <w:p>
+      <w:pPr>
+        <w:rPr>
+          <w:rFonts w:eastAsiaTheme="minorEastAsia"/>
+          <w:bCs/>
+        </w:rPr>
+      </w:pPr>
+    </w:p>
+    <w:p>
+      <w:pPr>
+        <w:ind w:left="720"/>
+        <w:rPr>
+          <w:rFonts w:eastAsiaTheme="minorEastAsia"/>
+          <w:bCs/>
+        </w:rPr>
+      </w:pPr>
+      <w:r>
+        <w:rPr>
+          <w:rFonts w:eastAsiaTheme="minorEastAsia"/>
+          <w:bCs/>
+        </w:rPr>
+        <w:t>To modify the structures, you can only add one unit of height to any structure in a single operation. Your goal is to determine the minimum number of operations needed to achieve either an ascending or descending stepwise pattern – whichever requires fewer operations.</w:t>
+      </w:r>
+    </w:p>
+    <w:p>
+      <w:pPr>
+        <w:ind w:left="720"/>
+        <w:rPr>
+          <w:rFonts w:eastAsiaTheme="minorEastAsia"/>
+          <w:bCs/>
+        </w:rPr>
+      </w:pPr>
+    </w:p>
+    <w:p>
+      <w:pPr>
+        <w:ind w:left="720"/>
+        <w:rPr>
+          <w:rFonts w:eastAsiaTheme="minorEastAsia"/>
+          <w:bCs/>
+        </w:rPr>
+      </w:pPr>
+      <w:r>
+        <w:rPr>
+          <w:rFonts w:eastAsiaTheme="minorEastAsia"/>
+          <w:b/>
+        </w:rPr>
+        <w:t>Example:</w:t>
+      </w:r>
+    </w:p>
+    <w:p>
+      <w:pPr>
+        <w:ind w:left="720"/>
+        <w:rPr>
+          <w:rFonts w:eastAsiaTheme="minorEastAsia"/>
+          <w:bCs/>
+        </w:rPr>
+      </w:pPr>
+    </w:p>
+    <w:p>
+      <w:pPr>
+        <w:ind w:left="720"/>
+        <w:rPr>
+          <w:rFonts w:eastAsiaTheme="minorEastAsia"/>
+          <w:bCs/>
+        </w:rPr>
+      </w:pPr>
+      <w:r>
+        <w:rPr>
+          <w:rFonts w:eastAsiaTheme="minorEastAsia"/>
+          <w:bCs/>
+        </w:rPr>
+        <w:t xml:space="preserve">For </w:t>
+      </w:r>
+      <w:r>
+        <w:rPr>
+          <w:rFonts w:eastAsiaTheme="minorEastAsia"/>
+          <w:bCs/>
+          <w:i/>
+          <w:iCs/>
+        </w:rPr>
+        <w:t>structures = [1,4,3,2]</w:t>
+      </w:r>
+      <w:r>
+        <w:rPr>
+          <w:rFonts w:eastAsiaTheme="minorEastAsia"/>
+          <w:bCs/>
+        </w:rPr>
+        <w:t xml:space="preserve">, the output should be </w:t>
+      </w:r>
+      <w:r>
+        <w:rPr>
+          <w:rFonts w:eastAsiaTheme="minorEastAsia"/>
+          <w:bCs/>
+          <w:i/>
+          <w:iCs/>
+        </w:rPr>
+        <w:t>solution(structures) = 4.</w:t>
+      </w:r>
+    </w:p>
+    <w:p>
+      <w:pPr>
+        <w:ind w:left="720"/>
+        <w:rPr>
+          <w:rFonts w:eastAsiaTheme="minorEastAsia"/>
+          <w:bCs/>
+        </w:rPr>
+      </w:pPr>
+    </w:p>
+    <w:p>
+      <w:pPr>
+        <w:ind w:left="720"/>
+        <w:rPr>
+          <w:rFonts w:eastAsiaTheme="minorEastAsia"/>
+          <w:bCs/>
+        </w:rPr>
+      </w:pPr>
+      <w:r>
+        <w:rPr>
+          <w:rFonts w:eastAsiaTheme="minorEastAsia"/>
+          <w:bCs/>
+        </w:rPr>
+        <w:t>Answer: Question85</w:t>
+      </w:r>
+    </w:p>
+    <w:p>
+      <w:pPr>
+        <w:rPr>
+          <w:rFonts w:eastAsiaTheme="minorEastAsia"/>
+          <w:bCs/>
+        </w:rPr>
+      </w:pPr>
+    </w:p>
+    <w:p>
+      <w:pPr>
+        <w:pStyle w:val="ListParagraph"/>
+        <w:numPr>
+          <w:ilvl w:val="0"/>
+          <w:numId w:val="1"/>
+        </w:numPr>
+        <w:rPr>
+          <w:rFonts w:eastAsiaTheme="minorEastAsia"/>
+          <w:bCs/>
+        </w:rPr>
+      </w:pPr>
+      <w:r>
+        <w:rPr>
+          <w:rFonts w:eastAsiaTheme="minorEastAsia"/>
+          <w:bCs/>
+        </w:rPr>
+        <w:t xml:space="preserve">You are given an array of uppercase and lowercase English letters </w:t>
+      </w:r>
+      <w:r>
+        <w:rPr>
+          <w:rFonts w:eastAsiaTheme="minorEastAsia"/>
+          <w:bCs/>
+          <w:i/>
+          <w:iCs/>
+        </w:rPr>
+        <w:t>recording</w:t>
+      </w:r>
+      <w:r>
+        <w:rPr>
+          <w:rFonts w:eastAsiaTheme="minorEastAsia"/>
+          <w:bCs/>
+        </w:rPr>
+        <w:t xml:space="preserve"> representing a sequence of letters typed by the user.</w:t>
+      </w:r>
+    </w:p>
+    <w:p>
+      <w:pPr>
+        <w:rPr>
+          <w:rFonts w:eastAsiaTheme="minorEastAsia"/>
+          <w:bCs/>
+        </w:rPr>
+      </w:pPr>
+    </w:p>
+    <w:p>
+      <w:pPr>
+        <w:ind w:left="720"/>
+        <w:rPr>
+          <w:rFonts w:eastAsiaTheme="minorEastAsia"/>
+          <w:bCs/>
+        </w:rPr>
+      </w:pPr>
+      <w:r>
+        <w:rPr>
+          <w:rFonts w:eastAsiaTheme="minorEastAsia"/>
+          <w:bCs/>
+        </w:rPr>
+        <w:t>Your task is to count the number of times that the user changed keys while typing the sequence, considering that the uppercase and lowercase letters for a given letter require the user to press the same letter key (ignoring modifiers like Shift or Caps Lock). For example, typing ‘W’ and ‘w’ require the user to press the same key, whereas typing ‘w’ and ‘E’ or typing ‘w’ and ‘e’ require the user to change keys.</w:t>
+      </w:r>
+    </w:p>
+    <w:p>
+      <w:pPr>
+        <w:ind w:left="720"/>
+        <w:rPr>
+          <w:rFonts w:eastAsiaTheme="minorEastAsia"/>
+          <w:bCs/>
+        </w:rPr>
+      </w:pPr>
+    </w:p>
+    <w:p>
+      <w:pPr>
+        <w:ind w:left="720"/>
+        <w:rPr>
+          <w:rFonts w:eastAsiaTheme="minorEastAsia"/>
+          <w:bCs/>
+        </w:rPr>
+      </w:pPr>
+      <w:r>
+        <w:rPr>
+          <w:rFonts w:eastAsiaTheme="minorEastAsia"/>
+          <w:b/>
+        </w:rPr>
+        <w:t>Example:</w:t>
+      </w:r>
+    </w:p>
+    <w:p>
+      <w:pPr>
+        <w:ind w:left="720"/>
+        <w:rPr>
+          <w:rFonts w:eastAsiaTheme="minorEastAsia"/>
+          <w:bCs/>
+        </w:rPr>
+      </w:pPr>
+    </w:p>
+    <w:p>
+      <w:pPr>
+        <w:ind w:left="720"/>
+        <w:rPr>
+          <w:rFonts w:eastAsiaTheme="minorEastAsia"/>
+          <w:bCs/>
+          <w:i/>
+          <w:iCs/>
+        </w:rPr>
+      </w:pPr>
+      <w:r>
+        <w:rPr>
+          <w:rFonts w:eastAsiaTheme="minorEastAsia"/>
+          <w:bCs/>
+        </w:rPr>
+        <w:t xml:space="preserve">For </w:t>
+      </w:r>
+      <w:r>
+        <w:rPr>
+          <w:rFonts w:eastAsiaTheme="minorEastAsia"/>
+          <w:bCs/>
+          <w:i/>
+          <w:iCs/>
+        </w:rPr>
+        <w:t>recording = [‘</w:t>
+      </w:r>
+      <w:r>
+        <w:rPr>
+          <w:rFonts w:eastAsiaTheme="minorEastAsia"/>
+          <w:bCs/>
+          <w:i/>
+          <w:iCs/>
+        </w:rPr>
+        <w:t>W</w:t>
+      </w:r>
+      <w:r>
+        <w:rPr>
+          <w:rFonts w:eastAsiaTheme="minorEastAsia"/>
+          <w:bCs/>
+          <w:i/>
+          <w:iCs/>
+        </w:rPr>
+        <w:t>’, ‘w’, ‘</w:t>
+      </w:r>
+      <w:r>
+        <w:rPr>
+          <w:rFonts w:eastAsiaTheme="minorEastAsia"/>
+          <w:bCs/>
+          <w:i/>
+          <w:iCs/>
+        </w:rPr>
+        <w:t>a</w:t>
+      </w:r>
+      <w:r>
+        <w:rPr>
+          <w:rFonts w:eastAsiaTheme="minorEastAsia"/>
+          <w:bCs/>
+          <w:i/>
+          <w:iCs/>
+        </w:rPr>
+        <w:t>’, ‘A’, ‘a’, ‘b’, ‘</w:t>
+      </w:r>
+      <w:r>
+        <w:rPr>
+          <w:rFonts w:eastAsiaTheme="minorEastAsia"/>
+          <w:bCs/>
+          <w:i/>
+          <w:iCs/>
+        </w:rPr>
+        <w:t>B</w:t>
+      </w:r>
+      <w:r>
+        <w:rPr>
+          <w:rFonts w:eastAsiaTheme="minorEastAsia"/>
+          <w:bCs/>
+          <w:i/>
+          <w:iCs/>
+        </w:rPr>
+        <w:t>’]</w:t>
+      </w:r>
+      <w:r>
+        <w:rPr>
+          <w:rFonts w:eastAsiaTheme="minorEastAsia"/>
+          <w:bCs/>
+        </w:rPr>
+        <w:t xml:space="preserve">, the output should be </w:t>
+      </w:r>
+      <w:r>
+        <w:rPr>
+          <w:rFonts w:eastAsiaTheme="minorEastAsia"/>
+          <w:bCs/>
+          <w:i/>
+          <w:iCs/>
+        </w:rPr>
+        <w:t>solution(recording) = 2.</w:t>
+      </w:r>
+    </w:p>
+    <w:p>
+      <w:pPr>
+        <w:ind w:left="720"/>
+        <w:rPr>
+          <w:rFonts w:eastAsiaTheme="minorEastAsia"/>
+          <w:bCs/>
+          <w:i/>
+          <w:iCs/>
+        </w:rPr>
+      </w:pPr>
+    </w:p>
+    <w:p>
+      <w:pPr>
+        <w:ind w:left="720"/>
+        <w:rPr>
+          <w:rFonts w:eastAsiaTheme="minorEastAsia"/>
+          <w:bCs/>
+        </w:rPr>
+      </w:pPr>
+      <w:r>
+        <w:rPr>
+          <w:rFonts w:eastAsiaTheme="minorEastAsia"/>
+          <w:bCs/>
+        </w:rPr>
+        <w:t>Answer: Question86</w:t>
       </w:r>
     </w:p>
     <w:sectPr>

</xml_diff>